<commit_message>
Add VC Method section to the valuation guide
- New 6.6 Venture Capital (VC) Method: concept, formulas, target-IRR-by-stage
  table, worked example on Vipin Corporation (matches the app's VC tab:
  Rs 140/share, 17.3% stake, IRR at CMP ~10.7%), strengths & limitations.
- "Choosing a method" renumbered to 6.7, with a start-up / VC-backed row.
- Section 9: exit-multiple value updated to Rs 332 (matches corrected
  year-end discounting) and VC method row added.
- Formula reference: VC post-money and required-stake formulas.
- Table of contents now refreshes automatically when opened in Word.

Co-Authored-By: Claude Opus 5.5 <noreply@anthropic.com>
Claude-Session: https://claude.ai/code/session_018hY48TnvoyExCnuZKmZVFd
</commit_message>
<xml_diff>
--- a/Valuation_Deep_Dive_Guide.docx
+++ b/Valuation_Deep_Dive_Guide.docx
@@ -11511,7 +11511,1678 @@
         <w:pStyle w:val="Heading2"/>
       </w:pPr>
       <w:r>
-        <w:t>6.6  Choosing a method</w:t>
+        <w:t xml:space="preserve">6.6  Venture Capital (VC) Method</w:t>
+      </w:r>
+    </w:p>
+    <w:p>
+      <w:pPr>
+        <w:spacing w:after="120" w:before="0" w:line="276" w:lineRule="auto"/>
+      </w:pPr>
+      <w:r>
+        <w:rPr>
+          <w:b w:val="0"/>
+          <w:i w:val="0"/>
+          <w:color w:val="1E293B"/>
+          <w:sz w:val="21"/>
+        </w:rPr>
+        <w:t xml:space="preserve">Used by venture-capital and private-equity investors when near-term cash flows are negative or too uncertain to forecast year by year. Instead of discounting every cash flow, you value the business at a future </w:t>
+      </w:r>
+      <w:r>
+        <w:rPr>
+          <w:b/>
+          <w:i w:val="0"/>
+          <w:color w:val="1E293B"/>
+          <w:sz w:val="21"/>
+        </w:rPr>
+        <w:t xml:space="preserve">exit</w:t>
+      </w:r>
+      <w:r>
+        <w:rPr>
+          <w:b w:val="0"/>
+          <w:i w:val="0"/>
+          <w:color w:val="1E293B"/>
+          <w:sz w:val="21"/>
+        </w:rPr>
+        <w:t xml:space="preserve">, then discount that single figure back at the investor’s </w:t>
+      </w:r>
+      <w:r>
+        <w:rPr>
+          <w:b/>
+          <w:i w:val="0"/>
+          <w:color w:val="1E293B"/>
+          <w:sz w:val="21"/>
+        </w:rPr>
+        <w:t xml:space="preserve">target IRR</w:t>
+      </w:r>
+      <w:r>
+        <w:rPr>
+          <w:b w:val="0"/>
+          <w:i w:val="0"/>
+          <w:color w:val="1E293B"/>
+          <w:sz w:val="21"/>
+        </w:rPr>
+        <w:t xml:space="preserve"> — a hurdle rate that bundles the time value of money, the high failure rate of young companies and illiquidity. Also called the Sahlman method (Harvard, 1987).</w:t>
+      </w:r>
+    </w:p>
+    <w:p>
+      <w:pPr>
+        <w:pBdr>
+          <w:left w:val="single" w:sz="18" w:space="8" w:color="4361EE"/>
+        </w:pBdr>
+        <w:shd w:val="clear" w:color="auto" w:fill="EEF2FF"/>
+        <w:spacing w:before="80" w:after="120"/>
+        <w:ind w:left="120" w:right="120"/>
+      </w:pPr>
+      <w:r>
+        <w:rPr>
+          <w:b/>
+          <w:color w:val="4361EE"/>
+        </w:rPr>
+        <w:t xml:space="preserve">Exit value:  </w:t>
+      </w:r>
+      <w:r>
+        <w:rPr>
+          <w:rFonts w:ascii="Consolas" w:hAnsi="Consolas"/>
+          <w:i/>
+          <w:color w:val="1E293B"/>
+        </w:rPr>
+        <w:t>Exit Equity = Exit multiple × Exit-year metric</w:t>
+      </w:r>
+      <w:r>
+        <w:rPr>
+          <w:i/>
+          <w:color w:val="64748B"/>
+          <w:sz w:val="18"/>
+        </w:rPr>
+        <w:t xml:space="preserve">   — for EV multiples, subtract net debt &amp; bridge items at exit</w:t>
+      </w:r>
+    </w:p>
+    <w:p>
+      <w:pPr>
+        <w:pBdr>
+          <w:left w:val="single" w:sz="18" w:space="8" w:color="4361EE"/>
+        </w:pBdr>
+        <w:shd w:val="clear" w:color="auto" w:fill="EEF2FF"/>
+        <w:spacing w:before="80" w:after="120"/>
+        <w:ind w:left="120" w:right="120"/>
+      </w:pPr>
+      <w:r>
+        <w:rPr>
+          <w:b/>
+          <w:color w:val="4361EE"/>
+        </w:rPr>
+        <w:t xml:space="preserve">Post-money:  </w:t>
+      </w:r>
+      <w:r>
+        <w:rPr>
+          <w:rFonts w:ascii="Consolas" w:hAnsi="Consolas"/>
+          <w:i/>
+          <w:color w:val="1E293B"/>
+        </w:rPr>
+        <w:t>Post-money today = Exit Equity ÷ (1 + IRR)ⁿ</w:t>
+      </w:r>
+      <w:r>
+        <w:rPr>
+          <w:i/>
+          <w:color w:val="64748B"/>
+          <w:sz w:val="18"/>
+        </w:rPr>
+        <w:t xml:space="preserve">   — (1 + IRR)ⁿ is the required money multiple (MOIC)</w:t>
+      </w:r>
+    </w:p>
+    <w:p>
+      <w:pPr>
+        <w:pBdr>
+          <w:left w:val="single" w:sz="18" w:space="8" w:color="4361EE"/>
+        </w:pBdr>
+        <w:shd w:val="clear" w:color="auto" w:fill="EEF2FF"/>
+        <w:spacing w:before="80" w:after="120"/>
+        <w:ind w:left="120" w:right="120"/>
+      </w:pPr>
+      <w:r>
+        <w:rPr>
+          <w:b/>
+          <w:color w:val="4361EE"/>
+        </w:rPr>
+        <w:t xml:space="preserve">Ownership:  </w:t>
+      </w:r>
+      <w:r>
+        <w:rPr>
+          <w:rFonts w:ascii="Consolas" w:hAnsi="Consolas"/>
+          <w:i/>
+          <w:color w:val="1E293B"/>
+        </w:rPr>
+        <w:t>Stake today = Investment × (1 + IRR)ⁿ ÷ Exit Equity ÷ Retention</w:t>
+      </w:r>
+      <w:r>
+        <w:rPr>
+          <w:i/>
+          <w:color w:val="64748B"/>
+          <w:sz w:val="18"/>
+        </w:rPr>
+        <w:t xml:space="preserve">   — Retention = 1 − future dilution</w:t>
+      </w:r>
+    </w:p>
+    <w:p>
+      <w:pPr>
+        <w:pBdr>
+          <w:left w:val="single" w:sz="18" w:space="8" w:color="4361EE"/>
+        </w:pBdr>
+        <w:shd w:val="clear" w:color="auto" w:fill="EEF2FF"/>
+        <w:spacing w:before="80" w:after="120"/>
+        <w:ind w:left="120" w:right="120"/>
+      </w:pPr>
+      <w:r>
+        <w:rPr>
+          <w:b/>
+          <w:color w:val="4361EE"/>
+        </w:rPr>
+        <w:t xml:space="preserve">Pre-money:  </w:t>
+      </w:r>
+      <w:r>
+        <w:rPr>
+          <w:rFonts w:ascii="Consolas" w:hAnsi="Consolas"/>
+          <w:i/>
+          <w:color w:val="1E293B"/>
+        </w:rPr>
+        <w:t>Pre-money = Investment ÷ Stake today − Investment</w:t>
+      </w:r>
+      <w:r>
+        <w:rPr>
+          <w:i/>
+          <w:color w:val="64748B"/>
+          <w:sz w:val="18"/>
+        </w:rPr>
+        <w:t xml:space="preserve">   — ÷ shares = value per share &amp; issue price</w:t>
+      </w:r>
+    </w:p>
+    <w:p>
+      <w:pPr>
+        <w:spacing w:after="120" w:before="0" w:line="276" w:lineRule="auto"/>
+      </w:pPr>
+      <w:r>
+        <w:rPr>
+          <w:b/>
+          <w:i w:val="0"/>
+          <w:color w:val="1E293B"/>
+          <w:sz w:val="21"/>
+        </w:rPr>
+        <w:t xml:space="preserve">Typical target IRRs by stage</w:t>
+      </w:r>
+      <w:r>
+        <w:rPr>
+          <w:b w:val="0"/>
+          <w:i w:val="0"/>
+          <w:color w:val="1E293B"/>
+          <w:sz w:val="21"/>
+        </w:rPr>
+        <w:t xml:space="preserve"> — the riskier the stage, the higher the hurdle:</w:t>
+      </w:r>
+    </w:p>
+    <w:tbl>
+      <w:tblPr>
+        <w:tblW w:w="9360" w:type="dxa"/>
+        <w:jc w:val="center"/>
+        <w:tblLayout w:type="fixed"/>
+        <w:tblLook w:firstColumn="1" w:firstRow="1" w:lastColumn="0" w:lastRow="0" w:noHBand="0" w:noVBand="1" w:val="04A0"/>
+      </w:tblPr>
+      <w:tblGrid>
+        <w:gridCol w:w="3120"/>
+        <w:gridCol w:w="3120"/>
+        <w:gridCol w:w="3120"/>
+      </w:tblGrid>
+      <w:tr>
+        <w:tc>
+          <w:tcPr>
+            <w:tcW w:w="3120" w:type="dxa"/>
+            <w:tcBorders>
+              <w:top w:val="single" w:sz="4" w:space="0" w:color="CCCCCC"/>
+              <w:left w:val="single" w:sz="4" w:space="0" w:color="CCCCCC"/>
+              <w:bottom w:val="single" w:sz="4" w:space="0" w:color="CCCCCC"/>
+              <w:right w:val="single" w:sz="4" w:space="0" w:color="CCCCCC"/>
+            </w:tcBorders>
+            <w:shd w:val="clear" w:color="auto" w:fill="4361EE"/>
+            <w:tcMar>
+              <w:top w:w="70" w:type="dxa"/>
+              <w:left w:w="110" w:type="dxa"/>
+              <w:bottom w:w="70" w:type="dxa"/>
+              <w:right w:w="110" w:type="dxa"/>
+            </w:tcMar>
+            <w:vAlign w:val="center"/>
+          </w:tcPr>
+          <w:p>
+            <w:pPr>
+              <w:spacing w:after="0"/>
+            </w:pPr>
+            <w:r>
+              <w:rPr>
+                <w:b/>
+                <w:color w:val="FFFFFF"/>
+                <w:sz w:val="20"/>
+              </w:rPr>
+              <w:t xml:space="preserve">Stage</w:t>
+            </w:r>
+          </w:p>
+        </w:tc>
+        <w:tc>
+          <w:tcPr>
+            <w:tcW w:w="3120" w:type="dxa"/>
+            <w:tcBorders>
+              <w:top w:val="single" w:sz="4" w:space="0" w:color="CCCCCC"/>
+              <w:left w:val="single" w:sz="4" w:space="0" w:color="CCCCCC"/>
+              <w:bottom w:val="single" w:sz="4" w:space="0" w:color="CCCCCC"/>
+              <w:right w:val="single" w:sz="4" w:space="0" w:color="CCCCCC"/>
+            </w:tcBorders>
+            <w:shd w:val="clear" w:color="auto" w:fill="4361EE"/>
+            <w:tcMar>
+              <w:top w:w="70" w:type="dxa"/>
+              <w:left w:w="110" w:type="dxa"/>
+              <w:bottom w:w="70" w:type="dxa"/>
+              <w:right w:w="110" w:type="dxa"/>
+            </w:tcMar>
+            <w:vAlign w:val="center"/>
+          </w:tcPr>
+          <w:p>
+            <w:pPr>
+              <w:spacing w:after="0"/>
+            </w:pPr>
+            <w:r>
+              <w:rPr>
+                <w:b/>
+                <w:color w:val="FFFFFF"/>
+                <w:sz w:val="20"/>
+              </w:rPr>
+              <w:t xml:space="preserve">Typical target IRR</w:t>
+            </w:r>
+          </w:p>
+        </w:tc>
+        <w:tc>
+          <w:tcPr>
+            <w:tcW w:w="3120" w:type="dxa"/>
+            <w:tcBorders>
+              <w:top w:val="single" w:sz="4" w:space="0" w:color="CCCCCC"/>
+              <w:left w:val="single" w:sz="4" w:space="0" w:color="CCCCCC"/>
+              <w:bottom w:val="single" w:sz="4" w:space="0" w:color="CCCCCC"/>
+              <w:right w:val="single" w:sz="4" w:space="0" w:color="CCCCCC"/>
+            </w:tcBorders>
+            <w:shd w:val="clear" w:color="auto" w:fill="4361EE"/>
+            <w:tcMar>
+              <w:top w:w="70" w:type="dxa"/>
+              <w:left w:w="110" w:type="dxa"/>
+              <w:bottom w:w="70" w:type="dxa"/>
+              <w:right w:w="110" w:type="dxa"/>
+            </w:tcMar>
+            <w:vAlign w:val="center"/>
+          </w:tcPr>
+          <w:p>
+            <w:pPr>
+              <w:spacing w:after="0"/>
+            </w:pPr>
+            <w:r>
+              <w:rPr>
+                <w:b/>
+                <w:color w:val="FFFFFF"/>
+                <w:sz w:val="20"/>
+              </w:rPr>
+              <w:t xml:space="preserve">App preset</w:t>
+            </w:r>
+          </w:p>
+        </w:tc>
+      </w:tr>
+      <w:tr>
+        <w:tc>
+          <w:tcPr>
+            <w:tcW w:w="3120" w:type="dxa"/>
+            <w:tcBorders>
+              <w:top w:val="single" w:sz="4" w:space="0" w:color="CCCCCC"/>
+              <w:left w:val="single" w:sz="4" w:space="0" w:color="CCCCCC"/>
+              <w:bottom w:val="single" w:sz="4" w:space="0" w:color="CCCCCC"/>
+              <w:right w:val="single" w:sz="4" w:space="0" w:color="CCCCCC"/>
+            </w:tcBorders>
+            <w:shd w:val="clear" w:color="auto" w:fill="F7F9FF"/>
+            <w:tcMar>
+              <w:top w:w="70" w:type="dxa"/>
+              <w:left w:w="110" w:type="dxa"/>
+              <w:bottom w:w="70" w:type="dxa"/>
+              <w:right w:w="110" w:type="dxa"/>
+            </w:tcMar>
+            <w:vAlign w:val="center"/>
+          </w:tcPr>
+          <w:p>
+            <w:pPr>
+              <w:spacing w:after="0"/>
+            </w:pPr>
+            <w:r>
+              <w:rPr>
+                <w:b w:val="0"/>
+                <w:color w:val="1E293B"/>
+                <w:sz w:val="19"/>
+              </w:rPr>
+              <w:t xml:space="preserve">Seed / angel</w:t>
+            </w:r>
+          </w:p>
+        </w:tc>
+        <w:tc>
+          <w:tcPr>
+            <w:tcW w:w="3120" w:type="dxa"/>
+            <w:tcBorders>
+              <w:top w:val="single" w:sz="4" w:space="0" w:color="CCCCCC"/>
+              <w:left w:val="single" w:sz="4" w:space="0" w:color="CCCCCC"/>
+              <w:bottom w:val="single" w:sz="4" w:space="0" w:color="CCCCCC"/>
+              <w:right w:val="single" w:sz="4" w:space="0" w:color="CCCCCC"/>
+            </w:tcBorders>
+            <w:shd w:val="clear" w:color="auto" w:fill="F7F9FF"/>
+            <w:tcMar>
+              <w:top w:w="70" w:type="dxa"/>
+              <w:left w:w="110" w:type="dxa"/>
+              <w:bottom w:w="70" w:type="dxa"/>
+              <w:right w:w="110" w:type="dxa"/>
+            </w:tcMar>
+            <w:vAlign w:val="center"/>
+          </w:tcPr>
+          <w:p>
+            <w:pPr>
+              <w:spacing w:after="0"/>
+            </w:pPr>
+            <w:r>
+              <w:rPr>
+                <w:b w:val="0"/>
+                <w:color w:val="1E293B"/>
+                <w:sz w:val="19"/>
+              </w:rPr>
+              <w:t xml:space="preserve">50–70%</w:t>
+            </w:r>
+          </w:p>
+        </w:tc>
+        <w:tc>
+          <w:tcPr>
+            <w:tcW w:w="3120" w:type="dxa"/>
+            <w:tcBorders>
+              <w:top w:val="single" w:sz="4" w:space="0" w:color="CCCCCC"/>
+              <w:left w:val="single" w:sz="4" w:space="0" w:color="CCCCCC"/>
+              <w:bottom w:val="single" w:sz="4" w:space="0" w:color="CCCCCC"/>
+              <w:right w:val="single" w:sz="4" w:space="0" w:color="CCCCCC"/>
+            </w:tcBorders>
+            <w:shd w:val="clear" w:color="auto" w:fill="F7F9FF"/>
+            <w:tcMar>
+              <w:top w:w="70" w:type="dxa"/>
+              <w:left w:w="110" w:type="dxa"/>
+              <w:bottom w:w="70" w:type="dxa"/>
+              <w:right w:w="110" w:type="dxa"/>
+            </w:tcMar>
+            <w:vAlign w:val="center"/>
+          </w:tcPr>
+          <w:p>
+            <w:pPr>
+              <w:spacing w:after="0"/>
+            </w:pPr>
+            <w:r>
+              <w:rPr>
+                <w:b w:val="0"/>
+                <w:color w:val="1E293B"/>
+                <w:sz w:val="19"/>
+              </w:rPr>
+              <w:t xml:space="preserve">60%</w:t>
+            </w:r>
+          </w:p>
+        </w:tc>
+      </w:tr>
+      <w:tr>
+        <w:tc>
+          <w:tcPr>
+            <w:tcW w:w="3120" w:type="dxa"/>
+            <w:tcBorders>
+              <w:top w:val="single" w:sz="4" w:space="0" w:color="CCCCCC"/>
+              <w:left w:val="single" w:sz="4" w:space="0" w:color="CCCCCC"/>
+              <w:bottom w:val="single" w:sz="4" w:space="0" w:color="CCCCCC"/>
+              <w:right w:val="single" w:sz="4" w:space="0" w:color="CCCCCC"/>
+            </w:tcBorders>
+            <w:tcMar>
+              <w:top w:w="70" w:type="dxa"/>
+              <w:left w:w="110" w:type="dxa"/>
+              <w:bottom w:w="70" w:type="dxa"/>
+              <w:right w:w="110" w:type="dxa"/>
+            </w:tcMar>
+            <w:vAlign w:val="center"/>
+          </w:tcPr>
+          <w:p>
+            <w:pPr>
+              <w:spacing w:after="0"/>
+            </w:pPr>
+            <w:r>
+              <w:rPr>
+                <w:b w:val="0"/>
+                <w:color w:val="1E293B"/>
+                <w:sz w:val="19"/>
+              </w:rPr>
+              <w:t xml:space="preserve">Series A</w:t>
+            </w:r>
+          </w:p>
+        </w:tc>
+        <w:tc>
+          <w:tcPr>
+            <w:tcW w:w="3120" w:type="dxa"/>
+            <w:tcBorders>
+              <w:top w:val="single" w:sz="4" w:space="0" w:color="CCCCCC"/>
+              <w:left w:val="single" w:sz="4" w:space="0" w:color="CCCCCC"/>
+              <w:bottom w:val="single" w:sz="4" w:space="0" w:color="CCCCCC"/>
+              <w:right w:val="single" w:sz="4" w:space="0" w:color="CCCCCC"/>
+            </w:tcBorders>
+            <w:tcMar>
+              <w:top w:w="70" w:type="dxa"/>
+              <w:left w:w="110" w:type="dxa"/>
+              <w:bottom w:w="70" w:type="dxa"/>
+              <w:right w:w="110" w:type="dxa"/>
+            </w:tcMar>
+            <w:vAlign w:val="center"/>
+          </w:tcPr>
+          <w:p>
+            <w:pPr>
+              <w:spacing w:after="0"/>
+            </w:pPr>
+            <w:r>
+              <w:rPr>
+                <w:b w:val="0"/>
+                <w:color w:val="1E293B"/>
+                <w:sz w:val="19"/>
+              </w:rPr>
+              <w:t xml:space="preserve">40–60%</w:t>
+            </w:r>
+          </w:p>
+        </w:tc>
+        <w:tc>
+          <w:tcPr>
+            <w:tcW w:w="3120" w:type="dxa"/>
+            <w:tcBorders>
+              <w:top w:val="single" w:sz="4" w:space="0" w:color="CCCCCC"/>
+              <w:left w:val="single" w:sz="4" w:space="0" w:color="CCCCCC"/>
+              <w:bottom w:val="single" w:sz="4" w:space="0" w:color="CCCCCC"/>
+              <w:right w:val="single" w:sz="4" w:space="0" w:color="CCCCCC"/>
+            </w:tcBorders>
+            <w:tcMar>
+              <w:top w:w="70" w:type="dxa"/>
+              <w:left w:w="110" w:type="dxa"/>
+              <w:bottom w:w="70" w:type="dxa"/>
+              <w:right w:w="110" w:type="dxa"/>
+            </w:tcMar>
+            <w:vAlign w:val="center"/>
+          </w:tcPr>
+          <w:p>
+            <w:pPr>
+              <w:spacing w:after="0"/>
+            </w:pPr>
+            <w:r>
+              <w:rPr>
+                <w:b w:val="0"/>
+                <w:color w:val="1E293B"/>
+                <w:sz w:val="19"/>
+              </w:rPr>
+              <w:t xml:space="preserve">50%</w:t>
+            </w:r>
+          </w:p>
+        </w:tc>
+      </w:tr>
+      <w:tr>
+        <w:tc>
+          <w:tcPr>
+            <w:tcW w:w="3120" w:type="dxa"/>
+            <w:tcBorders>
+              <w:top w:val="single" w:sz="4" w:space="0" w:color="CCCCCC"/>
+              <w:left w:val="single" w:sz="4" w:space="0" w:color="CCCCCC"/>
+              <w:bottom w:val="single" w:sz="4" w:space="0" w:color="CCCCCC"/>
+              <w:right w:val="single" w:sz="4" w:space="0" w:color="CCCCCC"/>
+            </w:tcBorders>
+            <w:shd w:val="clear" w:color="auto" w:fill="F7F9FF"/>
+            <w:tcMar>
+              <w:top w:w="70" w:type="dxa"/>
+              <w:left w:w="110" w:type="dxa"/>
+              <w:bottom w:w="70" w:type="dxa"/>
+              <w:right w:w="110" w:type="dxa"/>
+            </w:tcMar>
+            <w:vAlign w:val="center"/>
+          </w:tcPr>
+          <w:p>
+            <w:pPr>
+              <w:spacing w:after="0"/>
+            </w:pPr>
+            <w:r>
+              <w:rPr>
+                <w:b w:val="0"/>
+                <w:color w:val="1E293B"/>
+                <w:sz w:val="19"/>
+              </w:rPr>
+              <w:t xml:space="preserve">Series B / C</w:t>
+            </w:r>
+          </w:p>
+        </w:tc>
+        <w:tc>
+          <w:tcPr>
+            <w:tcW w:w="3120" w:type="dxa"/>
+            <w:tcBorders>
+              <w:top w:val="single" w:sz="4" w:space="0" w:color="CCCCCC"/>
+              <w:left w:val="single" w:sz="4" w:space="0" w:color="CCCCCC"/>
+              <w:bottom w:val="single" w:sz="4" w:space="0" w:color="CCCCCC"/>
+              <w:right w:val="single" w:sz="4" w:space="0" w:color="CCCCCC"/>
+            </w:tcBorders>
+            <w:shd w:val="clear" w:color="auto" w:fill="F7F9FF"/>
+            <w:tcMar>
+              <w:top w:w="70" w:type="dxa"/>
+              <w:left w:w="110" w:type="dxa"/>
+              <w:bottom w:w="70" w:type="dxa"/>
+              <w:right w:w="110" w:type="dxa"/>
+            </w:tcMar>
+            <w:vAlign w:val="center"/>
+          </w:tcPr>
+          <w:p>
+            <w:pPr>
+              <w:spacing w:after="0"/>
+            </w:pPr>
+            <w:r>
+              <w:rPr>
+                <w:b w:val="0"/>
+                <w:color w:val="1E293B"/>
+                <w:sz w:val="19"/>
+              </w:rPr>
+              <w:t xml:space="preserve">30–50%</w:t>
+            </w:r>
+          </w:p>
+        </w:tc>
+        <w:tc>
+          <w:tcPr>
+            <w:tcW w:w="3120" w:type="dxa"/>
+            <w:tcBorders>
+              <w:top w:val="single" w:sz="4" w:space="0" w:color="CCCCCC"/>
+              <w:left w:val="single" w:sz="4" w:space="0" w:color="CCCCCC"/>
+              <w:bottom w:val="single" w:sz="4" w:space="0" w:color="CCCCCC"/>
+              <w:right w:val="single" w:sz="4" w:space="0" w:color="CCCCCC"/>
+            </w:tcBorders>
+            <w:shd w:val="clear" w:color="auto" w:fill="F7F9FF"/>
+            <w:tcMar>
+              <w:top w:w="70" w:type="dxa"/>
+              <w:left w:w="110" w:type="dxa"/>
+              <w:bottom w:w="70" w:type="dxa"/>
+              <w:right w:w="110" w:type="dxa"/>
+            </w:tcMar>
+            <w:vAlign w:val="center"/>
+          </w:tcPr>
+          <w:p>
+            <w:pPr>
+              <w:spacing w:after="0"/>
+            </w:pPr>
+            <w:r>
+              <w:rPr>
+                <w:b w:val="0"/>
+                <w:color w:val="1E293B"/>
+                <w:sz w:val="19"/>
+              </w:rPr>
+              <w:t xml:space="preserve">40%</w:t>
+            </w:r>
+          </w:p>
+        </w:tc>
+      </w:tr>
+      <w:tr>
+        <w:tc>
+          <w:tcPr>
+            <w:tcW w:w="3120" w:type="dxa"/>
+            <w:tcBorders>
+              <w:top w:val="single" w:sz="4" w:space="0" w:color="CCCCCC"/>
+              <w:left w:val="single" w:sz="4" w:space="0" w:color="CCCCCC"/>
+              <w:bottom w:val="single" w:sz="4" w:space="0" w:color="CCCCCC"/>
+              <w:right w:val="single" w:sz="4" w:space="0" w:color="CCCCCC"/>
+            </w:tcBorders>
+            <w:tcMar>
+              <w:top w:w="70" w:type="dxa"/>
+              <w:left w:w="110" w:type="dxa"/>
+              <w:bottom w:w="70" w:type="dxa"/>
+              <w:right w:w="110" w:type="dxa"/>
+            </w:tcMar>
+            <w:vAlign w:val="center"/>
+          </w:tcPr>
+          <w:p>
+            <w:pPr>
+              <w:spacing w:after="0"/>
+            </w:pPr>
+            <w:r>
+              <w:rPr>
+                <w:b w:val="0"/>
+                <w:color w:val="1E293B"/>
+                <w:sz w:val="19"/>
+              </w:rPr>
+              <w:t xml:space="preserve">Growth / expansion</w:t>
+            </w:r>
+          </w:p>
+        </w:tc>
+        <w:tc>
+          <w:tcPr>
+            <w:tcW w:w="3120" w:type="dxa"/>
+            <w:tcBorders>
+              <w:top w:val="single" w:sz="4" w:space="0" w:color="CCCCCC"/>
+              <w:left w:val="single" w:sz="4" w:space="0" w:color="CCCCCC"/>
+              <w:bottom w:val="single" w:sz="4" w:space="0" w:color="CCCCCC"/>
+              <w:right w:val="single" w:sz="4" w:space="0" w:color="CCCCCC"/>
+            </w:tcBorders>
+            <w:tcMar>
+              <w:top w:w="70" w:type="dxa"/>
+              <w:left w:w="110" w:type="dxa"/>
+              <w:bottom w:w="70" w:type="dxa"/>
+              <w:right w:w="110" w:type="dxa"/>
+            </w:tcMar>
+            <w:vAlign w:val="center"/>
+          </w:tcPr>
+          <w:p>
+            <w:pPr>
+              <w:spacing w:after="0"/>
+            </w:pPr>
+            <w:r>
+              <w:rPr>
+                <w:b w:val="0"/>
+                <w:color w:val="1E293B"/>
+                <w:sz w:val="19"/>
+              </w:rPr>
+              <w:t xml:space="preserve">25–35%</w:t>
+            </w:r>
+          </w:p>
+        </w:tc>
+        <w:tc>
+          <w:tcPr>
+            <w:tcW w:w="3120" w:type="dxa"/>
+            <w:tcBorders>
+              <w:top w:val="single" w:sz="4" w:space="0" w:color="CCCCCC"/>
+              <w:left w:val="single" w:sz="4" w:space="0" w:color="CCCCCC"/>
+              <w:bottom w:val="single" w:sz="4" w:space="0" w:color="CCCCCC"/>
+              <w:right w:val="single" w:sz="4" w:space="0" w:color="CCCCCC"/>
+            </w:tcBorders>
+            <w:tcMar>
+              <w:top w:w="70" w:type="dxa"/>
+              <w:left w:w="110" w:type="dxa"/>
+              <w:bottom w:w="70" w:type="dxa"/>
+              <w:right w:w="110" w:type="dxa"/>
+            </w:tcMar>
+            <w:vAlign w:val="center"/>
+          </w:tcPr>
+          <w:p>
+            <w:pPr>
+              <w:spacing w:after="0"/>
+            </w:pPr>
+            <w:r>
+              <w:rPr>
+                <w:b w:val="0"/>
+                <w:color w:val="1E293B"/>
+                <w:sz w:val="19"/>
+              </w:rPr>
+              <w:t xml:space="preserve">30%</w:t>
+            </w:r>
+          </w:p>
+        </w:tc>
+      </w:tr>
+      <w:tr>
+        <w:tc>
+          <w:tcPr>
+            <w:tcW w:w="3120" w:type="dxa"/>
+            <w:tcBorders>
+              <w:top w:val="single" w:sz="4" w:space="0" w:color="CCCCCC"/>
+              <w:left w:val="single" w:sz="4" w:space="0" w:color="CCCCCC"/>
+              <w:bottom w:val="single" w:sz="4" w:space="0" w:color="CCCCCC"/>
+              <w:right w:val="single" w:sz="4" w:space="0" w:color="CCCCCC"/>
+            </w:tcBorders>
+            <w:shd w:val="clear" w:color="auto" w:fill="F7F9FF"/>
+            <w:tcMar>
+              <w:top w:w="70" w:type="dxa"/>
+              <w:left w:w="110" w:type="dxa"/>
+              <w:bottom w:w="70" w:type="dxa"/>
+              <w:right w:w="110" w:type="dxa"/>
+            </w:tcMar>
+            <w:vAlign w:val="center"/>
+          </w:tcPr>
+          <w:p>
+            <w:pPr>
+              <w:spacing w:after="0"/>
+            </w:pPr>
+            <w:r>
+              <w:rPr>
+                <w:b w:val="0"/>
+                <w:color w:val="1E293B"/>
+                <w:sz w:val="19"/>
+              </w:rPr>
+              <w:t xml:space="preserve">Pre-IPO / late stage</w:t>
+            </w:r>
+          </w:p>
+        </w:tc>
+        <w:tc>
+          <w:tcPr>
+            <w:tcW w:w="3120" w:type="dxa"/>
+            <w:tcBorders>
+              <w:top w:val="single" w:sz="4" w:space="0" w:color="CCCCCC"/>
+              <w:left w:val="single" w:sz="4" w:space="0" w:color="CCCCCC"/>
+              <w:bottom w:val="single" w:sz="4" w:space="0" w:color="CCCCCC"/>
+              <w:right w:val="single" w:sz="4" w:space="0" w:color="CCCCCC"/>
+            </w:tcBorders>
+            <w:shd w:val="clear" w:color="auto" w:fill="F7F9FF"/>
+            <w:tcMar>
+              <w:top w:w="70" w:type="dxa"/>
+              <w:left w:w="110" w:type="dxa"/>
+              <w:bottom w:w="70" w:type="dxa"/>
+              <w:right w:w="110" w:type="dxa"/>
+            </w:tcMar>
+            <w:vAlign w:val="center"/>
+          </w:tcPr>
+          <w:p>
+            <w:pPr>
+              <w:spacing w:after="0"/>
+            </w:pPr>
+            <w:r>
+              <w:rPr>
+                <w:b w:val="0"/>
+                <w:color w:val="1E293B"/>
+                <w:sz w:val="19"/>
+              </w:rPr>
+              <w:t xml:space="preserve">20–30%</w:t>
+            </w:r>
+          </w:p>
+        </w:tc>
+        <w:tc>
+          <w:tcPr>
+            <w:tcW w:w="3120" w:type="dxa"/>
+            <w:tcBorders>
+              <w:top w:val="single" w:sz="4" w:space="0" w:color="CCCCCC"/>
+              <w:left w:val="single" w:sz="4" w:space="0" w:color="CCCCCC"/>
+              <w:bottom w:val="single" w:sz="4" w:space="0" w:color="CCCCCC"/>
+              <w:right w:val="single" w:sz="4" w:space="0" w:color="CCCCCC"/>
+            </w:tcBorders>
+            <w:shd w:val="clear" w:color="auto" w:fill="F7F9FF"/>
+            <w:tcMar>
+              <w:top w:w="70" w:type="dxa"/>
+              <w:left w:w="110" w:type="dxa"/>
+              <w:bottom w:w="70" w:type="dxa"/>
+              <w:right w:w="110" w:type="dxa"/>
+            </w:tcMar>
+            <w:vAlign w:val="center"/>
+          </w:tcPr>
+          <w:p>
+            <w:pPr>
+              <w:spacing w:after="0"/>
+            </w:pPr>
+            <w:r>
+              <w:rPr>
+                <w:b w:val="0"/>
+                <w:color w:val="1E293B"/>
+                <w:sz w:val="19"/>
+              </w:rPr>
+              <w:t xml:space="preserve">25%</w:t>
+            </w:r>
+          </w:p>
+        </w:tc>
+      </w:tr>
+    </w:tbl>
+    <w:p>
+      <w:pPr>
+        <w:spacing w:after="60"/>
+      </w:pPr>
+    </w:p>
+    <w:p>
+      <w:pPr>
+        <w:spacing w:after="120" w:before="0" w:line="276" w:lineRule="auto"/>
+      </w:pPr>
+      <w:r>
+        <w:rPr>
+          <w:b/>
+          <w:i w:val="0"/>
+          <w:color w:val="1E293B"/>
+          <w:sz w:val="21"/>
+        </w:rPr>
+        <w:t xml:space="preserve">Worked example</w:t>
+      </w:r>
+      <w:r>
+        <w:rPr>
+          <w:b w:val="0"/>
+          <w:i w:val="0"/>
+          <w:color w:val="1E293B"/>
+          <w:sz w:val="21"/>
+        </w:rPr>
+        <w:t xml:space="preserve"> — Vipin Corporation: ₹300 Cr investment, 5-year hold to FY29E, exit at 18× P/E, 25% target IRR, 10% expected dilution from later rounds/ESOPs:</w:t>
+      </w:r>
+    </w:p>
+    <w:tbl>
+      <w:tblPr>
+        <w:tblW w:w="9360" w:type="dxa"/>
+        <w:jc w:val="center"/>
+        <w:tblLayout w:type="fixed"/>
+        <w:tblLook w:firstColumn="1" w:firstRow="1" w:lastColumn="0" w:lastRow="0" w:noHBand="0" w:noVBand="1" w:val="04A0"/>
+      </w:tblPr>
+      <w:tblGrid>
+        <w:gridCol w:w="6240"/>
+        <w:gridCol w:w="3120"/>
+      </w:tblGrid>
+      <w:tr>
+        <w:tc>
+          <w:tcPr>
+            <w:tcW w:w="6240" w:type="dxa"/>
+            <w:tcBorders>
+              <w:top w:val="single" w:sz="4" w:space="0" w:color="CCCCCC"/>
+              <w:left w:val="single" w:sz="4" w:space="0" w:color="CCCCCC"/>
+              <w:bottom w:val="single" w:sz="4" w:space="0" w:color="CCCCCC"/>
+              <w:right w:val="single" w:sz="4" w:space="0" w:color="CCCCCC"/>
+            </w:tcBorders>
+            <w:shd w:val="clear" w:color="auto" w:fill="4361EE"/>
+            <w:tcMar>
+              <w:top w:w="70" w:type="dxa"/>
+              <w:left w:w="110" w:type="dxa"/>
+              <w:bottom w:w="70" w:type="dxa"/>
+              <w:right w:w="110" w:type="dxa"/>
+            </w:tcMar>
+            <w:vAlign w:val="center"/>
+          </w:tcPr>
+          <w:p>
+            <w:pPr>
+              <w:spacing w:after="0"/>
+            </w:pPr>
+            <w:r>
+              <w:rPr>
+                <w:b/>
+                <w:color w:val="FFFFFF"/>
+                <w:sz w:val="20"/>
+              </w:rPr>
+              <w:t xml:space="preserve">Step</w:t>
+            </w:r>
+          </w:p>
+        </w:tc>
+        <w:tc>
+          <w:tcPr>
+            <w:tcW w:w="3120" w:type="dxa"/>
+            <w:tcBorders>
+              <w:top w:val="single" w:sz="4" w:space="0" w:color="CCCCCC"/>
+              <w:left w:val="single" w:sz="4" w:space="0" w:color="CCCCCC"/>
+              <w:bottom w:val="single" w:sz="4" w:space="0" w:color="CCCCCC"/>
+              <w:right w:val="single" w:sz="4" w:space="0" w:color="CCCCCC"/>
+            </w:tcBorders>
+            <w:shd w:val="clear" w:color="auto" w:fill="4361EE"/>
+            <w:tcMar>
+              <w:top w:w="70" w:type="dxa"/>
+              <w:left w:w="110" w:type="dxa"/>
+              <w:bottom w:w="70" w:type="dxa"/>
+              <w:right w:w="110" w:type="dxa"/>
+            </w:tcMar>
+            <w:vAlign w:val="center"/>
+          </w:tcPr>
+          <w:p>
+            <w:pPr>
+              <w:spacing w:after="0"/>
+            </w:pPr>
+            <w:r>
+              <w:rPr>
+                <w:b/>
+                <w:color w:val="FFFFFF"/>
+                <w:sz w:val="20"/>
+              </w:rPr>
+              <w:t xml:space="preserve">Value</w:t>
+            </w:r>
+          </w:p>
+        </w:tc>
+      </w:tr>
+      <w:tr>
+        <w:tc>
+          <w:tcPr>
+            <w:tcW w:w="6240" w:type="dxa"/>
+            <w:tcBorders>
+              <w:top w:val="single" w:sz="4" w:space="0" w:color="CCCCCC"/>
+              <w:left w:val="single" w:sz="4" w:space="0" w:color="CCCCCC"/>
+              <w:bottom w:val="single" w:sz="4" w:space="0" w:color="CCCCCC"/>
+              <w:right w:val="single" w:sz="4" w:space="0" w:color="CCCCCC"/>
+            </w:tcBorders>
+            <w:shd w:val="clear" w:color="auto" w:fill="F7F9FF"/>
+            <w:tcMar>
+              <w:top w:w="70" w:type="dxa"/>
+              <w:left w:w="110" w:type="dxa"/>
+              <w:bottom w:w="70" w:type="dxa"/>
+              <w:right w:w="110" w:type="dxa"/>
+            </w:tcMar>
+            <w:vAlign w:val="center"/>
+          </w:tcPr>
+          <w:p>
+            <w:pPr>
+              <w:spacing w:after="0"/>
+            </w:pPr>
+            <w:r>
+              <w:rPr>
+                <w:b w:val="0"/>
+                <w:color w:val="1E293B"/>
+                <w:sz w:val="19"/>
+              </w:rPr>
+              <w:t xml:space="preserve">FY29E PAT (from the forecast)</w:t>
+            </w:r>
+          </w:p>
+        </w:tc>
+        <w:tc>
+          <w:tcPr>
+            <w:tcW w:w="3120" w:type="dxa"/>
+            <w:tcBorders>
+              <w:top w:val="single" w:sz="4" w:space="0" w:color="CCCCCC"/>
+              <w:left w:val="single" w:sz="4" w:space="0" w:color="CCCCCC"/>
+              <w:bottom w:val="single" w:sz="4" w:space="0" w:color="CCCCCC"/>
+              <w:right w:val="single" w:sz="4" w:space="0" w:color="CCCCCC"/>
+            </w:tcBorders>
+            <w:shd w:val="clear" w:color="auto" w:fill="F7F9FF"/>
+            <w:tcMar>
+              <w:top w:w="70" w:type="dxa"/>
+              <w:left w:w="110" w:type="dxa"/>
+              <w:bottom w:w="70" w:type="dxa"/>
+              <w:right w:w="110" w:type="dxa"/>
+            </w:tcMar>
+            <w:vAlign w:val="center"/>
+          </w:tcPr>
+          <w:p>
+            <w:pPr>
+              <w:spacing w:after="0"/>
+            </w:pPr>
+            <w:r>
+              <w:rPr>
+                <w:b w:val="0"/>
+                <w:color w:val="1E293B"/>
+                <w:sz w:val="19"/>
+              </w:rPr>
+              <w:t xml:space="preserve">₹ 327 Cr</w:t>
+            </w:r>
+          </w:p>
+        </w:tc>
+      </w:tr>
+      <w:tr>
+        <w:tc>
+          <w:tcPr>
+            <w:tcW w:w="6240" w:type="dxa"/>
+            <w:tcBorders>
+              <w:top w:val="single" w:sz="4" w:space="0" w:color="CCCCCC"/>
+              <w:left w:val="single" w:sz="4" w:space="0" w:color="CCCCCC"/>
+              <w:bottom w:val="single" w:sz="4" w:space="0" w:color="CCCCCC"/>
+              <w:right w:val="single" w:sz="4" w:space="0" w:color="CCCCCC"/>
+            </w:tcBorders>
+            <w:tcMar>
+              <w:top w:w="70" w:type="dxa"/>
+              <w:left w:w="110" w:type="dxa"/>
+              <w:bottom w:w="70" w:type="dxa"/>
+              <w:right w:w="110" w:type="dxa"/>
+            </w:tcMar>
+            <w:vAlign w:val="center"/>
+          </w:tcPr>
+          <w:p>
+            <w:pPr>
+              <w:spacing w:after="0"/>
+            </w:pPr>
+            <w:r>
+              <w:rPr>
+                <w:b w:val="0"/>
+                <w:color w:val="1E293B"/>
+                <w:sz w:val="19"/>
+              </w:rPr>
+              <w:t xml:space="preserve">× Exit P/E 18× = Exit equity value</w:t>
+            </w:r>
+          </w:p>
+        </w:tc>
+        <w:tc>
+          <w:tcPr>
+            <w:tcW w:w="3120" w:type="dxa"/>
+            <w:tcBorders>
+              <w:top w:val="single" w:sz="4" w:space="0" w:color="CCCCCC"/>
+              <w:left w:val="single" w:sz="4" w:space="0" w:color="CCCCCC"/>
+              <w:bottom w:val="single" w:sz="4" w:space="0" w:color="CCCCCC"/>
+              <w:right w:val="single" w:sz="4" w:space="0" w:color="CCCCCC"/>
+            </w:tcBorders>
+            <w:tcMar>
+              <w:top w:w="70" w:type="dxa"/>
+              <w:left w:w="110" w:type="dxa"/>
+              <w:bottom w:w="70" w:type="dxa"/>
+              <w:right w:w="110" w:type="dxa"/>
+            </w:tcMar>
+            <w:vAlign w:val="center"/>
+          </w:tcPr>
+          <w:p>
+            <w:pPr>
+              <w:spacing w:after="0"/>
+            </w:pPr>
+            <w:r>
+              <w:rPr>
+                <w:b w:val="0"/>
+                <w:color w:val="1E293B"/>
+                <w:sz w:val="19"/>
+              </w:rPr>
+              <w:t xml:space="preserve">₹ 5,893 Cr</w:t>
+            </w:r>
+          </w:p>
+        </w:tc>
+      </w:tr>
+      <w:tr>
+        <w:tc>
+          <w:tcPr>
+            <w:tcW w:w="6240" w:type="dxa"/>
+            <w:tcBorders>
+              <w:top w:val="single" w:sz="4" w:space="0" w:color="CCCCCC"/>
+              <w:left w:val="single" w:sz="4" w:space="0" w:color="CCCCCC"/>
+              <w:bottom w:val="single" w:sz="4" w:space="0" w:color="CCCCCC"/>
+              <w:right w:val="single" w:sz="4" w:space="0" w:color="CCCCCC"/>
+            </w:tcBorders>
+            <w:shd w:val="clear" w:color="auto" w:fill="F7F9FF"/>
+            <w:tcMar>
+              <w:top w:w="70" w:type="dxa"/>
+              <w:left w:w="110" w:type="dxa"/>
+              <w:bottom w:w="70" w:type="dxa"/>
+              <w:right w:w="110" w:type="dxa"/>
+            </w:tcMar>
+            <w:vAlign w:val="center"/>
+          </w:tcPr>
+          <w:p>
+            <w:pPr>
+              <w:spacing w:after="0"/>
+            </w:pPr>
+            <w:r>
+              <w:rPr>
+                <w:b w:val="0"/>
+                <w:color w:val="1E293B"/>
+                <w:sz w:val="19"/>
+              </w:rPr>
+              <w:t xml:space="preserve">÷ (1.25)⁵ = 3.05× required money multiple</w:t>
+            </w:r>
+          </w:p>
+        </w:tc>
+        <w:tc>
+          <w:tcPr>
+            <w:tcW w:w="3120" w:type="dxa"/>
+            <w:tcBorders>
+              <w:top w:val="single" w:sz="4" w:space="0" w:color="CCCCCC"/>
+              <w:left w:val="single" w:sz="4" w:space="0" w:color="CCCCCC"/>
+              <w:bottom w:val="single" w:sz="4" w:space="0" w:color="CCCCCC"/>
+              <w:right w:val="single" w:sz="4" w:space="0" w:color="CCCCCC"/>
+            </w:tcBorders>
+            <w:shd w:val="clear" w:color="auto" w:fill="F7F9FF"/>
+            <w:tcMar>
+              <w:top w:w="70" w:type="dxa"/>
+              <w:left w:w="110" w:type="dxa"/>
+              <w:bottom w:w="70" w:type="dxa"/>
+              <w:right w:w="110" w:type="dxa"/>
+            </w:tcMar>
+            <w:vAlign w:val="center"/>
+          </w:tcPr>
+          <w:p>
+            <w:pPr>
+              <w:spacing w:after="0"/>
+            </w:pPr>
+            <w:r>
+              <w:rPr>
+                <w:b w:val="0"/>
+                <w:color w:val="1E293B"/>
+                <w:sz w:val="19"/>
+              </w:rPr>
+              <w:t xml:space="preserve">₹ 1,931 Cr post-money (no dilution)</w:t>
+            </w:r>
+          </w:p>
+        </w:tc>
+      </w:tr>
+      <w:tr>
+        <w:tc>
+          <w:tcPr>
+            <w:tcW w:w="6240" w:type="dxa"/>
+            <w:tcBorders>
+              <w:top w:val="single" w:sz="4" w:space="0" w:color="CCCCCC"/>
+              <w:left w:val="single" w:sz="4" w:space="0" w:color="CCCCCC"/>
+              <w:bottom w:val="single" w:sz="4" w:space="0" w:color="CCCCCC"/>
+              <w:right w:val="single" w:sz="4" w:space="0" w:color="CCCCCC"/>
+            </w:tcBorders>
+            <w:tcMar>
+              <w:top w:w="70" w:type="dxa"/>
+              <w:left w:w="110" w:type="dxa"/>
+              <w:bottom w:w="70" w:type="dxa"/>
+              <w:right w:w="110" w:type="dxa"/>
+            </w:tcMar>
+            <w:vAlign w:val="center"/>
+          </w:tcPr>
+          <w:p>
+            <w:pPr>
+              <w:spacing w:after="0"/>
+            </w:pPr>
+            <w:r>
+              <w:rPr>
+                <w:b w:val="0"/>
+                <w:color w:val="1E293B"/>
+                <w:sz w:val="19"/>
+              </w:rPr>
+              <w:t xml:space="preserve">Required stake at exit = 300 × 3.05 ÷ 5,893</w:t>
+            </w:r>
+          </w:p>
+        </w:tc>
+        <w:tc>
+          <w:tcPr>
+            <w:tcW w:w="3120" w:type="dxa"/>
+            <w:tcBorders>
+              <w:top w:val="single" w:sz="4" w:space="0" w:color="CCCCCC"/>
+              <w:left w:val="single" w:sz="4" w:space="0" w:color="CCCCCC"/>
+              <w:bottom w:val="single" w:sz="4" w:space="0" w:color="CCCCCC"/>
+              <w:right w:val="single" w:sz="4" w:space="0" w:color="CCCCCC"/>
+            </w:tcBorders>
+            <w:tcMar>
+              <w:top w:w="70" w:type="dxa"/>
+              <w:left w:w="110" w:type="dxa"/>
+              <w:bottom w:w="70" w:type="dxa"/>
+              <w:right w:w="110" w:type="dxa"/>
+            </w:tcMar>
+            <w:vAlign w:val="center"/>
+          </w:tcPr>
+          <w:p>
+            <w:pPr>
+              <w:spacing w:after="0"/>
+            </w:pPr>
+            <w:r>
+              <w:rPr>
+                <w:b w:val="0"/>
+                <w:color w:val="1E293B"/>
+                <w:sz w:val="19"/>
+              </w:rPr>
+              <w:t xml:space="preserve">15.5%</w:t>
+            </w:r>
+          </w:p>
+        </w:tc>
+      </w:tr>
+      <w:tr>
+        <w:tc>
+          <w:tcPr>
+            <w:tcW w:w="6240" w:type="dxa"/>
+            <w:tcBorders>
+              <w:top w:val="single" w:sz="4" w:space="0" w:color="CCCCCC"/>
+              <w:left w:val="single" w:sz="4" w:space="0" w:color="CCCCCC"/>
+              <w:bottom w:val="single" w:sz="4" w:space="0" w:color="CCCCCC"/>
+              <w:right w:val="single" w:sz="4" w:space="0" w:color="CCCCCC"/>
+            </w:tcBorders>
+            <w:shd w:val="clear" w:color="auto" w:fill="F7F9FF"/>
+            <w:tcMar>
+              <w:top w:w="70" w:type="dxa"/>
+              <w:left w:w="110" w:type="dxa"/>
+              <w:bottom w:w="70" w:type="dxa"/>
+              <w:right w:w="110" w:type="dxa"/>
+            </w:tcMar>
+            <w:vAlign w:val="center"/>
+          </w:tcPr>
+          <w:p>
+            <w:pPr>
+              <w:spacing w:after="0"/>
+            </w:pPr>
+            <w:r>
+              <w:rPr>
+                <w:b w:val="0"/>
+                <w:color w:val="1E293B"/>
+                <w:sz w:val="19"/>
+              </w:rPr>
+              <w:t xml:space="preserve">÷ 90% retention = required stake today</w:t>
+            </w:r>
+          </w:p>
+        </w:tc>
+        <w:tc>
+          <w:tcPr>
+            <w:tcW w:w="3120" w:type="dxa"/>
+            <w:tcBorders>
+              <w:top w:val="single" w:sz="4" w:space="0" w:color="CCCCCC"/>
+              <w:left w:val="single" w:sz="4" w:space="0" w:color="CCCCCC"/>
+              <w:bottom w:val="single" w:sz="4" w:space="0" w:color="CCCCCC"/>
+              <w:right w:val="single" w:sz="4" w:space="0" w:color="CCCCCC"/>
+            </w:tcBorders>
+            <w:shd w:val="clear" w:color="auto" w:fill="F7F9FF"/>
+            <w:tcMar>
+              <w:top w:w="70" w:type="dxa"/>
+              <w:left w:w="110" w:type="dxa"/>
+              <w:bottom w:w="70" w:type="dxa"/>
+              <w:right w:w="110" w:type="dxa"/>
+            </w:tcMar>
+            <w:vAlign w:val="center"/>
+          </w:tcPr>
+          <w:p>
+            <w:pPr>
+              <w:spacing w:after="0"/>
+            </w:pPr>
+            <w:r>
+              <w:rPr>
+                <w:b w:val="0"/>
+                <w:color w:val="1E293B"/>
+                <w:sz w:val="19"/>
+              </w:rPr>
+              <w:t xml:space="preserve">17.3%</w:t>
+            </w:r>
+          </w:p>
+        </w:tc>
+      </w:tr>
+      <w:tr>
+        <w:tc>
+          <w:tcPr>
+            <w:tcW w:w="6240" w:type="dxa"/>
+            <w:tcBorders>
+              <w:top w:val="single" w:sz="4" w:space="0" w:color="CCCCCC"/>
+              <w:left w:val="single" w:sz="4" w:space="0" w:color="CCCCCC"/>
+              <w:bottom w:val="single" w:sz="4" w:space="0" w:color="CCCCCC"/>
+              <w:right w:val="single" w:sz="4" w:space="0" w:color="CCCCCC"/>
+            </w:tcBorders>
+            <w:tcMar>
+              <w:top w:w="70" w:type="dxa"/>
+              <w:left w:w="110" w:type="dxa"/>
+              <w:bottom w:w="70" w:type="dxa"/>
+              <w:right w:w="110" w:type="dxa"/>
+            </w:tcMar>
+            <w:vAlign w:val="center"/>
+          </w:tcPr>
+          <w:p>
+            <w:pPr>
+              <w:spacing w:after="0"/>
+            </w:pPr>
+            <w:r>
+              <w:rPr>
+                <w:b w:val="0"/>
+                <w:color w:val="1E293B"/>
+                <w:sz w:val="19"/>
+              </w:rPr>
+              <w:t xml:space="preserve">Post-money = 300 ÷ 17.3%</w:t>
+            </w:r>
+          </w:p>
+        </w:tc>
+        <w:tc>
+          <w:tcPr>
+            <w:tcW w:w="3120" w:type="dxa"/>
+            <w:tcBorders>
+              <w:top w:val="single" w:sz="4" w:space="0" w:color="CCCCCC"/>
+              <w:left w:val="single" w:sz="4" w:space="0" w:color="CCCCCC"/>
+              <w:bottom w:val="single" w:sz="4" w:space="0" w:color="CCCCCC"/>
+              <w:right w:val="single" w:sz="4" w:space="0" w:color="CCCCCC"/>
+            </w:tcBorders>
+            <w:tcMar>
+              <w:top w:w="70" w:type="dxa"/>
+              <w:left w:w="110" w:type="dxa"/>
+              <w:bottom w:w="70" w:type="dxa"/>
+              <w:right w:w="110" w:type="dxa"/>
+            </w:tcMar>
+            <w:vAlign w:val="center"/>
+          </w:tcPr>
+          <w:p>
+            <w:pPr>
+              <w:spacing w:after="0"/>
+            </w:pPr>
+            <w:r>
+              <w:rPr>
+                <w:b w:val="0"/>
+                <w:color w:val="1E293B"/>
+                <w:sz w:val="19"/>
+              </w:rPr>
+              <w:t xml:space="preserve">₹ 1,738 Cr</w:t>
+            </w:r>
+          </w:p>
+        </w:tc>
+      </w:tr>
+      <w:tr>
+        <w:tc>
+          <w:tcPr>
+            <w:tcW w:w="6240" w:type="dxa"/>
+            <w:tcBorders>
+              <w:top w:val="single" w:sz="4" w:space="0" w:color="CCCCCC"/>
+              <w:left w:val="single" w:sz="4" w:space="0" w:color="CCCCCC"/>
+              <w:bottom w:val="single" w:sz="4" w:space="0" w:color="CCCCCC"/>
+              <w:right w:val="single" w:sz="4" w:space="0" w:color="CCCCCC"/>
+            </w:tcBorders>
+            <w:shd w:val="clear" w:color="auto" w:fill="EEF2FF"/>
+            <w:tcMar>
+              <w:top w:w="70" w:type="dxa"/>
+              <w:left w:w="110" w:type="dxa"/>
+              <w:bottom w:w="70" w:type="dxa"/>
+              <w:right w:w="110" w:type="dxa"/>
+            </w:tcMar>
+            <w:vAlign w:val="center"/>
+          </w:tcPr>
+          <w:p>
+            <w:pPr>
+              <w:spacing w:after="0"/>
+            </w:pPr>
+            <w:r>
+              <w:rPr>
+                <w:b/>
+                <w:color w:val="1E293B"/>
+                <w:sz w:val="19"/>
+              </w:rPr>
+              <w:t xml:space="preserve">Pre-money = 1,738 − 300</w:t>
+            </w:r>
+          </w:p>
+        </w:tc>
+        <w:tc>
+          <w:tcPr>
+            <w:tcW w:w="3120" w:type="dxa"/>
+            <w:tcBorders>
+              <w:top w:val="single" w:sz="4" w:space="0" w:color="CCCCCC"/>
+              <w:left w:val="single" w:sz="4" w:space="0" w:color="CCCCCC"/>
+              <w:bottom w:val="single" w:sz="4" w:space="0" w:color="CCCCCC"/>
+              <w:right w:val="single" w:sz="4" w:space="0" w:color="CCCCCC"/>
+            </w:tcBorders>
+            <w:shd w:val="clear" w:color="auto" w:fill="EEF2FF"/>
+            <w:tcMar>
+              <w:top w:w="70" w:type="dxa"/>
+              <w:left w:w="110" w:type="dxa"/>
+              <w:bottom w:w="70" w:type="dxa"/>
+              <w:right w:w="110" w:type="dxa"/>
+            </w:tcMar>
+            <w:vAlign w:val="center"/>
+          </w:tcPr>
+          <w:p>
+            <w:pPr>
+              <w:spacing w:after="0"/>
+            </w:pPr>
+            <w:r>
+              <w:rPr>
+                <w:b/>
+                <w:color w:val="1E293B"/>
+                <w:sz w:val="19"/>
+              </w:rPr>
+              <w:t xml:space="preserve">₹ 1,438 Cr</w:t>
+            </w:r>
+          </w:p>
+        </w:tc>
+      </w:tr>
+      <w:tr>
+        <w:tc>
+          <w:tcPr>
+            <w:tcW w:w="6240" w:type="dxa"/>
+            <w:tcBorders>
+              <w:top w:val="single" w:sz="4" w:space="0" w:color="CCCCCC"/>
+              <w:left w:val="single" w:sz="4" w:space="0" w:color="CCCCCC"/>
+              <w:bottom w:val="single" w:sz="4" w:space="0" w:color="CCCCCC"/>
+              <w:right w:val="single" w:sz="4" w:space="0" w:color="CCCCCC"/>
+            </w:tcBorders>
+            <w:shd w:val="clear" w:color="auto" w:fill="EEF2FF"/>
+            <w:tcMar>
+              <w:top w:w="70" w:type="dxa"/>
+              <w:left w:w="110" w:type="dxa"/>
+              <w:bottom w:w="70" w:type="dxa"/>
+              <w:right w:w="110" w:type="dxa"/>
+            </w:tcMar>
+            <w:vAlign w:val="center"/>
+          </w:tcPr>
+          <w:p>
+            <w:pPr>
+              <w:spacing w:after="0"/>
+            </w:pPr>
+            <w:r>
+              <w:rPr>
+                <w:b/>
+                <w:color w:val="1E293B"/>
+                <w:sz w:val="19"/>
+              </w:rPr>
+              <w:t xml:space="preserve">÷ 10.3 Cr diluted shares = value per share</w:t>
+            </w:r>
+          </w:p>
+        </w:tc>
+        <w:tc>
+          <w:tcPr>
+            <w:tcW w:w="3120" w:type="dxa"/>
+            <w:tcBorders>
+              <w:top w:val="single" w:sz="4" w:space="0" w:color="CCCCCC"/>
+              <w:left w:val="single" w:sz="4" w:space="0" w:color="CCCCCC"/>
+              <w:bottom w:val="single" w:sz="4" w:space="0" w:color="CCCCCC"/>
+              <w:right w:val="single" w:sz="4" w:space="0" w:color="CCCCCC"/>
+            </w:tcBorders>
+            <w:shd w:val="clear" w:color="auto" w:fill="EEF2FF"/>
+            <w:tcMar>
+              <w:top w:w="70" w:type="dxa"/>
+              <w:left w:w="110" w:type="dxa"/>
+              <w:bottom w:w="70" w:type="dxa"/>
+              <w:right w:w="110" w:type="dxa"/>
+            </w:tcMar>
+            <w:vAlign w:val="center"/>
+          </w:tcPr>
+          <w:p>
+            <w:pPr>
+              <w:spacing w:after="0"/>
+            </w:pPr>
+            <w:r>
+              <w:rPr>
+                <w:b/>
+                <w:color w:val="1E293B"/>
+                <w:sz w:val="19"/>
+              </w:rPr>
+              <w:t xml:space="preserve">₹ 140</w:t>
+            </w:r>
+          </w:p>
+        </w:tc>
+      </w:tr>
+      <w:tr>
+        <w:tc>
+          <w:tcPr>
+            <w:tcW w:w="6240" w:type="dxa"/>
+            <w:tcBorders>
+              <w:top w:val="single" w:sz="4" w:space="0" w:color="CCCCCC"/>
+              <w:left w:val="single" w:sz="4" w:space="0" w:color="CCCCCC"/>
+              <w:bottom w:val="single" w:sz="4" w:space="0" w:color="CCCCCC"/>
+              <w:right w:val="single" w:sz="4" w:space="0" w:color="CCCCCC"/>
+            </w:tcBorders>
+            <w:shd w:val="clear" w:color="auto" w:fill="F7F9FF"/>
+            <w:tcMar>
+              <w:top w:w="70" w:type="dxa"/>
+              <w:left w:w="110" w:type="dxa"/>
+              <w:bottom w:w="70" w:type="dxa"/>
+              <w:right w:w="110" w:type="dxa"/>
+            </w:tcMar>
+            <w:vAlign w:val="center"/>
+          </w:tcPr>
+          <w:p>
+            <w:pPr>
+              <w:spacing w:after="0"/>
+            </w:pPr>
+            <w:r>
+              <w:rPr>
+                <w:b w:val="0"/>
+                <w:color w:val="1E293B"/>
+                <w:sz w:val="19"/>
+              </w:rPr>
+              <w:t xml:space="preserve">New shares issued (17.3% stake) at ₹140</w:t>
+            </w:r>
+          </w:p>
+        </w:tc>
+        <w:tc>
+          <w:tcPr>
+            <w:tcW w:w="3120" w:type="dxa"/>
+            <w:tcBorders>
+              <w:top w:val="single" w:sz="4" w:space="0" w:color="CCCCCC"/>
+              <w:left w:val="single" w:sz="4" w:space="0" w:color="CCCCCC"/>
+              <w:bottom w:val="single" w:sz="4" w:space="0" w:color="CCCCCC"/>
+              <w:right w:val="single" w:sz="4" w:space="0" w:color="CCCCCC"/>
+            </w:tcBorders>
+            <w:shd w:val="clear" w:color="auto" w:fill="F7F9FF"/>
+            <w:tcMar>
+              <w:top w:w="70" w:type="dxa"/>
+              <w:left w:w="110" w:type="dxa"/>
+              <w:bottom w:w="70" w:type="dxa"/>
+              <w:right w:w="110" w:type="dxa"/>
+            </w:tcMar>
+            <w:vAlign w:val="center"/>
+          </w:tcPr>
+          <w:p>
+            <w:pPr>
+              <w:spacing w:after="0"/>
+            </w:pPr>
+            <w:r>
+              <w:rPr>
+                <w:b w:val="0"/>
+                <w:color w:val="1E293B"/>
+                <w:sz w:val="19"/>
+              </w:rPr>
+              <w:t xml:space="preserve">2.15 Cr shares</w:t>
+            </w:r>
+          </w:p>
+        </w:tc>
+      </w:tr>
+    </w:tbl>
+    <w:p>
+      <w:pPr>
+        <w:spacing w:after="60"/>
+      </w:pPr>
+    </w:p>
+    <w:p>
+      <w:pPr>
+        <w:spacing w:after="120" w:before="0" w:line="276" w:lineRule="auto"/>
+      </w:pPr>
+      <w:r>
+        <w:rPr>
+          <w:b/>
+          <w:i w:val="0"/>
+          <w:color w:val="1E293B"/>
+          <w:sz w:val="21"/>
+        </w:rPr>
+        <w:t xml:space="preserve">Read-across for a listed company. </w:t>
+      </w:r>
+      <w:r>
+        <w:rPr>
+          <w:b w:val="0"/>
+          <w:i w:val="0"/>
+          <w:color w:val="1E293B"/>
+          <w:sz w:val="21"/>
+        </w:rPr>
+        <w:t xml:space="preserve">At ₹310 the market cap is about ₹3,193 Cr. Buying the whole company today and exiting at ₹5,893 Cr (after 10% dilution) earns an IRR of only about </w:t>
+      </w:r>
+      <w:r>
+        <w:rPr>
+          <w:b/>
+          <w:i w:val="0"/>
+          <w:color w:val="1E293B"/>
+          <w:sz w:val="21"/>
+        </w:rPr>
+        <w:t xml:space="preserve">10.7%</w:t>
+      </w:r>
+      <w:r>
+        <w:rPr>
+          <w:b w:val="0"/>
+          <w:i w:val="0"/>
+          <w:color w:val="1E293B"/>
+          <w:sz w:val="21"/>
+        </w:rPr>
+        <w:t xml:space="preserve"> — well below a 25% venture hurdle, but close to the 11.4% WACC. That is expected: public-market investors accept lower returns for liquidity and lower risk. For a mature listed stock, treat the VC method as a </w:t>
+      </w:r>
+      <w:r>
+        <w:rPr>
+          <w:b/>
+          <w:i w:val="0"/>
+          <w:color w:val="1E293B"/>
+          <w:sz w:val="21"/>
+        </w:rPr>
+        <w:t xml:space="preserve">lens on investor returns</w:t>
+      </w:r>
+      <w:r>
+        <w:rPr>
+          <w:b w:val="0"/>
+          <w:i w:val="0"/>
+          <w:color w:val="1E293B"/>
+          <w:sz w:val="21"/>
+        </w:rPr>
+        <w:t xml:space="preserve">, not as a fair-value estimate.</w:t>
+      </w:r>
+    </w:p>
+    <w:tbl>
+      <w:tblPr>
+        <w:tblW w:w="9360" w:type="dxa"/>
+        <w:jc w:val="center"/>
+        <w:tblLayout w:type="fixed"/>
+        <w:tblLook w:firstColumn="1" w:firstRow="1" w:lastColumn="0" w:lastRow="0" w:noHBand="0" w:noVBand="1" w:val="04A0"/>
+      </w:tblPr>
+      <w:tblGrid>
+        <w:gridCol w:w="9360"/>
+      </w:tblGrid>
+      <w:tr>
+        <w:tc>
+          <w:tcPr>
+            <w:tcW w:w="9360" w:type="dxa"/>
+            <w:tcBorders>
+              <w:top w:val="single" w:sz="4" w:space="0" w:color="E2E8F8"/>
+              <w:left w:val="single" w:sz="24" w:space="0" w:color="7209B7"/>
+              <w:bottom w:val="single" w:sz="4" w:space="0" w:color="E2E8F8"/>
+              <w:right w:val="single" w:sz="4" w:space="0" w:color="E2E8F8"/>
+            </w:tcBorders>
+            <w:shd w:val="clear" w:color="auto" w:fill="FBFBFE"/>
+            <w:tcMar>
+              <w:top w:w="120" w:type="dxa"/>
+              <w:left w:w="160" w:type="dxa"/>
+              <w:bottom w:w="120" w:type="dxa"/>
+              <w:right w:w="160" w:type="dxa"/>
+            </w:tcMar>
+          </w:tcPr>
+          <w:p>
+            <w:pPr>
+              <w:spacing w:after="60"/>
+            </w:pPr>
+            <w:r>
+              <w:rPr>
+                <w:b/>
+                <w:color w:val="7209B7"/>
+                <w:sz w:val="21"/>
+              </w:rPr>
+              <w:t>❖  VC method — strengths &amp; limitations</w:t>
+            </w:r>
+          </w:p>
+          <w:p>
+            <w:pPr>
+              <w:spacing w:after="40"/>
+            </w:pPr>
+            <w:r>
+              <w:rPr>
+                <w:b w:val="0"/>
+                <w:i w:val="0"/>
+                <w:color w:val="1E293B"/>
+                <w:sz w:val="20"/>
+              </w:rPr>
+              <w:t xml:space="preserve">Simple and transparent; works when there are no profits or positive cash flows today.</w:t>
+            </w:r>
+          </w:p>
+          <w:p>
+            <w:pPr>
+              <w:spacing w:after="40"/>
+            </w:pPr>
+            <w:r>
+              <w:rPr>
+                <w:b w:val="0"/>
+                <w:i w:val="0"/>
+                <w:color w:val="1E293B"/>
+                <w:sz w:val="20"/>
+              </w:rPr>
+              <w:t xml:space="preserve">Highly sensitive to the exit multiple and the IRR — always show an IRR × exit-multiple grid.</w:t>
+            </w:r>
+          </w:p>
+          <w:p>
+            <w:pPr>
+              <w:spacing w:after="40"/>
+            </w:pPr>
+            <w:r>
+              <w:rPr>
+                <w:b w:val="0"/>
+                <w:i w:val="0"/>
+                <w:color w:val="1E293B"/>
+                <w:sz w:val="20"/>
+              </w:rPr>
+              <w:t xml:space="preserve">Ignores interim cash flows and dividends; all risk is loaded into one hurdle rate instead of being modelled explicitly.</w:t>
+            </w:r>
+          </w:p>
+          <w:p>
+            <w:pPr>
+              <w:spacing w:after="40"/>
+            </w:pPr>
+            <w:r>
+              <w:rPr>
+                <w:b w:val="0"/>
+                <w:i w:val="0"/>
+                <w:color w:val="1E293B"/>
+                <w:sz w:val="20"/>
+              </w:rPr>
+              <w:t xml:space="preserve">In ValuMetrics: the VC Method tab computes all of the above, with stage presets, a peer-median multiple shortcut and IRR at CMP.</w:t>
+            </w:r>
+          </w:p>
+        </w:tc>
+      </w:tr>
+    </w:tbl>
+    <w:p>
+      <w:pPr>
+        <w:spacing w:after="60"/>
+      </w:pPr>
+    </w:p>
+    <w:p>
+      <w:pPr>
+        <w:pStyle w:val="Heading2"/>
+      </w:pPr>
+      <w:r>
+        <w:t>6.7  Choosing a method</w:t>
       </w:r>
     </w:p>
     <w:tbl>
@@ -11717,6 +13388,72 @@
                 <w:sz w:val="19"/>
               </w:rPr>
               <w:t>EV/Sales comps, scenario DCF</w:t>
+            </w:r>
+          </w:p>
+        </w:tc>
+      </w:tr>
+      <w:tr>
+        <w:tc>
+          <w:tcPr>
+            <w:tcW w:w="4360" w:type="dxa"/>
+            <w:tcBorders>
+              <w:top w:val="single" w:sz="4" w:space="0" w:color="CCCCCC"/>
+              <w:left w:val="single" w:sz="4" w:space="0" w:color="CCCCCC"/>
+              <w:bottom w:val="single" w:sz="4" w:space="0" w:color="CCCCCC"/>
+              <w:right w:val="single" w:sz="4" w:space="0" w:color="CCCCCC"/>
+            </w:tcBorders>
+            <w:shd w:val="clear" w:color="auto" w:fill="F7F9FF"/>
+            <w:tcMar>
+              <w:top w:w="70" w:type="dxa"/>
+              <w:left w:w="110" w:type="dxa"/>
+              <w:bottom w:w="70" w:type="dxa"/>
+              <w:right w:w="110" w:type="dxa"/>
+            </w:tcMar>
+            <w:vAlign w:val="center"/>
+          </w:tcPr>
+          <w:p>
+            <w:pPr>
+              <w:spacing w:after="0"/>
+            </w:pPr>
+            <w:r>
+              <w:rPr>
+                <w:b w:val="0"/>
+                <w:color w:val="1E293B"/>
+                <w:sz w:val="19"/>
+              </w:rPr>
+              <w:t xml:space="preserve">Start-up / VC-backed / pre-IPO</w:t>
+            </w:r>
+          </w:p>
+        </w:tc>
+        <w:tc>
+          <w:tcPr>
+            <w:tcW w:w="5000" w:type="dxa"/>
+            <w:tcBorders>
+              <w:top w:val="single" w:sz="4" w:space="0" w:color="CCCCCC"/>
+              <w:left w:val="single" w:sz="4" w:space="0" w:color="CCCCCC"/>
+              <w:bottom w:val="single" w:sz="4" w:space="0" w:color="CCCCCC"/>
+              <w:right w:val="single" w:sz="4" w:space="0" w:color="CCCCCC"/>
+            </w:tcBorders>
+            <w:shd w:val="clear" w:color="auto" w:fill="F7F9FF"/>
+            <w:tcMar>
+              <w:top w:w="70" w:type="dxa"/>
+              <w:left w:w="110" w:type="dxa"/>
+              <w:bottom w:w="70" w:type="dxa"/>
+              <w:right w:w="110" w:type="dxa"/>
+            </w:tcMar>
+            <w:vAlign w:val="center"/>
+          </w:tcPr>
+          <w:p>
+            <w:pPr>
+              <w:spacing w:after="0"/>
+            </w:pPr>
+            <w:r>
+              <w:rPr>
+                <w:b w:val="0"/>
+                <w:color w:val="1E293B"/>
+                <w:sz w:val="19"/>
+              </w:rPr>
+              <w:t xml:space="preserve">VC method + EV/Sales comps</w:t>
             </w:r>
           </w:p>
         </w:tc>
@@ -14855,7 +16592,7 @@
                 <w:color w:val="1E293B"/>
                 <w:sz w:val="19"/>
               </w:rPr>
-              <w:t>₹ 347</w:t>
+              <w:t>₹ 332</w:t>
             </w:r>
           </w:p>
         </w:tc>
@@ -14887,7 +16624,102 @@
                 <w:color w:val="1E293B"/>
                 <w:sz w:val="19"/>
               </w:rPr>
-              <w:t>Upside</w:t>
+              <w:t>Modest upside</w:t>
+            </w:r>
+          </w:p>
+        </w:tc>
+      </w:tr>
+      <w:tr>
+        <w:tc>
+          <w:tcPr>
+            <w:tcW w:w="3760" w:type="dxa"/>
+            <w:tcBorders>
+              <w:top w:val="single" w:sz="4" w:space="0" w:color="CCCCCC"/>
+              <w:left w:val="single" w:sz="4" w:space="0" w:color="CCCCCC"/>
+              <w:bottom w:val="single" w:sz="4" w:space="0" w:color="CCCCCC"/>
+              <w:right w:val="single" w:sz="4" w:space="0" w:color="CCCCCC"/>
+            </w:tcBorders>
+            <w:tcMar>
+              <w:top w:w="70" w:type="dxa"/>
+              <w:left w:w="110" w:type="dxa"/>
+              <w:bottom w:w="70" w:type="dxa"/>
+              <w:right w:w="110" w:type="dxa"/>
+            </w:tcMar>
+            <w:vAlign w:val="center"/>
+          </w:tcPr>
+          <w:p>
+            <w:pPr>
+              <w:spacing w:after="0"/>
+            </w:pPr>
+            <w:r>
+              <w:rPr>
+                <w:b w:val="0"/>
+                <w:color w:val="1E293B"/>
+                <w:sz w:val="19"/>
+              </w:rPr>
+              <w:t xml:space="preserve">VC method (18× P/E, 25% IRR)</w:t>
+            </w:r>
+          </w:p>
+        </w:tc>
+        <w:tc>
+          <w:tcPr>
+            <w:tcW w:w="3200" w:type="dxa"/>
+            <w:tcBorders>
+              <w:top w:val="single" w:sz="4" w:space="0" w:color="CCCCCC"/>
+              <w:left w:val="single" w:sz="4" w:space="0" w:color="CCCCCC"/>
+              <w:bottom w:val="single" w:sz="4" w:space="0" w:color="CCCCCC"/>
+              <w:right w:val="single" w:sz="4" w:space="0" w:color="CCCCCC"/>
+            </w:tcBorders>
+            <w:tcMar>
+              <w:top w:w="70" w:type="dxa"/>
+              <w:left w:w="110" w:type="dxa"/>
+              <w:bottom w:w="70" w:type="dxa"/>
+              <w:right w:w="110" w:type="dxa"/>
+            </w:tcMar>
+            <w:vAlign w:val="center"/>
+          </w:tcPr>
+          <w:p>
+            <w:pPr>
+              <w:spacing w:after="0"/>
+            </w:pPr>
+            <w:r>
+              <w:rPr>
+                <w:b w:val="0"/>
+                <w:color w:val="1E293B"/>
+                <w:sz w:val="19"/>
+              </w:rPr>
+              <w:t xml:space="preserve">₹ 140</w:t>
+            </w:r>
+          </w:p>
+        </w:tc>
+        <w:tc>
+          <w:tcPr>
+            <w:tcW w:w="2400" w:type="dxa"/>
+            <w:tcBorders>
+              <w:top w:val="single" w:sz="4" w:space="0" w:color="CCCCCC"/>
+              <w:left w:val="single" w:sz="4" w:space="0" w:color="CCCCCC"/>
+              <w:bottom w:val="single" w:sz="4" w:space="0" w:color="CCCCCC"/>
+              <w:right w:val="single" w:sz="4" w:space="0" w:color="CCCCCC"/>
+            </w:tcBorders>
+            <w:tcMar>
+              <w:top w:w="70" w:type="dxa"/>
+              <w:left w:w="110" w:type="dxa"/>
+              <w:bottom w:w="70" w:type="dxa"/>
+              <w:right w:w="110" w:type="dxa"/>
+            </w:tcMar>
+            <w:vAlign w:val="center"/>
+          </w:tcPr>
+          <w:p>
+            <w:pPr>
+              <w:spacing w:after="0"/>
+            </w:pPr>
+            <w:r>
+              <w:rPr>
+                <w:b w:val="0"/>
+                <w:color w:val="1E293B"/>
+                <w:sz w:val="19"/>
+              </w:rPr>
+              <w:t xml:space="preserve">IRR at CMP ≈ 10.7%</w:t>
             </w:r>
           </w:p>
         </w:tc>
@@ -16374,6 +18206,136 @@
                 <w:sz w:val="19"/>
               </w:rPr>
               <w:t>1.2A + 1.4B + 3.3C + 0.6D + 1.0E</w:t>
+            </w:r>
+          </w:p>
+        </w:tc>
+      </w:tr>
+      <w:tr>
+        <w:tc>
+          <w:tcPr>
+            <w:tcW w:w="3760" w:type="dxa"/>
+            <w:tcBorders>
+              <w:top w:val="single" w:sz="4" w:space="0" w:color="CCCCCC"/>
+              <w:left w:val="single" w:sz="4" w:space="0" w:color="CCCCCC"/>
+              <w:bottom w:val="single" w:sz="4" w:space="0" w:color="CCCCCC"/>
+              <w:right w:val="single" w:sz="4" w:space="0" w:color="CCCCCC"/>
+            </w:tcBorders>
+            <w:tcMar>
+              <w:top w:w="70" w:type="dxa"/>
+              <w:left w:w="110" w:type="dxa"/>
+              <w:bottom w:w="70" w:type="dxa"/>
+              <w:right w:w="110" w:type="dxa"/>
+            </w:tcMar>
+            <w:vAlign w:val="center"/>
+          </w:tcPr>
+          <w:p>
+            <w:pPr>
+              <w:spacing w:after="0"/>
+            </w:pPr>
+            <w:r>
+              <w:rPr>
+                <w:b w:val="0"/>
+                <w:color w:val="1E293B"/>
+                <w:sz w:val="19"/>
+              </w:rPr>
+              <w:t xml:space="preserve">VC post-money</w:t>
+            </w:r>
+          </w:p>
+        </w:tc>
+        <w:tc>
+          <w:tcPr>
+            <w:tcW w:w="5600" w:type="dxa"/>
+            <w:tcBorders>
+              <w:top w:val="single" w:sz="4" w:space="0" w:color="CCCCCC"/>
+              <w:left w:val="single" w:sz="4" w:space="0" w:color="CCCCCC"/>
+              <w:bottom w:val="single" w:sz="4" w:space="0" w:color="CCCCCC"/>
+              <w:right w:val="single" w:sz="4" w:space="0" w:color="CCCCCC"/>
+            </w:tcBorders>
+            <w:tcMar>
+              <w:top w:w="70" w:type="dxa"/>
+              <w:left w:w="110" w:type="dxa"/>
+              <w:bottom w:w="70" w:type="dxa"/>
+              <w:right w:w="110" w:type="dxa"/>
+            </w:tcMar>
+            <w:vAlign w:val="center"/>
+          </w:tcPr>
+          <w:p>
+            <w:pPr>
+              <w:spacing w:after="0"/>
+            </w:pPr>
+            <w:r>
+              <w:rPr>
+                <w:b w:val="0"/>
+                <w:color w:val="1E293B"/>
+                <w:sz w:val="19"/>
+              </w:rPr>
+              <w:t xml:space="preserve">Exit Equity ÷ (1 + target IRR)ⁿ</w:t>
+            </w:r>
+          </w:p>
+        </w:tc>
+      </w:tr>
+      <w:tr>
+        <w:tc>
+          <w:tcPr>
+            <w:tcW w:w="3760" w:type="dxa"/>
+            <w:tcBorders>
+              <w:top w:val="single" w:sz="4" w:space="0" w:color="CCCCCC"/>
+              <w:left w:val="single" w:sz="4" w:space="0" w:color="CCCCCC"/>
+              <w:bottom w:val="single" w:sz="4" w:space="0" w:color="CCCCCC"/>
+              <w:right w:val="single" w:sz="4" w:space="0" w:color="CCCCCC"/>
+            </w:tcBorders>
+            <w:shd w:val="clear" w:color="auto" w:fill="F7F9FF"/>
+            <w:tcMar>
+              <w:top w:w="70" w:type="dxa"/>
+              <w:left w:w="110" w:type="dxa"/>
+              <w:bottom w:w="70" w:type="dxa"/>
+              <w:right w:w="110" w:type="dxa"/>
+            </w:tcMar>
+            <w:vAlign w:val="center"/>
+          </w:tcPr>
+          <w:p>
+            <w:pPr>
+              <w:spacing w:after="0"/>
+            </w:pPr>
+            <w:r>
+              <w:rPr>
+                <w:b w:val="0"/>
+                <w:color w:val="1E293B"/>
+                <w:sz w:val="19"/>
+              </w:rPr>
+              <w:t xml:space="preserve">VC required stake</w:t>
+            </w:r>
+          </w:p>
+        </w:tc>
+        <w:tc>
+          <w:tcPr>
+            <w:tcW w:w="5600" w:type="dxa"/>
+            <w:tcBorders>
+              <w:top w:val="single" w:sz="4" w:space="0" w:color="CCCCCC"/>
+              <w:left w:val="single" w:sz="4" w:space="0" w:color="CCCCCC"/>
+              <w:bottom w:val="single" w:sz="4" w:space="0" w:color="CCCCCC"/>
+              <w:right w:val="single" w:sz="4" w:space="0" w:color="CCCCCC"/>
+            </w:tcBorders>
+            <w:shd w:val="clear" w:color="auto" w:fill="F7F9FF"/>
+            <w:tcMar>
+              <w:top w:w="70" w:type="dxa"/>
+              <w:left w:w="110" w:type="dxa"/>
+              <w:bottom w:w="70" w:type="dxa"/>
+              <w:right w:w="110" w:type="dxa"/>
+            </w:tcMar>
+            <w:vAlign w:val="center"/>
+          </w:tcPr>
+          <w:p>
+            <w:pPr>
+              <w:spacing w:after="0"/>
+            </w:pPr>
+            <w:r>
+              <w:rPr>
+                <w:b w:val="0"/>
+                <w:color w:val="1E293B"/>
+                <w:sz w:val="19"/>
+              </w:rPr>
+              <w:t xml:space="preserve">Investment × (1+IRR)ⁿ ÷ Exit Equity ÷ (1 − dilution)</w:t>
             </w:r>
           </w:p>
         </w:tc>

</xml_diff>

<commit_message>
Add VC Method section to the valuation guide (#2)
- New 6.6 Venture Capital (VC) Method: concept, formulas, target-IRR-by-stage
  table, worked example on Vipin Corporation (matches the app's VC tab:
  Rs 140/share, 17.3% stake, IRR at CMP ~10.7%), strengths & limitations.
- "Choosing a method" renumbered to 6.7, with a start-up / VC-backed row.
- Section 9: exit-multiple value updated to Rs 332 (matches corrected
  year-end discounting) and VC method row added.
- Formula reference: VC post-money and required-stake formulas.
- Table of contents now refreshes automatically when opened in Word.


Claude-Session: https://claude.ai/code/session_018hY48TnvoyExCnuZKmZVFd

Co-authored-by: Claude <noreply@anthropic.com>
</commit_message>
<xml_diff>
--- a/Valuation_Deep_Dive_Guide.docx
+++ b/Valuation_Deep_Dive_Guide.docx
@@ -11511,7 +11511,1678 @@
         <w:pStyle w:val="Heading2"/>
       </w:pPr>
       <w:r>
-        <w:t>6.6  Choosing a method</w:t>
+        <w:t xml:space="preserve">6.6  Venture Capital (VC) Method</w:t>
+      </w:r>
+    </w:p>
+    <w:p>
+      <w:pPr>
+        <w:spacing w:after="120" w:before="0" w:line="276" w:lineRule="auto"/>
+      </w:pPr>
+      <w:r>
+        <w:rPr>
+          <w:b w:val="0"/>
+          <w:i w:val="0"/>
+          <w:color w:val="1E293B"/>
+          <w:sz w:val="21"/>
+        </w:rPr>
+        <w:t xml:space="preserve">Used by venture-capital and private-equity investors when near-term cash flows are negative or too uncertain to forecast year by year. Instead of discounting every cash flow, you value the business at a future </w:t>
+      </w:r>
+      <w:r>
+        <w:rPr>
+          <w:b/>
+          <w:i w:val="0"/>
+          <w:color w:val="1E293B"/>
+          <w:sz w:val="21"/>
+        </w:rPr>
+        <w:t xml:space="preserve">exit</w:t>
+      </w:r>
+      <w:r>
+        <w:rPr>
+          <w:b w:val="0"/>
+          <w:i w:val="0"/>
+          <w:color w:val="1E293B"/>
+          <w:sz w:val="21"/>
+        </w:rPr>
+        <w:t xml:space="preserve">, then discount that single figure back at the investor’s </w:t>
+      </w:r>
+      <w:r>
+        <w:rPr>
+          <w:b/>
+          <w:i w:val="0"/>
+          <w:color w:val="1E293B"/>
+          <w:sz w:val="21"/>
+        </w:rPr>
+        <w:t xml:space="preserve">target IRR</w:t>
+      </w:r>
+      <w:r>
+        <w:rPr>
+          <w:b w:val="0"/>
+          <w:i w:val="0"/>
+          <w:color w:val="1E293B"/>
+          <w:sz w:val="21"/>
+        </w:rPr>
+        <w:t xml:space="preserve"> — a hurdle rate that bundles the time value of money, the high failure rate of young companies and illiquidity. Also called the Sahlman method (Harvard, 1987).</w:t>
+      </w:r>
+    </w:p>
+    <w:p>
+      <w:pPr>
+        <w:pBdr>
+          <w:left w:val="single" w:sz="18" w:space="8" w:color="4361EE"/>
+        </w:pBdr>
+        <w:shd w:val="clear" w:color="auto" w:fill="EEF2FF"/>
+        <w:spacing w:before="80" w:after="120"/>
+        <w:ind w:left="120" w:right="120"/>
+      </w:pPr>
+      <w:r>
+        <w:rPr>
+          <w:b/>
+          <w:color w:val="4361EE"/>
+        </w:rPr>
+        <w:t xml:space="preserve">Exit value:  </w:t>
+      </w:r>
+      <w:r>
+        <w:rPr>
+          <w:rFonts w:ascii="Consolas" w:hAnsi="Consolas"/>
+          <w:i/>
+          <w:color w:val="1E293B"/>
+        </w:rPr>
+        <w:t>Exit Equity = Exit multiple × Exit-year metric</w:t>
+      </w:r>
+      <w:r>
+        <w:rPr>
+          <w:i/>
+          <w:color w:val="64748B"/>
+          <w:sz w:val="18"/>
+        </w:rPr>
+        <w:t xml:space="preserve">   — for EV multiples, subtract net debt &amp; bridge items at exit</w:t>
+      </w:r>
+    </w:p>
+    <w:p>
+      <w:pPr>
+        <w:pBdr>
+          <w:left w:val="single" w:sz="18" w:space="8" w:color="4361EE"/>
+        </w:pBdr>
+        <w:shd w:val="clear" w:color="auto" w:fill="EEF2FF"/>
+        <w:spacing w:before="80" w:after="120"/>
+        <w:ind w:left="120" w:right="120"/>
+      </w:pPr>
+      <w:r>
+        <w:rPr>
+          <w:b/>
+          <w:color w:val="4361EE"/>
+        </w:rPr>
+        <w:t xml:space="preserve">Post-money:  </w:t>
+      </w:r>
+      <w:r>
+        <w:rPr>
+          <w:rFonts w:ascii="Consolas" w:hAnsi="Consolas"/>
+          <w:i/>
+          <w:color w:val="1E293B"/>
+        </w:rPr>
+        <w:t>Post-money today = Exit Equity ÷ (1 + IRR)ⁿ</w:t>
+      </w:r>
+      <w:r>
+        <w:rPr>
+          <w:i/>
+          <w:color w:val="64748B"/>
+          <w:sz w:val="18"/>
+        </w:rPr>
+        <w:t xml:space="preserve">   — (1 + IRR)ⁿ is the required money multiple (MOIC)</w:t>
+      </w:r>
+    </w:p>
+    <w:p>
+      <w:pPr>
+        <w:pBdr>
+          <w:left w:val="single" w:sz="18" w:space="8" w:color="4361EE"/>
+        </w:pBdr>
+        <w:shd w:val="clear" w:color="auto" w:fill="EEF2FF"/>
+        <w:spacing w:before="80" w:after="120"/>
+        <w:ind w:left="120" w:right="120"/>
+      </w:pPr>
+      <w:r>
+        <w:rPr>
+          <w:b/>
+          <w:color w:val="4361EE"/>
+        </w:rPr>
+        <w:t xml:space="preserve">Ownership:  </w:t>
+      </w:r>
+      <w:r>
+        <w:rPr>
+          <w:rFonts w:ascii="Consolas" w:hAnsi="Consolas"/>
+          <w:i/>
+          <w:color w:val="1E293B"/>
+        </w:rPr>
+        <w:t>Stake today = Investment × (1 + IRR)ⁿ ÷ Exit Equity ÷ Retention</w:t>
+      </w:r>
+      <w:r>
+        <w:rPr>
+          <w:i/>
+          <w:color w:val="64748B"/>
+          <w:sz w:val="18"/>
+        </w:rPr>
+        <w:t xml:space="preserve">   — Retention = 1 − future dilution</w:t>
+      </w:r>
+    </w:p>
+    <w:p>
+      <w:pPr>
+        <w:pBdr>
+          <w:left w:val="single" w:sz="18" w:space="8" w:color="4361EE"/>
+        </w:pBdr>
+        <w:shd w:val="clear" w:color="auto" w:fill="EEF2FF"/>
+        <w:spacing w:before="80" w:after="120"/>
+        <w:ind w:left="120" w:right="120"/>
+      </w:pPr>
+      <w:r>
+        <w:rPr>
+          <w:b/>
+          <w:color w:val="4361EE"/>
+        </w:rPr>
+        <w:t xml:space="preserve">Pre-money:  </w:t>
+      </w:r>
+      <w:r>
+        <w:rPr>
+          <w:rFonts w:ascii="Consolas" w:hAnsi="Consolas"/>
+          <w:i/>
+          <w:color w:val="1E293B"/>
+        </w:rPr>
+        <w:t>Pre-money = Investment ÷ Stake today − Investment</w:t>
+      </w:r>
+      <w:r>
+        <w:rPr>
+          <w:i/>
+          <w:color w:val="64748B"/>
+          <w:sz w:val="18"/>
+        </w:rPr>
+        <w:t xml:space="preserve">   — ÷ shares = value per share &amp; issue price</w:t>
+      </w:r>
+    </w:p>
+    <w:p>
+      <w:pPr>
+        <w:spacing w:after="120" w:before="0" w:line="276" w:lineRule="auto"/>
+      </w:pPr>
+      <w:r>
+        <w:rPr>
+          <w:b/>
+          <w:i w:val="0"/>
+          <w:color w:val="1E293B"/>
+          <w:sz w:val="21"/>
+        </w:rPr>
+        <w:t xml:space="preserve">Typical target IRRs by stage</w:t>
+      </w:r>
+      <w:r>
+        <w:rPr>
+          <w:b w:val="0"/>
+          <w:i w:val="0"/>
+          <w:color w:val="1E293B"/>
+          <w:sz w:val="21"/>
+        </w:rPr>
+        <w:t xml:space="preserve"> — the riskier the stage, the higher the hurdle:</w:t>
+      </w:r>
+    </w:p>
+    <w:tbl>
+      <w:tblPr>
+        <w:tblW w:w="9360" w:type="dxa"/>
+        <w:jc w:val="center"/>
+        <w:tblLayout w:type="fixed"/>
+        <w:tblLook w:firstColumn="1" w:firstRow="1" w:lastColumn="0" w:lastRow="0" w:noHBand="0" w:noVBand="1" w:val="04A0"/>
+      </w:tblPr>
+      <w:tblGrid>
+        <w:gridCol w:w="3120"/>
+        <w:gridCol w:w="3120"/>
+        <w:gridCol w:w="3120"/>
+      </w:tblGrid>
+      <w:tr>
+        <w:tc>
+          <w:tcPr>
+            <w:tcW w:w="3120" w:type="dxa"/>
+            <w:tcBorders>
+              <w:top w:val="single" w:sz="4" w:space="0" w:color="CCCCCC"/>
+              <w:left w:val="single" w:sz="4" w:space="0" w:color="CCCCCC"/>
+              <w:bottom w:val="single" w:sz="4" w:space="0" w:color="CCCCCC"/>
+              <w:right w:val="single" w:sz="4" w:space="0" w:color="CCCCCC"/>
+            </w:tcBorders>
+            <w:shd w:val="clear" w:color="auto" w:fill="4361EE"/>
+            <w:tcMar>
+              <w:top w:w="70" w:type="dxa"/>
+              <w:left w:w="110" w:type="dxa"/>
+              <w:bottom w:w="70" w:type="dxa"/>
+              <w:right w:w="110" w:type="dxa"/>
+            </w:tcMar>
+            <w:vAlign w:val="center"/>
+          </w:tcPr>
+          <w:p>
+            <w:pPr>
+              <w:spacing w:after="0"/>
+            </w:pPr>
+            <w:r>
+              <w:rPr>
+                <w:b/>
+                <w:color w:val="FFFFFF"/>
+                <w:sz w:val="20"/>
+              </w:rPr>
+              <w:t xml:space="preserve">Stage</w:t>
+            </w:r>
+          </w:p>
+        </w:tc>
+        <w:tc>
+          <w:tcPr>
+            <w:tcW w:w="3120" w:type="dxa"/>
+            <w:tcBorders>
+              <w:top w:val="single" w:sz="4" w:space="0" w:color="CCCCCC"/>
+              <w:left w:val="single" w:sz="4" w:space="0" w:color="CCCCCC"/>
+              <w:bottom w:val="single" w:sz="4" w:space="0" w:color="CCCCCC"/>
+              <w:right w:val="single" w:sz="4" w:space="0" w:color="CCCCCC"/>
+            </w:tcBorders>
+            <w:shd w:val="clear" w:color="auto" w:fill="4361EE"/>
+            <w:tcMar>
+              <w:top w:w="70" w:type="dxa"/>
+              <w:left w:w="110" w:type="dxa"/>
+              <w:bottom w:w="70" w:type="dxa"/>
+              <w:right w:w="110" w:type="dxa"/>
+            </w:tcMar>
+            <w:vAlign w:val="center"/>
+          </w:tcPr>
+          <w:p>
+            <w:pPr>
+              <w:spacing w:after="0"/>
+            </w:pPr>
+            <w:r>
+              <w:rPr>
+                <w:b/>
+                <w:color w:val="FFFFFF"/>
+                <w:sz w:val="20"/>
+              </w:rPr>
+              <w:t xml:space="preserve">Typical target IRR</w:t>
+            </w:r>
+          </w:p>
+        </w:tc>
+        <w:tc>
+          <w:tcPr>
+            <w:tcW w:w="3120" w:type="dxa"/>
+            <w:tcBorders>
+              <w:top w:val="single" w:sz="4" w:space="0" w:color="CCCCCC"/>
+              <w:left w:val="single" w:sz="4" w:space="0" w:color="CCCCCC"/>
+              <w:bottom w:val="single" w:sz="4" w:space="0" w:color="CCCCCC"/>
+              <w:right w:val="single" w:sz="4" w:space="0" w:color="CCCCCC"/>
+            </w:tcBorders>
+            <w:shd w:val="clear" w:color="auto" w:fill="4361EE"/>
+            <w:tcMar>
+              <w:top w:w="70" w:type="dxa"/>
+              <w:left w:w="110" w:type="dxa"/>
+              <w:bottom w:w="70" w:type="dxa"/>
+              <w:right w:w="110" w:type="dxa"/>
+            </w:tcMar>
+            <w:vAlign w:val="center"/>
+          </w:tcPr>
+          <w:p>
+            <w:pPr>
+              <w:spacing w:after="0"/>
+            </w:pPr>
+            <w:r>
+              <w:rPr>
+                <w:b/>
+                <w:color w:val="FFFFFF"/>
+                <w:sz w:val="20"/>
+              </w:rPr>
+              <w:t xml:space="preserve">App preset</w:t>
+            </w:r>
+          </w:p>
+        </w:tc>
+      </w:tr>
+      <w:tr>
+        <w:tc>
+          <w:tcPr>
+            <w:tcW w:w="3120" w:type="dxa"/>
+            <w:tcBorders>
+              <w:top w:val="single" w:sz="4" w:space="0" w:color="CCCCCC"/>
+              <w:left w:val="single" w:sz="4" w:space="0" w:color="CCCCCC"/>
+              <w:bottom w:val="single" w:sz="4" w:space="0" w:color="CCCCCC"/>
+              <w:right w:val="single" w:sz="4" w:space="0" w:color="CCCCCC"/>
+            </w:tcBorders>
+            <w:shd w:val="clear" w:color="auto" w:fill="F7F9FF"/>
+            <w:tcMar>
+              <w:top w:w="70" w:type="dxa"/>
+              <w:left w:w="110" w:type="dxa"/>
+              <w:bottom w:w="70" w:type="dxa"/>
+              <w:right w:w="110" w:type="dxa"/>
+            </w:tcMar>
+            <w:vAlign w:val="center"/>
+          </w:tcPr>
+          <w:p>
+            <w:pPr>
+              <w:spacing w:after="0"/>
+            </w:pPr>
+            <w:r>
+              <w:rPr>
+                <w:b w:val="0"/>
+                <w:color w:val="1E293B"/>
+                <w:sz w:val="19"/>
+              </w:rPr>
+              <w:t xml:space="preserve">Seed / angel</w:t>
+            </w:r>
+          </w:p>
+        </w:tc>
+        <w:tc>
+          <w:tcPr>
+            <w:tcW w:w="3120" w:type="dxa"/>
+            <w:tcBorders>
+              <w:top w:val="single" w:sz="4" w:space="0" w:color="CCCCCC"/>
+              <w:left w:val="single" w:sz="4" w:space="0" w:color="CCCCCC"/>
+              <w:bottom w:val="single" w:sz="4" w:space="0" w:color="CCCCCC"/>
+              <w:right w:val="single" w:sz="4" w:space="0" w:color="CCCCCC"/>
+            </w:tcBorders>
+            <w:shd w:val="clear" w:color="auto" w:fill="F7F9FF"/>
+            <w:tcMar>
+              <w:top w:w="70" w:type="dxa"/>
+              <w:left w:w="110" w:type="dxa"/>
+              <w:bottom w:w="70" w:type="dxa"/>
+              <w:right w:w="110" w:type="dxa"/>
+            </w:tcMar>
+            <w:vAlign w:val="center"/>
+          </w:tcPr>
+          <w:p>
+            <w:pPr>
+              <w:spacing w:after="0"/>
+            </w:pPr>
+            <w:r>
+              <w:rPr>
+                <w:b w:val="0"/>
+                <w:color w:val="1E293B"/>
+                <w:sz w:val="19"/>
+              </w:rPr>
+              <w:t xml:space="preserve">50–70%</w:t>
+            </w:r>
+          </w:p>
+        </w:tc>
+        <w:tc>
+          <w:tcPr>
+            <w:tcW w:w="3120" w:type="dxa"/>
+            <w:tcBorders>
+              <w:top w:val="single" w:sz="4" w:space="0" w:color="CCCCCC"/>
+              <w:left w:val="single" w:sz="4" w:space="0" w:color="CCCCCC"/>
+              <w:bottom w:val="single" w:sz="4" w:space="0" w:color="CCCCCC"/>
+              <w:right w:val="single" w:sz="4" w:space="0" w:color="CCCCCC"/>
+            </w:tcBorders>
+            <w:shd w:val="clear" w:color="auto" w:fill="F7F9FF"/>
+            <w:tcMar>
+              <w:top w:w="70" w:type="dxa"/>
+              <w:left w:w="110" w:type="dxa"/>
+              <w:bottom w:w="70" w:type="dxa"/>
+              <w:right w:w="110" w:type="dxa"/>
+            </w:tcMar>
+            <w:vAlign w:val="center"/>
+          </w:tcPr>
+          <w:p>
+            <w:pPr>
+              <w:spacing w:after="0"/>
+            </w:pPr>
+            <w:r>
+              <w:rPr>
+                <w:b w:val="0"/>
+                <w:color w:val="1E293B"/>
+                <w:sz w:val="19"/>
+              </w:rPr>
+              <w:t xml:space="preserve">60%</w:t>
+            </w:r>
+          </w:p>
+        </w:tc>
+      </w:tr>
+      <w:tr>
+        <w:tc>
+          <w:tcPr>
+            <w:tcW w:w="3120" w:type="dxa"/>
+            <w:tcBorders>
+              <w:top w:val="single" w:sz="4" w:space="0" w:color="CCCCCC"/>
+              <w:left w:val="single" w:sz="4" w:space="0" w:color="CCCCCC"/>
+              <w:bottom w:val="single" w:sz="4" w:space="0" w:color="CCCCCC"/>
+              <w:right w:val="single" w:sz="4" w:space="0" w:color="CCCCCC"/>
+            </w:tcBorders>
+            <w:tcMar>
+              <w:top w:w="70" w:type="dxa"/>
+              <w:left w:w="110" w:type="dxa"/>
+              <w:bottom w:w="70" w:type="dxa"/>
+              <w:right w:w="110" w:type="dxa"/>
+            </w:tcMar>
+            <w:vAlign w:val="center"/>
+          </w:tcPr>
+          <w:p>
+            <w:pPr>
+              <w:spacing w:after="0"/>
+            </w:pPr>
+            <w:r>
+              <w:rPr>
+                <w:b w:val="0"/>
+                <w:color w:val="1E293B"/>
+                <w:sz w:val="19"/>
+              </w:rPr>
+              <w:t xml:space="preserve">Series A</w:t>
+            </w:r>
+          </w:p>
+        </w:tc>
+        <w:tc>
+          <w:tcPr>
+            <w:tcW w:w="3120" w:type="dxa"/>
+            <w:tcBorders>
+              <w:top w:val="single" w:sz="4" w:space="0" w:color="CCCCCC"/>
+              <w:left w:val="single" w:sz="4" w:space="0" w:color="CCCCCC"/>
+              <w:bottom w:val="single" w:sz="4" w:space="0" w:color="CCCCCC"/>
+              <w:right w:val="single" w:sz="4" w:space="0" w:color="CCCCCC"/>
+            </w:tcBorders>
+            <w:tcMar>
+              <w:top w:w="70" w:type="dxa"/>
+              <w:left w:w="110" w:type="dxa"/>
+              <w:bottom w:w="70" w:type="dxa"/>
+              <w:right w:w="110" w:type="dxa"/>
+            </w:tcMar>
+            <w:vAlign w:val="center"/>
+          </w:tcPr>
+          <w:p>
+            <w:pPr>
+              <w:spacing w:after="0"/>
+            </w:pPr>
+            <w:r>
+              <w:rPr>
+                <w:b w:val="0"/>
+                <w:color w:val="1E293B"/>
+                <w:sz w:val="19"/>
+              </w:rPr>
+              <w:t xml:space="preserve">40–60%</w:t>
+            </w:r>
+          </w:p>
+        </w:tc>
+        <w:tc>
+          <w:tcPr>
+            <w:tcW w:w="3120" w:type="dxa"/>
+            <w:tcBorders>
+              <w:top w:val="single" w:sz="4" w:space="0" w:color="CCCCCC"/>
+              <w:left w:val="single" w:sz="4" w:space="0" w:color="CCCCCC"/>
+              <w:bottom w:val="single" w:sz="4" w:space="0" w:color="CCCCCC"/>
+              <w:right w:val="single" w:sz="4" w:space="0" w:color="CCCCCC"/>
+            </w:tcBorders>
+            <w:tcMar>
+              <w:top w:w="70" w:type="dxa"/>
+              <w:left w:w="110" w:type="dxa"/>
+              <w:bottom w:w="70" w:type="dxa"/>
+              <w:right w:w="110" w:type="dxa"/>
+            </w:tcMar>
+            <w:vAlign w:val="center"/>
+          </w:tcPr>
+          <w:p>
+            <w:pPr>
+              <w:spacing w:after="0"/>
+            </w:pPr>
+            <w:r>
+              <w:rPr>
+                <w:b w:val="0"/>
+                <w:color w:val="1E293B"/>
+                <w:sz w:val="19"/>
+              </w:rPr>
+              <w:t xml:space="preserve">50%</w:t>
+            </w:r>
+          </w:p>
+        </w:tc>
+      </w:tr>
+      <w:tr>
+        <w:tc>
+          <w:tcPr>
+            <w:tcW w:w="3120" w:type="dxa"/>
+            <w:tcBorders>
+              <w:top w:val="single" w:sz="4" w:space="0" w:color="CCCCCC"/>
+              <w:left w:val="single" w:sz="4" w:space="0" w:color="CCCCCC"/>
+              <w:bottom w:val="single" w:sz="4" w:space="0" w:color="CCCCCC"/>
+              <w:right w:val="single" w:sz="4" w:space="0" w:color="CCCCCC"/>
+            </w:tcBorders>
+            <w:shd w:val="clear" w:color="auto" w:fill="F7F9FF"/>
+            <w:tcMar>
+              <w:top w:w="70" w:type="dxa"/>
+              <w:left w:w="110" w:type="dxa"/>
+              <w:bottom w:w="70" w:type="dxa"/>
+              <w:right w:w="110" w:type="dxa"/>
+            </w:tcMar>
+            <w:vAlign w:val="center"/>
+          </w:tcPr>
+          <w:p>
+            <w:pPr>
+              <w:spacing w:after="0"/>
+            </w:pPr>
+            <w:r>
+              <w:rPr>
+                <w:b w:val="0"/>
+                <w:color w:val="1E293B"/>
+                <w:sz w:val="19"/>
+              </w:rPr>
+              <w:t xml:space="preserve">Series B / C</w:t>
+            </w:r>
+          </w:p>
+        </w:tc>
+        <w:tc>
+          <w:tcPr>
+            <w:tcW w:w="3120" w:type="dxa"/>
+            <w:tcBorders>
+              <w:top w:val="single" w:sz="4" w:space="0" w:color="CCCCCC"/>
+              <w:left w:val="single" w:sz="4" w:space="0" w:color="CCCCCC"/>
+              <w:bottom w:val="single" w:sz="4" w:space="0" w:color="CCCCCC"/>
+              <w:right w:val="single" w:sz="4" w:space="0" w:color="CCCCCC"/>
+            </w:tcBorders>
+            <w:shd w:val="clear" w:color="auto" w:fill="F7F9FF"/>
+            <w:tcMar>
+              <w:top w:w="70" w:type="dxa"/>
+              <w:left w:w="110" w:type="dxa"/>
+              <w:bottom w:w="70" w:type="dxa"/>
+              <w:right w:w="110" w:type="dxa"/>
+            </w:tcMar>
+            <w:vAlign w:val="center"/>
+          </w:tcPr>
+          <w:p>
+            <w:pPr>
+              <w:spacing w:after="0"/>
+            </w:pPr>
+            <w:r>
+              <w:rPr>
+                <w:b w:val="0"/>
+                <w:color w:val="1E293B"/>
+                <w:sz w:val="19"/>
+              </w:rPr>
+              <w:t xml:space="preserve">30–50%</w:t>
+            </w:r>
+          </w:p>
+        </w:tc>
+        <w:tc>
+          <w:tcPr>
+            <w:tcW w:w="3120" w:type="dxa"/>
+            <w:tcBorders>
+              <w:top w:val="single" w:sz="4" w:space="0" w:color="CCCCCC"/>
+              <w:left w:val="single" w:sz="4" w:space="0" w:color="CCCCCC"/>
+              <w:bottom w:val="single" w:sz="4" w:space="0" w:color="CCCCCC"/>
+              <w:right w:val="single" w:sz="4" w:space="0" w:color="CCCCCC"/>
+            </w:tcBorders>
+            <w:shd w:val="clear" w:color="auto" w:fill="F7F9FF"/>
+            <w:tcMar>
+              <w:top w:w="70" w:type="dxa"/>
+              <w:left w:w="110" w:type="dxa"/>
+              <w:bottom w:w="70" w:type="dxa"/>
+              <w:right w:w="110" w:type="dxa"/>
+            </w:tcMar>
+            <w:vAlign w:val="center"/>
+          </w:tcPr>
+          <w:p>
+            <w:pPr>
+              <w:spacing w:after="0"/>
+            </w:pPr>
+            <w:r>
+              <w:rPr>
+                <w:b w:val="0"/>
+                <w:color w:val="1E293B"/>
+                <w:sz w:val="19"/>
+              </w:rPr>
+              <w:t xml:space="preserve">40%</w:t>
+            </w:r>
+          </w:p>
+        </w:tc>
+      </w:tr>
+      <w:tr>
+        <w:tc>
+          <w:tcPr>
+            <w:tcW w:w="3120" w:type="dxa"/>
+            <w:tcBorders>
+              <w:top w:val="single" w:sz="4" w:space="0" w:color="CCCCCC"/>
+              <w:left w:val="single" w:sz="4" w:space="0" w:color="CCCCCC"/>
+              <w:bottom w:val="single" w:sz="4" w:space="0" w:color="CCCCCC"/>
+              <w:right w:val="single" w:sz="4" w:space="0" w:color="CCCCCC"/>
+            </w:tcBorders>
+            <w:tcMar>
+              <w:top w:w="70" w:type="dxa"/>
+              <w:left w:w="110" w:type="dxa"/>
+              <w:bottom w:w="70" w:type="dxa"/>
+              <w:right w:w="110" w:type="dxa"/>
+            </w:tcMar>
+            <w:vAlign w:val="center"/>
+          </w:tcPr>
+          <w:p>
+            <w:pPr>
+              <w:spacing w:after="0"/>
+            </w:pPr>
+            <w:r>
+              <w:rPr>
+                <w:b w:val="0"/>
+                <w:color w:val="1E293B"/>
+                <w:sz w:val="19"/>
+              </w:rPr>
+              <w:t xml:space="preserve">Growth / expansion</w:t>
+            </w:r>
+          </w:p>
+        </w:tc>
+        <w:tc>
+          <w:tcPr>
+            <w:tcW w:w="3120" w:type="dxa"/>
+            <w:tcBorders>
+              <w:top w:val="single" w:sz="4" w:space="0" w:color="CCCCCC"/>
+              <w:left w:val="single" w:sz="4" w:space="0" w:color="CCCCCC"/>
+              <w:bottom w:val="single" w:sz="4" w:space="0" w:color="CCCCCC"/>
+              <w:right w:val="single" w:sz="4" w:space="0" w:color="CCCCCC"/>
+            </w:tcBorders>
+            <w:tcMar>
+              <w:top w:w="70" w:type="dxa"/>
+              <w:left w:w="110" w:type="dxa"/>
+              <w:bottom w:w="70" w:type="dxa"/>
+              <w:right w:w="110" w:type="dxa"/>
+            </w:tcMar>
+            <w:vAlign w:val="center"/>
+          </w:tcPr>
+          <w:p>
+            <w:pPr>
+              <w:spacing w:after="0"/>
+            </w:pPr>
+            <w:r>
+              <w:rPr>
+                <w:b w:val="0"/>
+                <w:color w:val="1E293B"/>
+                <w:sz w:val="19"/>
+              </w:rPr>
+              <w:t xml:space="preserve">25–35%</w:t>
+            </w:r>
+          </w:p>
+        </w:tc>
+        <w:tc>
+          <w:tcPr>
+            <w:tcW w:w="3120" w:type="dxa"/>
+            <w:tcBorders>
+              <w:top w:val="single" w:sz="4" w:space="0" w:color="CCCCCC"/>
+              <w:left w:val="single" w:sz="4" w:space="0" w:color="CCCCCC"/>
+              <w:bottom w:val="single" w:sz="4" w:space="0" w:color="CCCCCC"/>
+              <w:right w:val="single" w:sz="4" w:space="0" w:color="CCCCCC"/>
+            </w:tcBorders>
+            <w:tcMar>
+              <w:top w:w="70" w:type="dxa"/>
+              <w:left w:w="110" w:type="dxa"/>
+              <w:bottom w:w="70" w:type="dxa"/>
+              <w:right w:w="110" w:type="dxa"/>
+            </w:tcMar>
+            <w:vAlign w:val="center"/>
+          </w:tcPr>
+          <w:p>
+            <w:pPr>
+              <w:spacing w:after="0"/>
+            </w:pPr>
+            <w:r>
+              <w:rPr>
+                <w:b w:val="0"/>
+                <w:color w:val="1E293B"/>
+                <w:sz w:val="19"/>
+              </w:rPr>
+              <w:t xml:space="preserve">30%</w:t>
+            </w:r>
+          </w:p>
+        </w:tc>
+      </w:tr>
+      <w:tr>
+        <w:tc>
+          <w:tcPr>
+            <w:tcW w:w="3120" w:type="dxa"/>
+            <w:tcBorders>
+              <w:top w:val="single" w:sz="4" w:space="0" w:color="CCCCCC"/>
+              <w:left w:val="single" w:sz="4" w:space="0" w:color="CCCCCC"/>
+              <w:bottom w:val="single" w:sz="4" w:space="0" w:color="CCCCCC"/>
+              <w:right w:val="single" w:sz="4" w:space="0" w:color="CCCCCC"/>
+            </w:tcBorders>
+            <w:shd w:val="clear" w:color="auto" w:fill="F7F9FF"/>
+            <w:tcMar>
+              <w:top w:w="70" w:type="dxa"/>
+              <w:left w:w="110" w:type="dxa"/>
+              <w:bottom w:w="70" w:type="dxa"/>
+              <w:right w:w="110" w:type="dxa"/>
+            </w:tcMar>
+            <w:vAlign w:val="center"/>
+          </w:tcPr>
+          <w:p>
+            <w:pPr>
+              <w:spacing w:after="0"/>
+            </w:pPr>
+            <w:r>
+              <w:rPr>
+                <w:b w:val="0"/>
+                <w:color w:val="1E293B"/>
+                <w:sz w:val="19"/>
+              </w:rPr>
+              <w:t xml:space="preserve">Pre-IPO / late stage</w:t>
+            </w:r>
+          </w:p>
+        </w:tc>
+        <w:tc>
+          <w:tcPr>
+            <w:tcW w:w="3120" w:type="dxa"/>
+            <w:tcBorders>
+              <w:top w:val="single" w:sz="4" w:space="0" w:color="CCCCCC"/>
+              <w:left w:val="single" w:sz="4" w:space="0" w:color="CCCCCC"/>
+              <w:bottom w:val="single" w:sz="4" w:space="0" w:color="CCCCCC"/>
+              <w:right w:val="single" w:sz="4" w:space="0" w:color="CCCCCC"/>
+            </w:tcBorders>
+            <w:shd w:val="clear" w:color="auto" w:fill="F7F9FF"/>
+            <w:tcMar>
+              <w:top w:w="70" w:type="dxa"/>
+              <w:left w:w="110" w:type="dxa"/>
+              <w:bottom w:w="70" w:type="dxa"/>
+              <w:right w:w="110" w:type="dxa"/>
+            </w:tcMar>
+            <w:vAlign w:val="center"/>
+          </w:tcPr>
+          <w:p>
+            <w:pPr>
+              <w:spacing w:after="0"/>
+            </w:pPr>
+            <w:r>
+              <w:rPr>
+                <w:b w:val="0"/>
+                <w:color w:val="1E293B"/>
+                <w:sz w:val="19"/>
+              </w:rPr>
+              <w:t xml:space="preserve">20–30%</w:t>
+            </w:r>
+          </w:p>
+        </w:tc>
+        <w:tc>
+          <w:tcPr>
+            <w:tcW w:w="3120" w:type="dxa"/>
+            <w:tcBorders>
+              <w:top w:val="single" w:sz="4" w:space="0" w:color="CCCCCC"/>
+              <w:left w:val="single" w:sz="4" w:space="0" w:color="CCCCCC"/>
+              <w:bottom w:val="single" w:sz="4" w:space="0" w:color="CCCCCC"/>
+              <w:right w:val="single" w:sz="4" w:space="0" w:color="CCCCCC"/>
+            </w:tcBorders>
+            <w:shd w:val="clear" w:color="auto" w:fill="F7F9FF"/>
+            <w:tcMar>
+              <w:top w:w="70" w:type="dxa"/>
+              <w:left w:w="110" w:type="dxa"/>
+              <w:bottom w:w="70" w:type="dxa"/>
+              <w:right w:w="110" w:type="dxa"/>
+            </w:tcMar>
+            <w:vAlign w:val="center"/>
+          </w:tcPr>
+          <w:p>
+            <w:pPr>
+              <w:spacing w:after="0"/>
+            </w:pPr>
+            <w:r>
+              <w:rPr>
+                <w:b w:val="0"/>
+                <w:color w:val="1E293B"/>
+                <w:sz w:val="19"/>
+              </w:rPr>
+              <w:t xml:space="preserve">25%</w:t>
+            </w:r>
+          </w:p>
+        </w:tc>
+      </w:tr>
+    </w:tbl>
+    <w:p>
+      <w:pPr>
+        <w:spacing w:after="60"/>
+      </w:pPr>
+    </w:p>
+    <w:p>
+      <w:pPr>
+        <w:spacing w:after="120" w:before="0" w:line="276" w:lineRule="auto"/>
+      </w:pPr>
+      <w:r>
+        <w:rPr>
+          <w:b/>
+          <w:i w:val="0"/>
+          <w:color w:val="1E293B"/>
+          <w:sz w:val="21"/>
+        </w:rPr>
+        <w:t xml:space="preserve">Worked example</w:t>
+      </w:r>
+      <w:r>
+        <w:rPr>
+          <w:b w:val="0"/>
+          <w:i w:val="0"/>
+          <w:color w:val="1E293B"/>
+          <w:sz w:val="21"/>
+        </w:rPr>
+        <w:t xml:space="preserve"> — Vipin Corporation: ₹300 Cr investment, 5-year hold to FY29E, exit at 18× P/E, 25% target IRR, 10% expected dilution from later rounds/ESOPs:</w:t>
+      </w:r>
+    </w:p>
+    <w:tbl>
+      <w:tblPr>
+        <w:tblW w:w="9360" w:type="dxa"/>
+        <w:jc w:val="center"/>
+        <w:tblLayout w:type="fixed"/>
+        <w:tblLook w:firstColumn="1" w:firstRow="1" w:lastColumn="0" w:lastRow="0" w:noHBand="0" w:noVBand="1" w:val="04A0"/>
+      </w:tblPr>
+      <w:tblGrid>
+        <w:gridCol w:w="6240"/>
+        <w:gridCol w:w="3120"/>
+      </w:tblGrid>
+      <w:tr>
+        <w:tc>
+          <w:tcPr>
+            <w:tcW w:w="6240" w:type="dxa"/>
+            <w:tcBorders>
+              <w:top w:val="single" w:sz="4" w:space="0" w:color="CCCCCC"/>
+              <w:left w:val="single" w:sz="4" w:space="0" w:color="CCCCCC"/>
+              <w:bottom w:val="single" w:sz="4" w:space="0" w:color="CCCCCC"/>
+              <w:right w:val="single" w:sz="4" w:space="0" w:color="CCCCCC"/>
+            </w:tcBorders>
+            <w:shd w:val="clear" w:color="auto" w:fill="4361EE"/>
+            <w:tcMar>
+              <w:top w:w="70" w:type="dxa"/>
+              <w:left w:w="110" w:type="dxa"/>
+              <w:bottom w:w="70" w:type="dxa"/>
+              <w:right w:w="110" w:type="dxa"/>
+            </w:tcMar>
+            <w:vAlign w:val="center"/>
+          </w:tcPr>
+          <w:p>
+            <w:pPr>
+              <w:spacing w:after="0"/>
+            </w:pPr>
+            <w:r>
+              <w:rPr>
+                <w:b/>
+                <w:color w:val="FFFFFF"/>
+                <w:sz w:val="20"/>
+              </w:rPr>
+              <w:t xml:space="preserve">Step</w:t>
+            </w:r>
+          </w:p>
+        </w:tc>
+        <w:tc>
+          <w:tcPr>
+            <w:tcW w:w="3120" w:type="dxa"/>
+            <w:tcBorders>
+              <w:top w:val="single" w:sz="4" w:space="0" w:color="CCCCCC"/>
+              <w:left w:val="single" w:sz="4" w:space="0" w:color="CCCCCC"/>
+              <w:bottom w:val="single" w:sz="4" w:space="0" w:color="CCCCCC"/>
+              <w:right w:val="single" w:sz="4" w:space="0" w:color="CCCCCC"/>
+            </w:tcBorders>
+            <w:shd w:val="clear" w:color="auto" w:fill="4361EE"/>
+            <w:tcMar>
+              <w:top w:w="70" w:type="dxa"/>
+              <w:left w:w="110" w:type="dxa"/>
+              <w:bottom w:w="70" w:type="dxa"/>
+              <w:right w:w="110" w:type="dxa"/>
+            </w:tcMar>
+            <w:vAlign w:val="center"/>
+          </w:tcPr>
+          <w:p>
+            <w:pPr>
+              <w:spacing w:after="0"/>
+            </w:pPr>
+            <w:r>
+              <w:rPr>
+                <w:b/>
+                <w:color w:val="FFFFFF"/>
+                <w:sz w:val="20"/>
+              </w:rPr>
+              <w:t xml:space="preserve">Value</w:t>
+            </w:r>
+          </w:p>
+        </w:tc>
+      </w:tr>
+      <w:tr>
+        <w:tc>
+          <w:tcPr>
+            <w:tcW w:w="6240" w:type="dxa"/>
+            <w:tcBorders>
+              <w:top w:val="single" w:sz="4" w:space="0" w:color="CCCCCC"/>
+              <w:left w:val="single" w:sz="4" w:space="0" w:color="CCCCCC"/>
+              <w:bottom w:val="single" w:sz="4" w:space="0" w:color="CCCCCC"/>
+              <w:right w:val="single" w:sz="4" w:space="0" w:color="CCCCCC"/>
+            </w:tcBorders>
+            <w:shd w:val="clear" w:color="auto" w:fill="F7F9FF"/>
+            <w:tcMar>
+              <w:top w:w="70" w:type="dxa"/>
+              <w:left w:w="110" w:type="dxa"/>
+              <w:bottom w:w="70" w:type="dxa"/>
+              <w:right w:w="110" w:type="dxa"/>
+            </w:tcMar>
+            <w:vAlign w:val="center"/>
+          </w:tcPr>
+          <w:p>
+            <w:pPr>
+              <w:spacing w:after="0"/>
+            </w:pPr>
+            <w:r>
+              <w:rPr>
+                <w:b w:val="0"/>
+                <w:color w:val="1E293B"/>
+                <w:sz w:val="19"/>
+              </w:rPr>
+              <w:t xml:space="preserve">FY29E PAT (from the forecast)</w:t>
+            </w:r>
+          </w:p>
+        </w:tc>
+        <w:tc>
+          <w:tcPr>
+            <w:tcW w:w="3120" w:type="dxa"/>
+            <w:tcBorders>
+              <w:top w:val="single" w:sz="4" w:space="0" w:color="CCCCCC"/>
+              <w:left w:val="single" w:sz="4" w:space="0" w:color="CCCCCC"/>
+              <w:bottom w:val="single" w:sz="4" w:space="0" w:color="CCCCCC"/>
+              <w:right w:val="single" w:sz="4" w:space="0" w:color="CCCCCC"/>
+            </w:tcBorders>
+            <w:shd w:val="clear" w:color="auto" w:fill="F7F9FF"/>
+            <w:tcMar>
+              <w:top w:w="70" w:type="dxa"/>
+              <w:left w:w="110" w:type="dxa"/>
+              <w:bottom w:w="70" w:type="dxa"/>
+              <w:right w:w="110" w:type="dxa"/>
+            </w:tcMar>
+            <w:vAlign w:val="center"/>
+          </w:tcPr>
+          <w:p>
+            <w:pPr>
+              <w:spacing w:after="0"/>
+            </w:pPr>
+            <w:r>
+              <w:rPr>
+                <w:b w:val="0"/>
+                <w:color w:val="1E293B"/>
+                <w:sz w:val="19"/>
+              </w:rPr>
+              <w:t xml:space="preserve">₹ 327 Cr</w:t>
+            </w:r>
+          </w:p>
+        </w:tc>
+      </w:tr>
+      <w:tr>
+        <w:tc>
+          <w:tcPr>
+            <w:tcW w:w="6240" w:type="dxa"/>
+            <w:tcBorders>
+              <w:top w:val="single" w:sz="4" w:space="0" w:color="CCCCCC"/>
+              <w:left w:val="single" w:sz="4" w:space="0" w:color="CCCCCC"/>
+              <w:bottom w:val="single" w:sz="4" w:space="0" w:color="CCCCCC"/>
+              <w:right w:val="single" w:sz="4" w:space="0" w:color="CCCCCC"/>
+            </w:tcBorders>
+            <w:tcMar>
+              <w:top w:w="70" w:type="dxa"/>
+              <w:left w:w="110" w:type="dxa"/>
+              <w:bottom w:w="70" w:type="dxa"/>
+              <w:right w:w="110" w:type="dxa"/>
+            </w:tcMar>
+            <w:vAlign w:val="center"/>
+          </w:tcPr>
+          <w:p>
+            <w:pPr>
+              <w:spacing w:after="0"/>
+            </w:pPr>
+            <w:r>
+              <w:rPr>
+                <w:b w:val="0"/>
+                <w:color w:val="1E293B"/>
+                <w:sz w:val="19"/>
+              </w:rPr>
+              <w:t xml:space="preserve">× Exit P/E 18× = Exit equity value</w:t>
+            </w:r>
+          </w:p>
+        </w:tc>
+        <w:tc>
+          <w:tcPr>
+            <w:tcW w:w="3120" w:type="dxa"/>
+            <w:tcBorders>
+              <w:top w:val="single" w:sz="4" w:space="0" w:color="CCCCCC"/>
+              <w:left w:val="single" w:sz="4" w:space="0" w:color="CCCCCC"/>
+              <w:bottom w:val="single" w:sz="4" w:space="0" w:color="CCCCCC"/>
+              <w:right w:val="single" w:sz="4" w:space="0" w:color="CCCCCC"/>
+            </w:tcBorders>
+            <w:tcMar>
+              <w:top w:w="70" w:type="dxa"/>
+              <w:left w:w="110" w:type="dxa"/>
+              <w:bottom w:w="70" w:type="dxa"/>
+              <w:right w:w="110" w:type="dxa"/>
+            </w:tcMar>
+            <w:vAlign w:val="center"/>
+          </w:tcPr>
+          <w:p>
+            <w:pPr>
+              <w:spacing w:after="0"/>
+            </w:pPr>
+            <w:r>
+              <w:rPr>
+                <w:b w:val="0"/>
+                <w:color w:val="1E293B"/>
+                <w:sz w:val="19"/>
+              </w:rPr>
+              <w:t xml:space="preserve">₹ 5,893 Cr</w:t>
+            </w:r>
+          </w:p>
+        </w:tc>
+      </w:tr>
+      <w:tr>
+        <w:tc>
+          <w:tcPr>
+            <w:tcW w:w="6240" w:type="dxa"/>
+            <w:tcBorders>
+              <w:top w:val="single" w:sz="4" w:space="0" w:color="CCCCCC"/>
+              <w:left w:val="single" w:sz="4" w:space="0" w:color="CCCCCC"/>
+              <w:bottom w:val="single" w:sz="4" w:space="0" w:color="CCCCCC"/>
+              <w:right w:val="single" w:sz="4" w:space="0" w:color="CCCCCC"/>
+            </w:tcBorders>
+            <w:shd w:val="clear" w:color="auto" w:fill="F7F9FF"/>
+            <w:tcMar>
+              <w:top w:w="70" w:type="dxa"/>
+              <w:left w:w="110" w:type="dxa"/>
+              <w:bottom w:w="70" w:type="dxa"/>
+              <w:right w:w="110" w:type="dxa"/>
+            </w:tcMar>
+            <w:vAlign w:val="center"/>
+          </w:tcPr>
+          <w:p>
+            <w:pPr>
+              <w:spacing w:after="0"/>
+            </w:pPr>
+            <w:r>
+              <w:rPr>
+                <w:b w:val="0"/>
+                <w:color w:val="1E293B"/>
+                <w:sz w:val="19"/>
+              </w:rPr>
+              <w:t xml:space="preserve">÷ (1.25)⁵ = 3.05× required money multiple</w:t>
+            </w:r>
+          </w:p>
+        </w:tc>
+        <w:tc>
+          <w:tcPr>
+            <w:tcW w:w="3120" w:type="dxa"/>
+            <w:tcBorders>
+              <w:top w:val="single" w:sz="4" w:space="0" w:color="CCCCCC"/>
+              <w:left w:val="single" w:sz="4" w:space="0" w:color="CCCCCC"/>
+              <w:bottom w:val="single" w:sz="4" w:space="0" w:color="CCCCCC"/>
+              <w:right w:val="single" w:sz="4" w:space="0" w:color="CCCCCC"/>
+            </w:tcBorders>
+            <w:shd w:val="clear" w:color="auto" w:fill="F7F9FF"/>
+            <w:tcMar>
+              <w:top w:w="70" w:type="dxa"/>
+              <w:left w:w="110" w:type="dxa"/>
+              <w:bottom w:w="70" w:type="dxa"/>
+              <w:right w:w="110" w:type="dxa"/>
+            </w:tcMar>
+            <w:vAlign w:val="center"/>
+          </w:tcPr>
+          <w:p>
+            <w:pPr>
+              <w:spacing w:after="0"/>
+            </w:pPr>
+            <w:r>
+              <w:rPr>
+                <w:b w:val="0"/>
+                <w:color w:val="1E293B"/>
+                <w:sz w:val="19"/>
+              </w:rPr>
+              <w:t xml:space="preserve">₹ 1,931 Cr post-money (no dilution)</w:t>
+            </w:r>
+          </w:p>
+        </w:tc>
+      </w:tr>
+      <w:tr>
+        <w:tc>
+          <w:tcPr>
+            <w:tcW w:w="6240" w:type="dxa"/>
+            <w:tcBorders>
+              <w:top w:val="single" w:sz="4" w:space="0" w:color="CCCCCC"/>
+              <w:left w:val="single" w:sz="4" w:space="0" w:color="CCCCCC"/>
+              <w:bottom w:val="single" w:sz="4" w:space="0" w:color="CCCCCC"/>
+              <w:right w:val="single" w:sz="4" w:space="0" w:color="CCCCCC"/>
+            </w:tcBorders>
+            <w:tcMar>
+              <w:top w:w="70" w:type="dxa"/>
+              <w:left w:w="110" w:type="dxa"/>
+              <w:bottom w:w="70" w:type="dxa"/>
+              <w:right w:w="110" w:type="dxa"/>
+            </w:tcMar>
+            <w:vAlign w:val="center"/>
+          </w:tcPr>
+          <w:p>
+            <w:pPr>
+              <w:spacing w:after="0"/>
+            </w:pPr>
+            <w:r>
+              <w:rPr>
+                <w:b w:val="0"/>
+                <w:color w:val="1E293B"/>
+                <w:sz w:val="19"/>
+              </w:rPr>
+              <w:t xml:space="preserve">Required stake at exit = 300 × 3.05 ÷ 5,893</w:t>
+            </w:r>
+          </w:p>
+        </w:tc>
+        <w:tc>
+          <w:tcPr>
+            <w:tcW w:w="3120" w:type="dxa"/>
+            <w:tcBorders>
+              <w:top w:val="single" w:sz="4" w:space="0" w:color="CCCCCC"/>
+              <w:left w:val="single" w:sz="4" w:space="0" w:color="CCCCCC"/>
+              <w:bottom w:val="single" w:sz="4" w:space="0" w:color="CCCCCC"/>
+              <w:right w:val="single" w:sz="4" w:space="0" w:color="CCCCCC"/>
+            </w:tcBorders>
+            <w:tcMar>
+              <w:top w:w="70" w:type="dxa"/>
+              <w:left w:w="110" w:type="dxa"/>
+              <w:bottom w:w="70" w:type="dxa"/>
+              <w:right w:w="110" w:type="dxa"/>
+            </w:tcMar>
+            <w:vAlign w:val="center"/>
+          </w:tcPr>
+          <w:p>
+            <w:pPr>
+              <w:spacing w:after="0"/>
+            </w:pPr>
+            <w:r>
+              <w:rPr>
+                <w:b w:val="0"/>
+                <w:color w:val="1E293B"/>
+                <w:sz w:val="19"/>
+              </w:rPr>
+              <w:t xml:space="preserve">15.5%</w:t>
+            </w:r>
+          </w:p>
+        </w:tc>
+      </w:tr>
+      <w:tr>
+        <w:tc>
+          <w:tcPr>
+            <w:tcW w:w="6240" w:type="dxa"/>
+            <w:tcBorders>
+              <w:top w:val="single" w:sz="4" w:space="0" w:color="CCCCCC"/>
+              <w:left w:val="single" w:sz="4" w:space="0" w:color="CCCCCC"/>
+              <w:bottom w:val="single" w:sz="4" w:space="0" w:color="CCCCCC"/>
+              <w:right w:val="single" w:sz="4" w:space="0" w:color="CCCCCC"/>
+            </w:tcBorders>
+            <w:shd w:val="clear" w:color="auto" w:fill="F7F9FF"/>
+            <w:tcMar>
+              <w:top w:w="70" w:type="dxa"/>
+              <w:left w:w="110" w:type="dxa"/>
+              <w:bottom w:w="70" w:type="dxa"/>
+              <w:right w:w="110" w:type="dxa"/>
+            </w:tcMar>
+            <w:vAlign w:val="center"/>
+          </w:tcPr>
+          <w:p>
+            <w:pPr>
+              <w:spacing w:after="0"/>
+            </w:pPr>
+            <w:r>
+              <w:rPr>
+                <w:b w:val="0"/>
+                <w:color w:val="1E293B"/>
+                <w:sz w:val="19"/>
+              </w:rPr>
+              <w:t xml:space="preserve">÷ 90% retention = required stake today</w:t>
+            </w:r>
+          </w:p>
+        </w:tc>
+        <w:tc>
+          <w:tcPr>
+            <w:tcW w:w="3120" w:type="dxa"/>
+            <w:tcBorders>
+              <w:top w:val="single" w:sz="4" w:space="0" w:color="CCCCCC"/>
+              <w:left w:val="single" w:sz="4" w:space="0" w:color="CCCCCC"/>
+              <w:bottom w:val="single" w:sz="4" w:space="0" w:color="CCCCCC"/>
+              <w:right w:val="single" w:sz="4" w:space="0" w:color="CCCCCC"/>
+            </w:tcBorders>
+            <w:shd w:val="clear" w:color="auto" w:fill="F7F9FF"/>
+            <w:tcMar>
+              <w:top w:w="70" w:type="dxa"/>
+              <w:left w:w="110" w:type="dxa"/>
+              <w:bottom w:w="70" w:type="dxa"/>
+              <w:right w:w="110" w:type="dxa"/>
+            </w:tcMar>
+            <w:vAlign w:val="center"/>
+          </w:tcPr>
+          <w:p>
+            <w:pPr>
+              <w:spacing w:after="0"/>
+            </w:pPr>
+            <w:r>
+              <w:rPr>
+                <w:b w:val="0"/>
+                <w:color w:val="1E293B"/>
+                <w:sz w:val="19"/>
+              </w:rPr>
+              <w:t xml:space="preserve">17.3%</w:t>
+            </w:r>
+          </w:p>
+        </w:tc>
+      </w:tr>
+      <w:tr>
+        <w:tc>
+          <w:tcPr>
+            <w:tcW w:w="6240" w:type="dxa"/>
+            <w:tcBorders>
+              <w:top w:val="single" w:sz="4" w:space="0" w:color="CCCCCC"/>
+              <w:left w:val="single" w:sz="4" w:space="0" w:color="CCCCCC"/>
+              <w:bottom w:val="single" w:sz="4" w:space="0" w:color="CCCCCC"/>
+              <w:right w:val="single" w:sz="4" w:space="0" w:color="CCCCCC"/>
+            </w:tcBorders>
+            <w:tcMar>
+              <w:top w:w="70" w:type="dxa"/>
+              <w:left w:w="110" w:type="dxa"/>
+              <w:bottom w:w="70" w:type="dxa"/>
+              <w:right w:w="110" w:type="dxa"/>
+            </w:tcMar>
+            <w:vAlign w:val="center"/>
+          </w:tcPr>
+          <w:p>
+            <w:pPr>
+              <w:spacing w:after="0"/>
+            </w:pPr>
+            <w:r>
+              <w:rPr>
+                <w:b w:val="0"/>
+                <w:color w:val="1E293B"/>
+                <w:sz w:val="19"/>
+              </w:rPr>
+              <w:t xml:space="preserve">Post-money = 300 ÷ 17.3%</w:t>
+            </w:r>
+          </w:p>
+        </w:tc>
+        <w:tc>
+          <w:tcPr>
+            <w:tcW w:w="3120" w:type="dxa"/>
+            <w:tcBorders>
+              <w:top w:val="single" w:sz="4" w:space="0" w:color="CCCCCC"/>
+              <w:left w:val="single" w:sz="4" w:space="0" w:color="CCCCCC"/>
+              <w:bottom w:val="single" w:sz="4" w:space="0" w:color="CCCCCC"/>
+              <w:right w:val="single" w:sz="4" w:space="0" w:color="CCCCCC"/>
+            </w:tcBorders>
+            <w:tcMar>
+              <w:top w:w="70" w:type="dxa"/>
+              <w:left w:w="110" w:type="dxa"/>
+              <w:bottom w:w="70" w:type="dxa"/>
+              <w:right w:w="110" w:type="dxa"/>
+            </w:tcMar>
+            <w:vAlign w:val="center"/>
+          </w:tcPr>
+          <w:p>
+            <w:pPr>
+              <w:spacing w:after="0"/>
+            </w:pPr>
+            <w:r>
+              <w:rPr>
+                <w:b w:val="0"/>
+                <w:color w:val="1E293B"/>
+                <w:sz w:val="19"/>
+              </w:rPr>
+              <w:t xml:space="preserve">₹ 1,738 Cr</w:t>
+            </w:r>
+          </w:p>
+        </w:tc>
+      </w:tr>
+      <w:tr>
+        <w:tc>
+          <w:tcPr>
+            <w:tcW w:w="6240" w:type="dxa"/>
+            <w:tcBorders>
+              <w:top w:val="single" w:sz="4" w:space="0" w:color="CCCCCC"/>
+              <w:left w:val="single" w:sz="4" w:space="0" w:color="CCCCCC"/>
+              <w:bottom w:val="single" w:sz="4" w:space="0" w:color="CCCCCC"/>
+              <w:right w:val="single" w:sz="4" w:space="0" w:color="CCCCCC"/>
+            </w:tcBorders>
+            <w:shd w:val="clear" w:color="auto" w:fill="EEF2FF"/>
+            <w:tcMar>
+              <w:top w:w="70" w:type="dxa"/>
+              <w:left w:w="110" w:type="dxa"/>
+              <w:bottom w:w="70" w:type="dxa"/>
+              <w:right w:w="110" w:type="dxa"/>
+            </w:tcMar>
+            <w:vAlign w:val="center"/>
+          </w:tcPr>
+          <w:p>
+            <w:pPr>
+              <w:spacing w:after="0"/>
+            </w:pPr>
+            <w:r>
+              <w:rPr>
+                <w:b/>
+                <w:color w:val="1E293B"/>
+                <w:sz w:val="19"/>
+              </w:rPr>
+              <w:t xml:space="preserve">Pre-money = 1,738 − 300</w:t>
+            </w:r>
+          </w:p>
+        </w:tc>
+        <w:tc>
+          <w:tcPr>
+            <w:tcW w:w="3120" w:type="dxa"/>
+            <w:tcBorders>
+              <w:top w:val="single" w:sz="4" w:space="0" w:color="CCCCCC"/>
+              <w:left w:val="single" w:sz="4" w:space="0" w:color="CCCCCC"/>
+              <w:bottom w:val="single" w:sz="4" w:space="0" w:color="CCCCCC"/>
+              <w:right w:val="single" w:sz="4" w:space="0" w:color="CCCCCC"/>
+            </w:tcBorders>
+            <w:shd w:val="clear" w:color="auto" w:fill="EEF2FF"/>
+            <w:tcMar>
+              <w:top w:w="70" w:type="dxa"/>
+              <w:left w:w="110" w:type="dxa"/>
+              <w:bottom w:w="70" w:type="dxa"/>
+              <w:right w:w="110" w:type="dxa"/>
+            </w:tcMar>
+            <w:vAlign w:val="center"/>
+          </w:tcPr>
+          <w:p>
+            <w:pPr>
+              <w:spacing w:after="0"/>
+            </w:pPr>
+            <w:r>
+              <w:rPr>
+                <w:b/>
+                <w:color w:val="1E293B"/>
+                <w:sz w:val="19"/>
+              </w:rPr>
+              <w:t xml:space="preserve">₹ 1,438 Cr</w:t>
+            </w:r>
+          </w:p>
+        </w:tc>
+      </w:tr>
+      <w:tr>
+        <w:tc>
+          <w:tcPr>
+            <w:tcW w:w="6240" w:type="dxa"/>
+            <w:tcBorders>
+              <w:top w:val="single" w:sz="4" w:space="0" w:color="CCCCCC"/>
+              <w:left w:val="single" w:sz="4" w:space="0" w:color="CCCCCC"/>
+              <w:bottom w:val="single" w:sz="4" w:space="0" w:color="CCCCCC"/>
+              <w:right w:val="single" w:sz="4" w:space="0" w:color="CCCCCC"/>
+            </w:tcBorders>
+            <w:shd w:val="clear" w:color="auto" w:fill="EEF2FF"/>
+            <w:tcMar>
+              <w:top w:w="70" w:type="dxa"/>
+              <w:left w:w="110" w:type="dxa"/>
+              <w:bottom w:w="70" w:type="dxa"/>
+              <w:right w:w="110" w:type="dxa"/>
+            </w:tcMar>
+            <w:vAlign w:val="center"/>
+          </w:tcPr>
+          <w:p>
+            <w:pPr>
+              <w:spacing w:after="0"/>
+            </w:pPr>
+            <w:r>
+              <w:rPr>
+                <w:b/>
+                <w:color w:val="1E293B"/>
+                <w:sz w:val="19"/>
+              </w:rPr>
+              <w:t xml:space="preserve">÷ 10.3 Cr diluted shares = value per share</w:t>
+            </w:r>
+          </w:p>
+        </w:tc>
+        <w:tc>
+          <w:tcPr>
+            <w:tcW w:w="3120" w:type="dxa"/>
+            <w:tcBorders>
+              <w:top w:val="single" w:sz="4" w:space="0" w:color="CCCCCC"/>
+              <w:left w:val="single" w:sz="4" w:space="0" w:color="CCCCCC"/>
+              <w:bottom w:val="single" w:sz="4" w:space="0" w:color="CCCCCC"/>
+              <w:right w:val="single" w:sz="4" w:space="0" w:color="CCCCCC"/>
+            </w:tcBorders>
+            <w:shd w:val="clear" w:color="auto" w:fill="EEF2FF"/>
+            <w:tcMar>
+              <w:top w:w="70" w:type="dxa"/>
+              <w:left w:w="110" w:type="dxa"/>
+              <w:bottom w:w="70" w:type="dxa"/>
+              <w:right w:w="110" w:type="dxa"/>
+            </w:tcMar>
+            <w:vAlign w:val="center"/>
+          </w:tcPr>
+          <w:p>
+            <w:pPr>
+              <w:spacing w:after="0"/>
+            </w:pPr>
+            <w:r>
+              <w:rPr>
+                <w:b/>
+                <w:color w:val="1E293B"/>
+                <w:sz w:val="19"/>
+              </w:rPr>
+              <w:t xml:space="preserve">₹ 140</w:t>
+            </w:r>
+          </w:p>
+        </w:tc>
+      </w:tr>
+      <w:tr>
+        <w:tc>
+          <w:tcPr>
+            <w:tcW w:w="6240" w:type="dxa"/>
+            <w:tcBorders>
+              <w:top w:val="single" w:sz="4" w:space="0" w:color="CCCCCC"/>
+              <w:left w:val="single" w:sz="4" w:space="0" w:color="CCCCCC"/>
+              <w:bottom w:val="single" w:sz="4" w:space="0" w:color="CCCCCC"/>
+              <w:right w:val="single" w:sz="4" w:space="0" w:color="CCCCCC"/>
+            </w:tcBorders>
+            <w:shd w:val="clear" w:color="auto" w:fill="F7F9FF"/>
+            <w:tcMar>
+              <w:top w:w="70" w:type="dxa"/>
+              <w:left w:w="110" w:type="dxa"/>
+              <w:bottom w:w="70" w:type="dxa"/>
+              <w:right w:w="110" w:type="dxa"/>
+            </w:tcMar>
+            <w:vAlign w:val="center"/>
+          </w:tcPr>
+          <w:p>
+            <w:pPr>
+              <w:spacing w:after="0"/>
+            </w:pPr>
+            <w:r>
+              <w:rPr>
+                <w:b w:val="0"/>
+                <w:color w:val="1E293B"/>
+                <w:sz w:val="19"/>
+              </w:rPr>
+              <w:t xml:space="preserve">New shares issued (17.3% stake) at ₹140</w:t>
+            </w:r>
+          </w:p>
+        </w:tc>
+        <w:tc>
+          <w:tcPr>
+            <w:tcW w:w="3120" w:type="dxa"/>
+            <w:tcBorders>
+              <w:top w:val="single" w:sz="4" w:space="0" w:color="CCCCCC"/>
+              <w:left w:val="single" w:sz="4" w:space="0" w:color="CCCCCC"/>
+              <w:bottom w:val="single" w:sz="4" w:space="0" w:color="CCCCCC"/>
+              <w:right w:val="single" w:sz="4" w:space="0" w:color="CCCCCC"/>
+            </w:tcBorders>
+            <w:shd w:val="clear" w:color="auto" w:fill="F7F9FF"/>
+            <w:tcMar>
+              <w:top w:w="70" w:type="dxa"/>
+              <w:left w:w="110" w:type="dxa"/>
+              <w:bottom w:w="70" w:type="dxa"/>
+              <w:right w:w="110" w:type="dxa"/>
+            </w:tcMar>
+            <w:vAlign w:val="center"/>
+          </w:tcPr>
+          <w:p>
+            <w:pPr>
+              <w:spacing w:after="0"/>
+            </w:pPr>
+            <w:r>
+              <w:rPr>
+                <w:b w:val="0"/>
+                <w:color w:val="1E293B"/>
+                <w:sz w:val="19"/>
+              </w:rPr>
+              <w:t xml:space="preserve">2.15 Cr shares</w:t>
+            </w:r>
+          </w:p>
+        </w:tc>
+      </w:tr>
+    </w:tbl>
+    <w:p>
+      <w:pPr>
+        <w:spacing w:after="60"/>
+      </w:pPr>
+    </w:p>
+    <w:p>
+      <w:pPr>
+        <w:spacing w:after="120" w:before="0" w:line="276" w:lineRule="auto"/>
+      </w:pPr>
+      <w:r>
+        <w:rPr>
+          <w:b/>
+          <w:i w:val="0"/>
+          <w:color w:val="1E293B"/>
+          <w:sz w:val="21"/>
+        </w:rPr>
+        <w:t xml:space="preserve">Read-across for a listed company. </w:t>
+      </w:r>
+      <w:r>
+        <w:rPr>
+          <w:b w:val="0"/>
+          <w:i w:val="0"/>
+          <w:color w:val="1E293B"/>
+          <w:sz w:val="21"/>
+        </w:rPr>
+        <w:t xml:space="preserve">At ₹310 the market cap is about ₹3,193 Cr. Buying the whole company today and exiting at ₹5,893 Cr (after 10% dilution) earns an IRR of only about </w:t>
+      </w:r>
+      <w:r>
+        <w:rPr>
+          <w:b/>
+          <w:i w:val="0"/>
+          <w:color w:val="1E293B"/>
+          <w:sz w:val="21"/>
+        </w:rPr>
+        <w:t xml:space="preserve">10.7%</w:t>
+      </w:r>
+      <w:r>
+        <w:rPr>
+          <w:b w:val="0"/>
+          <w:i w:val="0"/>
+          <w:color w:val="1E293B"/>
+          <w:sz w:val="21"/>
+        </w:rPr>
+        <w:t xml:space="preserve"> — well below a 25% venture hurdle, but close to the 11.4% WACC. That is expected: public-market investors accept lower returns for liquidity and lower risk. For a mature listed stock, treat the VC method as a </w:t>
+      </w:r>
+      <w:r>
+        <w:rPr>
+          <w:b/>
+          <w:i w:val="0"/>
+          <w:color w:val="1E293B"/>
+          <w:sz w:val="21"/>
+        </w:rPr>
+        <w:t xml:space="preserve">lens on investor returns</w:t>
+      </w:r>
+      <w:r>
+        <w:rPr>
+          <w:b w:val="0"/>
+          <w:i w:val="0"/>
+          <w:color w:val="1E293B"/>
+          <w:sz w:val="21"/>
+        </w:rPr>
+        <w:t xml:space="preserve">, not as a fair-value estimate.</w:t>
+      </w:r>
+    </w:p>
+    <w:tbl>
+      <w:tblPr>
+        <w:tblW w:w="9360" w:type="dxa"/>
+        <w:jc w:val="center"/>
+        <w:tblLayout w:type="fixed"/>
+        <w:tblLook w:firstColumn="1" w:firstRow="1" w:lastColumn="0" w:lastRow="0" w:noHBand="0" w:noVBand="1" w:val="04A0"/>
+      </w:tblPr>
+      <w:tblGrid>
+        <w:gridCol w:w="9360"/>
+      </w:tblGrid>
+      <w:tr>
+        <w:tc>
+          <w:tcPr>
+            <w:tcW w:w="9360" w:type="dxa"/>
+            <w:tcBorders>
+              <w:top w:val="single" w:sz="4" w:space="0" w:color="E2E8F8"/>
+              <w:left w:val="single" w:sz="24" w:space="0" w:color="7209B7"/>
+              <w:bottom w:val="single" w:sz="4" w:space="0" w:color="E2E8F8"/>
+              <w:right w:val="single" w:sz="4" w:space="0" w:color="E2E8F8"/>
+            </w:tcBorders>
+            <w:shd w:val="clear" w:color="auto" w:fill="FBFBFE"/>
+            <w:tcMar>
+              <w:top w:w="120" w:type="dxa"/>
+              <w:left w:w="160" w:type="dxa"/>
+              <w:bottom w:w="120" w:type="dxa"/>
+              <w:right w:w="160" w:type="dxa"/>
+            </w:tcMar>
+          </w:tcPr>
+          <w:p>
+            <w:pPr>
+              <w:spacing w:after="60"/>
+            </w:pPr>
+            <w:r>
+              <w:rPr>
+                <w:b/>
+                <w:color w:val="7209B7"/>
+                <w:sz w:val="21"/>
+              </w:rPr>
+              <w:t>❖  VC method — strengths &amp; limitations</w:t>
+            </w:r>
+          </w:p>
+          <w:p>
+            <w:pPr>
+              <w:spacing w:after="40"/>
+            </w:pPr>
+            <w:r>
+              <w:rPr>
+                <w:b w:val="0"/>
+                <w:i w:val="0"/>
+                <w:color w:val="1E293B"/>
+                <w:sz w:val="20"/>
+              </w:rPr>
+              <w:t xml:space="preserve">Simple and transparent; works when there are no profits or positive cash flows today.</w:t>
+            </w:r>
+          </w:p>
+          <w:p>
+            <w:pPr>
+              <w:spacing w:after="40"/>
+            </w:pPr>
+            <w:r>
+              <w:rPr>
+                <w:b w:val="0"/>
+                <w:i w:val="0"/>
+                <w:color w:val="1E293B"/>
+                <w:sz w:val="20"/>
+              </w:rPr>
+              <w:t xml:space="preserve">Highly sensitive to the exit multiple and the IRR — always show an IRR × exit-multiple grid.</w:t>
+            </w:r>
+          </w:p>
+          <w:p>
+            <w:pPr>
+              <w:spacing w:after="40"/>
+            </w:pPr>
+            <w:r>
+              <w:rPr>
+                <w:b w:val="0"/>
+                <w:i w:val="0"/>
+                <w:color w:val="1E293B"/>
+                <w:sz w:val="20"/>
+              </w:rPr>
+              <w:t xml:space="preserve">Ignores interim cash flows and dividends; all risk is loaded into one hurdle rate instead of being modelled explicitly.</w:t>
+            </w:r>
+          </w:p>
+          <w:p>
+            <w:pPr>
+              <w:spacing w:after="40"/>
+            </w:pPr>
+            <w:r>
+              <w:rPr>
+                <w:b w:val="0"/>
+                <w:i w:val="0"/>
+                <w:color w:val="1E293B"/>
+                <w:sz w:val="20"/>
+              </w:rPr>
+              <w:t xml:space="preserve">In ValuMetrics: the VC Method tab computes all of the above, with stage presets, a peer-median multiple shortcut and IRR at CMP.</w:t>
+            </w:r>
+          </w:p>
+        </w:tc>
+      </w:tr>
+    </w:tbl>
+    <w:p>
+      <w:pPr>
+        <w:spacing w:after="60"/>
+      </w:pPr>
+    </w:p>
+    <w:p>
+      <w:pPr>
+        <w:pStyle w:val="Heading2"/>
+      </w:pPr>
+      <w:r>
+        <w:t>6.7  Choosing a method</w:t>
       </w:r>
     </w:p>
     <w:tbl>
@@ -11717,6 +13388,72 @@
                 <w:sz w:val="19"/>
               </w:rPr>
               <w:t>EV/Sales comps, scenario DCF</w:t>
+            </w:r>
+          </w:p>
+        </w:tc>
+      </w:tr>
+      <w:tr>
+        <w:tc>
+          <w:tcPr>
+            <w:tcW w:w="4360" w:type="dxa"/>
+            <w:tcBorders>
+              <w:top w:val="single" w:sz="4" w:space="0" w:color="CCCCCC"/>
+              <w:left w:val="single" w:sz="4" w:space="0" w:color="CCCCCC"/>
+              <w:bottom w:val="single" w:sz="4" w:space="0" w:color="CCCCCC"/>
+              <w:right w:val="single" w:sz="4" w:space="0" w:color="CCCCCC"/>
+            </w:tcBorders>
+            <w:shd w:val="clear" w:color="auto" w:fill="F7F9FF"/>
+            <w:tcMar>
+              <w:top w:w="70" w:type="dxa"/>
+              <w:left w:w="110" w:type="dxa"/>
+              <w:bottom w:w="70" w:type="dxa"/>
+              <w:right w:w="110" w:type="dxa"/>
+            </w:tcMar>
+            <w:vAlign w:val="center"/>
+          </w:tcPr>
+          <w:p>
+            <w:pPr>
+              <w:spacing w:after="0"/>
+            </w:pPr>
+            <w:r>
+              <w:rPr>
+                <w:b w:val="0"/>
+                <w:color w:val="1E293B"/>
+                <w:sz w:val="19"/>
+              </w:rPr>
+              <w:t xml:space="preserve">Start-up / VC-backed / pre-IPO</w:t>
+            </w:r>
+          </w:p>
+        </w:tc>
+        <w:tc>
+          <w:tcPr>
+            <w:tcW w:w="5000" w:type="dxa"/>
+            <w:tcBorders>
+              <w:top w:val="single" w:sz="4" w:space="0" w:color="CCCCCC"/>
+              <w:left w:val="single" w:sz="4" w:space="0" w:color="CCCCCC"/>
+              <w:bottom w:val="single" w:sz="4" w:space="0" w:color="CCCCCC"/>
+              <w:right w:val="single" w:sz="4" w:space="0" w:color="CCCCCC"/>
+            </w:tcBorders>
+            <w:shd w:val="clear" w:color="auto" w:fill="F7F9FF"/>
+            <w:tcMar>
+              <w:top w:w="70" w:type="dxa"/>
+              <w:left w:w="110" w:type="dxa"/>
+              <w:bottom w:w="70" w:type="dxa"/>
+              <w:right w:w="110" w:type="dxa"/>
+            </w:tcMar>
+            <w:vAlign w:val="center"/>
+          </w:tcPr>
+          <w:p>
+            <w:pPr>
+              <w:spacing w:after="0"/>
+            </w:pPr>
+            <w:r>
+              <w:rPr>
+                <w:b w:val="0"/>
+                <w:color w:val="1E293B"/>
+                <w:sz w:val="19"/>
+              </w:rPr>
+              <w:t xml:space="preserve">VC method + EV/Sales comps</w:t>
             </w:r>
           </w:p>
         </w:tc>
@@ -14855,7 +16592,7 @@
                 <w:color w:val="1E293B"/>
                 <w:sz w:val="19"/>
               </w:rPr>
-              <w:t>₹ 347</w:t>
+              <w:t>₹ 332</w:t>
             </w:r>
           </w:p>
         </w:tc>
@@ -14887,7 +16624,102 @@
                 <w:color w:val="1E293B"/>
                 <w:sz w:val="19"/>
               </w:rPr>
-              <w:t>Upside</w:t>
+              <w:t>Modest upside</w:t>
+            </w:r>
+          </w:p>
+        </w:tc>
+      </w:tr>
+      <w:tr>
+        <w:tc>
+          <w:tcPr>
+            <w:tcW w:w="3760" w:type="dxa"/>
+            <w:tcBorders>
+              <w:top w:val="single" w:sz="4" w:space="0" w:color="CCCCCC"/>
+              <w:left w:val="single" w:sz="4" w:space="0" w:color="CCCCCC"/>
+              <w:bottom w:val="single" w:sz="4" w:space="0" w:color="CCCCCC"/>
+              <w:right w:val="single" w:sz="4" w:space="0" w:color="CCCCCC"/>
+            </w:tcBorders>
+            <w:tcMar>
+              <w:top w:w="70" w:type="dxa"/>
+              <w:left w:w="110" w:type="dxa"/>
+              <w:bottom w:w="70" w:type="dxa"/>
+              <w:right w:w="110" w:type="dxa"/>
+            </w:tcMar>
+            <w:vAlign w:val="center"/>
+          </w:tcPr>
+          <w:p>
+            <w:pPr>
+              <w:spacing w:after="0"/>
+            </w:pPr>
+            <w:r>
+              <w:rPr>
+                <w:b w:val="0"/>
+                <w:color w:val="1E293B"/>
+                <w:sz w:val="19"/>
+              </w:rPr>
+              <w:t xml:space="preserve">VC method (18× P/E, 25% IRR)</w:t>
+            </w:r>
+          </w:p>
+        </w:tc>
+        <w:tc>
+          <w:tcPr>
+            <w:tcW w:w="3200" w:type="dxa"/>
+            <w:tcBorders>
+              <w:top w:val="single" w:sz="4" w:space="0" w:color="CCCCCC"/>
+              <w:left w:val="single" w:sz="4" w:space="0" w:color="CCCCCC"/>
+              <w:bottom w:val="single" w:sz="4" w:space="0" w:color="CCCCCC"/>
+              <w:right w:val="single" w:sz="4" w:space="0" w:color="CCCCCC"/>
+            </w:tcBorders>
+            <w:tcMar>
+              <w:top w:w="70" w:type="dxa"/>
+              <w:left w:w="110" w:type="dxa"/>
+              <w:bottom w:w="70" w:type="dxa"/>
+              <w:right w:w="110" w:type="dxa"/>
+            </w:tcMar>
+            <w:vAlign w:val="center"/>
+          </w:tcPr>
+          <w:p>
+            <w:pPr>
+              <w:spacing w:after="0"/>
+            </w:pPr>
+            <w:r>
+              <w:rPr>
+                <w:b w:val="0"/>
+                <w:color w:val="1E293B"/>
+                <w:sz w:val="19"/>
+              </w:rPr>
+              <w:t xml:space="preserve">₹ 140</w:t>
+            </w:r>
+          </w:p>
+        </w:tc>
+        <w:tc>
+          <w:tcPr>
+            <w:tcW w:w="2400" w:type="dxa"/>
+            <w:tcBorders>
+              <w:top w:val="single" w:sz="4" w:space="0" w:color="CCCCCC"/>
+              <w:left w:val="single" w:sz="4" w:space="0" w:color="CCCCCC"/>
+              <w:bottom w:val="single" w:sz="4" w:space="0" w:color="CCCCCC"/>
+              <w:right w:val="single" w:sz="4" w:space="0" w:color="CCCCCC"/>
+            </w:tcBorders>
+            <w:tcMar>
+              <w:top w:w="70" w:type="dxa"/>
+              <w:left w:w="110" w:type="dxa"/>
+              <w:bottom w:w="70" w:type="dxa"/>
+              <w:right w:w="110" w:type="dxa"/>
+            </w:tcMar>
+            <w:vAlign w:val="center"/>
+          </w:tcPr>
+          <w:p>
+            <w:pPr>
+              <w:spacing w:after="0"/>
+            </w:pPr>
+            <w:r>
+              <w:rPr>
+                <w:b w:val="0"/>
+                <w:color w:val="1E293B"/>
+                <w:sz w:val="19"/>
+              </w:rPr>
+              <w:t xml:space="preserve">IRR at CMP ≈ 10.7%</w:t>
             </w:r>
           </w:p>
         </w:tc>
@@ -16374,6 +18206,136 @@
                 <w:sz w:val="19"/>
               </w:rPr>
               <w:t>1.2A + 1.4B + 3.3C + 0.6D + 1.0E</w:t>
+            </w:r>
+          </w:p>
+        </w:tc>
+      </w:tr>
+      <w:tr>
+        <w:tc>
+          <w:tcPr>
+            <w:tcW w:w="3760" w:type="dxa"/>
+            <w:tcBorders>
+              <w:top w:val="single" w:sz="4" w:space="0" w:color="CCCCCC"/>
+              <w:left w:val="single" w:sz="4" w:space="0" w:color="CCCCCC"/>
+              <w:bottom w:val="single" w:sz="4" w:space="0" w:color="CCCCCC"/>
+              <w:right w:val="single" w:sz="4" w:space="0" w:color="CCCCCC"/>
+            </w:tcBorders>
+            <w:tcMar>
+              <w:top w:w="70" w:type="dxa"/>
+              <w:left w:w="110" w:type="dxa"/>
+              <w:bottom w:w="70" w:type="dxa"/>
+              <w:right w:w="110" w:type="dxa"/>
+            </w:tcMar>
+            <w:vAlign w:val="center"/>
+          </w:tcPr>
+          <w:p>
+            <w:pPr>
+              <w:spacing w:after="0"/>
+            </w:pPr>
+            <w:r>
+              <w:rPr>
+                <w:b w:val="0"/>
+                <w:color w:val="1E293B"/>
+                <w:sz w:val="19"/>
+              </w:rPr>
+              <w:t xml:space="preserve">VC post-money</w:t>
+            </w:r>
+          </w:p>
+        </w:tc>
+        <w:tc>
+          <w:tcPr>
+            <w:tcW w:w="5600" w:type="dxa"/>
+            <w:tcBorders>
+              <w:top w:val="single" w:sz="4" w:space="0" w:color="CCCCCC"/>
+              <w:left w:val="single" w:sz="4" w:space="0" w:color="CCCCCC"/>
+              <w:bottom w:val="single" w:sz="4" w:space="0" w:color="CCCCCC"/>
+              <w:right w:val="single" w:sz="4" w:space="0" w:color="CCCCCC"/>
+            </w:tcBorders>
+            <w:tcMar>
+              <w:top w:w="70" w:type="dxa"/>
+              <w:left w:w="110" w:type="dxa"/>
+              <w:bottom w:w="70" w:type="dxa"/>
+              <w:right w:w="110" w:type="dxa"/>
+            </w:tcMar>
+            <w:vAlign w:val="center"/>
+          </w:tcPr>
+          <w:p>
+            <w:pPr>
+              <w:spacing w:after="0"/>
+            </w:pPr>
+            <w:r>
+              <w:rPr>
+                <w:b w:val="0"/>
+                <w:color w:val="1E293B"/>
+                <w:sz w:val="19"/>
+              </w:rPr>
+              <w:t xml:space="preserve">Exit Equity ÷ (1 + target IRR)ⁿ</w:t>
+            </w:r>
+          </w:p>
+        </w:tc>
+      </w:tr>
+      <w:tr>
+        <w:tc>
+          <w:tcPr>
+            <w:tcW w:w="3760" w:type="dxa"/>
+            <w:tcBorders>
+              <w:top w:val="single" w:sz="4" w:space="0" w:color="CCCCCC"/>
+              <w:left w:val="single" w:sz="4" w:space="0" w:color="CCCCCC"/>
+              <w:bottom w:val="single" w:sz="4" w:space="0" w:color="CCCCCC"/>
+              <w:right w:val="single" w:sz="4" w:space="0" w:color="CCCCCC"/>
+            </w:tcBorders>
+            <w:shd w:val="clear" w:color="auto" w:fill="F7F9FF"/>
+            <w:tcMar>
+              <w:top w:w="70" w:type="dxa"/>
+              <w:left w:w="110" w:type="dxa"/>
+              <w:bottom w:w="70" w:type="dxa"/>
+              <w:right w:w="110" w:type="dxa"/>
+            </w:tcMar>
+            <w:vAlign w:val="center"/>
+          </w:tcPr>
+          <w:p>
+            <w:pPr>
+              <w:spacing w:after="0"/>
+            </w:pPr>
+            <w:r>
+              <w:rPr>
+                <w:b w:val="0"/>
+                <w:color w:val="1E293B"/>
+                <w:sz w:val="19"/>
+              </w:rPr>
+              <w:t xml:space="preserve">VC required stake</w:t>
+            </w:r>
+          </w:p>
+        </w:tc>
+        <w:tc>
+          <w:tcPr>
+            <w:tcW w:w="5600" w:type="dxa"/>
+            <w:tcBorders>
+              <w:top w:val="single" w:sz="4" w:space="0" w:color="CCCCCC"/>
+              <w:left w:val="single" w:sz="4" w:space="0" w:color="CCCCCC"/>
+              <w:bottom w:val="single" w:sz="4" w:space="0" w:color="CCCCCC"/>
+              <w:right w:val="single" w:sz="4" w:space="0" w:color="CCCCCC"/>
+            </w:tcBorders>
+            <w:shd w:val="clear" w:color="auto" w:fill="F7F9FF"/>
+            <w:tcMar>
+              <w:top w:w="70" w:type="dxa"/>
+              <w:left w:w="110" w:type="dxa"/>
+              <w:bottom w:w="70" w:type="dxa"/>
+              <w:right w:w="110" w:type="dxa"/>
+            </w:tcMar>
+            <w:vAlign w:val="center"/>
+          </w:tcPr>
+          <w:p>
+            <w:pPr>
+              <w:spacing w:after="0"/>
+            </w:pPr>
+            <w:r>
+              <w:rPr>
+                <w:b w:val="0"/>
+                <w:color w:val="1E293B"/>
+                <w:sz w:val="19"/>
+              </w:rPr>
+              <w:t xml:space="preserve">Investment × (1+IRR)ⁿ ÷ Exit Equity ÷ (1 − dilution)</w:t>
             </w:r>
           </w:p>
         </w:tc>

</xml_diff>

<commit_message>
Guide: add VC Method to the football field section (8.4)
- Table of football-field bars and how each low-high range is built,
  with the VC Method bar (target IRR +/-10pp x exit multiple +/-30%).
- How to read the VC bar, using the sample company's range
  (Rs 51-304, base Rs 140 vs Rs 310 price), plus an interpretation box.

Co-Authored-By: Claude Opus 5.5 <noreply@anthropic.com>
Claude-Session: https://claude.ai/code/session_018hY48TnvoyExCnuZKmZVFd
</commit_message>
<xml_diff>
--- a/Valuation_Deep_Dive_Guide.docx
+++ b/Valuation_Deep_Dive_Guide.docx
@@ -15910,6 +15910,874 @@
         <w:t>Plot the value range from every method on one chart, with the current price as a vertical line. Where the price sits relative to the methods is the punchline of the analysis.</w:t>
       </w:r>
     </w:p>
+    <w:p>
+      <w:pPr>
+        <w:spacing w:after="120" w:before="0" w:line="276" w:lineRule="auto"/>
+      </w:pPr>
+      <w:r>
+        <w:rPr>
+          <w:b w:val="0"/>
+          <w:i w:val="0"/>
+          <w:color w:val="1E293B"/>
+          <w:sz w:val="21"/>
+        </w:rPr>
+        <w:t xml:space="preserve">Each bar on the field is a </w:t>
+      </w:r>
+      <w:r>
+        <w:rPr>
+          <w:b/>
+          <w:i w:val="0"/>
+          <w:color w:val="1E293B"/>
+          <w:sz w:val="21"/>
+        </w:rPr>
+        <w:t xml:space="preserve">range</w:t>
+      </w:r>
+      <w:r>
+        <w:rPr>
+          <w:b w:val="0"/>
+          <w:i w:val="0"/>
+          <w:color w:val="1E293B"/>
+          <w:sz w:val="21"/>
+        </w:rPr>
+        <w:t xml:space="preserve">, not a point — built from the method’s own sensitivity so the width shows how much the answer depends on its key assumptions:</w:t>
+      </w:r>
+    </w:p>
+    <w:tbl>
+      <w:tblPr>
+        <w:tblW w:w="9360" w:type="dxa"/>
+        <w:jc w:val="center"/>
+        <w:tblLayout w:type="fixed"/>
+        <w:tblLook w:firstColumn="1" w:firstRow="1" w:lastColumn="0" w:lastRow="0" w:noHBand="0" w:noVBand="1" w:val="04A0"/>
+      </w:tblPr>
+      <w:tblGrid>
+        <w:gridCol w:w="2900"/>
+        <w:gridCol w:w="4060"/>
+        <w:gridCol w:w="2400"/>
+      </w:tblGrid>
+      <w:tr>
+        <w:tc>
+          <w:tcPr>
+            <w:tcW w:w="2900" w:type="dxa"/>
+            <w:tcBorders>
+              <w:top w:val="single" w:sz="4" w:space="0" w:color="CCCCCC"/>
+              <w:left w:val="single" w:sz="4" w:space="0" w:color="CCCCCC"/>
+              <w:bottom w:val="single" w:sz="4" w:space="0" w:color="CCCCCC"/>
+              <w:right w:val="single" w:sz="4" w:space="0" w:color="CCCCCC"/>
+            </w:tcBorders>
+            <w:shd w:val="clear" w:color="auto" w:fill="4361EE"/>
+            <w:tcMar>
+              <w:top w:w="70" w:type="dxa"/>
+              <w:left w:w="110" w:type="dxa"/>
+              <w:bottom w:w="70" w:type="dxa"/>
+              <w:right w:w="110" w:type="dxa"/>
+            </w:tcMar>
+            <w:vAlign w:val="center"/>
+          </w:tcPr>
+          <w:p>
+            <w:pPr>
+              <w:spacing w:after="0"/>
+            </w:pPr>
+            <w:r>
+              <w:rPr>
+                <w:b/>
+                <w:color w:val="FFFFFF"/>
+                <w:sz w:val="20"/>
+              </w:rPr>
+              <w:t xml:space="preserve">Bar</w:t>
+            </w:r>
+          </w:p>
+        </w:tc>
+        <w:tc>
+          <w:tcPr>
+            <w:tcW w:w="4060" w:type="dxa"/>
+            <w:tcBorders>
+              <w:top w:val="single" w:sz="4" w:space="0" w:color="CCCCCC"/>
+              <w:left w:val="single" w:sz="4" w:space="0" w:color="CCCCCC"/>
+              <w:bottom w:val="single" w:sz="4" w:space="0" w:color="CCCCCC"/>
+              <w:right w:val="single" w:sz="4" w:space="0" w:color="CCCCCC"/>
+            </w:tcBorders>
+            <w:shd w:val="clear" w:color="auto" w:fill="4361EE"/>
+            <w:tcMar>
+              <w:top w:w="70" w:type="dxa"/>
+              <w:left w:w="110" w:type="dxa"/>
+              <w:bottom w:w="70" w:type="dxa"/>
+              <w:right w:w="110" w:type="dxa"/>
+            </w:tcMar>
+            <w:vAlign w:val="center"/>
+          </w:tcPr>
+          <w:p>
+            <w:pPr>
+              <w:spacing w:after="0"/>
+            </w:pPr>
+            <w:r>
+              <w:rPr>
+                <w:b/>
+                <w:color w:val="FFFFFF"/>
+                <w:sz w:val="20"/>
+              </w:rPr>
+              <w:t xml:space="preserve">How the low–high range is built</w:t>
+            </w:r>
+          </w:p>
+        </w:tc>
+        <w:tc>
+          <w:tcPr>
+            <w:tcW w:w="2400" w:type="dxa"/>
+            <w:tcBorders>
+              <w:top w:val="single" w:sz="4" w:space="0" w:color="CCCCCC"/>
+              <w:left w:val="single" w:sz="4" w:space="0" w:color="CCCCCC"/>
+              <w:bottom w:val="single" w:sz="4" w:space="0" w:color="CCCCCC"/>
+              <w:right w:val="single" w:sz="4" w:space="0" w:color="CCCCCC"/>
+            </w:tcBorders>
+            <w:shd w:val="clear" w:color="auto" w:fill="4361EE"/>
+            <w:tcMar>
+              <w:top w:w="70" w:type="dxa"/>
+              <w:left w:w="110" w:type="dxa"/>
+              <w:bottom w:w="70" w:type="dxa"/>
+              <w:right w:w="110" w:type="dxa"/>
+            </w:tcMar>
+            <w:vAlign w:val="center"/>
+          </w:tcPr>
+          <w:p>
+            <w:pPr>
+              <w:spacing w:after="0"/>
+            </w:pPr>
+            <w:r>
+              <w:rPr>
+                <w:b/>
+                <w:color w:val="FFFFFF"/>
+                <w:sz w:val="20"/>
+              </w:rPr>
+              <w:t xml:space="preserve">Mid-point marker</w:t>
+            </w:r>
+          </w:p>
+        </w:tc>
+      </w:tr>
+      <w:tr>
+        <w:tc>
+          <w:tcPr>
+            <w:tcW w:w="2900" w:type="dxa"/>
+            <w:tcBorders>
+              <w:top w:val="single" w:sz="4" w:space="0" w:color="CCCCCC"/>
+              <w:left w:val="single" w:sz="4" w:space="0" w:color="CCCCCC"/>
+              <w:bottom w:val="single" w:sz="4" w:space="0" w:color="CCCCCC"/>
+              <w:right w:val="single" w:sz="4" w:space="0" w:color="CCCCCC"/>
+            </w:tcBorders>
+            <w:shd w:val="clear" w:color="auto" w:fill="F7F9FF"/>
+            <w:tcMar>
+              <w:top w:w="70" w:type="dxa"/>
+              <w:left w:w="110" w:type="dxa"/>
+              <w:bottom w:w="70" w:type="dxa"/>
+              <w:right w:w="110" w:type="dxa"/>
+            </w:tcMar>
+            <w:vAlign w:val="center"/>
+          </w:tcPr>
+          <w:p>
+            <w:pPr>
+              <w:spacing w:after="0"/>
+            </w:pPr>
+            <w:r>
+              <w:rPr>
+                <w:b w:val="0"/>
+                <w:color w:val="1E293B"/>
+                <w:sz w:val="19"/>
+              </w:rPr>
+              <w:t xml:space="preserve">DCF (FCFF)</w:t>
+            </w:r>
+          </w:p>
+        </w:tc>
+        <w:tc>
+          <w:tcPr>
+            <w:tcW w:w="4060" w:type="dxa"/>
+            <w:tcBorders>
+              <w:top w:val="single" w:sz="4" w:space="0" w:color="CCCCCC"/>
+              <w:left w:val="single" w:sz="4" w:space="0" w:color="CCCCCC"/>
+              <w:bottom w:val="single" w:sz="4" w:space="0" w:color="CCCCCC"/>
+              <w:right w:val="single" w:sz="4" w:space="0" w:color="CCCCCC"/>
+            </w:tcBorders>
+            <w:shd w:val="clear" w:color="auto" w:fill="F7F9FF"/>
+            <w:tcMar>
+              <w:top w:w="70" w:type="dxa"/>
+              <w:left w:w="110" w:type="dxa"/>
+              <w:bottom w:w="70" w:type="dxa"/>
+              <w:right w:w="110" w:type="dxa"/>
+            </w:tcMar>
+            <w:vAlign w:val="center"/>
+          </w:tcPr>
+          <w:p>
+            <w:pPr>
+              <w:spacing w:after="0"/>
+            </w:pPr>
+            <w:r>
+              <w:rPr>
+                <w:b w:val="0"/>
+                <w:color w:val="1E293B"/>
+                <w:sz w:val="19"/>
+              </w:rPr>
+              <w:t xml:space="preserve">Sensitivity grid: WACC ± 2pp × terminal g ± 1pp</w:t>
+            </w:r>
+          </w:p>
+        </w:tc>
+        <w:tc>
+          <w:tcPr>
+            <w:tcW w:w="2400" w:type="dxa"/>
+            <w:tcBorders>
+              <w:top w:val="single" w:sz="4" w:space="0" w:color="CCCCCC"/>
+              <w:left w:val="single" w:sz="4" w:space="0" w:color="CCCCCC"/>
+              <w:bottom w:val="single" w:sz="4" w:space="0" w:color="CCCCCC"/>
+              <w:right w:val="single" w:sz="4" w:space="0" w:color="CCCCCC"/>
+            </w:tcBorders>
+            <w:shd w:val="clear" w:color="auto" w:fill="F7F9FF"/>
+            <w:tcMar>
+              <w:top w:w="70" w:type="dxa"/>
+              <w:left w:w="110" w:type="dxa"/>
+              <w:bottom w:w="70" w:type="dxa"/>
+              <w:right w:w="110" w:type="dxa"/>
+            </w:tcMar>
+            <w:vAlign w:val="center"/>
+          </w:tcPr>
+          <w:p>
+            <w:pPr>
+              <w:spacing w:after="0"/>
+            </w:pPr>
+            <w:r>
+              <w:rPr>
+                <w:b w:val="0"/>
+                <w:color w:val="1E293B"/>
+                <w:sz w:val="19"/>
+              </w:rPr>
+              <w:t xml:space="preserve">Base-case target</w:t>
+            </w:r>
+          </w:p>
+        </w:tc>
+      </w:tr>
+      <w:tr>
+        <w:tc>
+          <w:tcPr>
+            <w:tcW w:w="2900" w:type="dxa"/>
+            <w:tcBorders>
+              <w:top w:val="single" w:sz="4" w:space="0" w:color="CCCCCC"/>
+              <w:left w:val="single" w:sz="4" w:space="0" w:color="CCCCCC"/>
+              <w:bottom w:val="single" w:sz="4" w:space="0" w:color="CCCCCC"/>
+              <w:right w:val="single" w:sz="4" w:space="0" w:color="CCCCCC"/>
+            </w:tcBorders>
+            <w:tcMar>
+              <w:top w:w="70" w:type="dxa"/>
+              <w:left w:w="110" w:type="dxa"/>
+              <w:bottom w:w="70" w:type="dxa"/>
+              <w:right w:w="110" w:type="dxa"/>
+            </w:tcMar>
+            <w:vAlign w:val="center"/>
+          </w:tcPr>
+          <w:p>
+            <w:pPr>
+              <w:spacing w:after="0"/>
+            </w:pPr>
+            <w:r>
+              <w:rPr>
+                <w:b w:val="0"/>
+                <w:color w:val="1E293B"/>
+                <w:sz w:val="19"/>
+              </w:rPr>
+              <w:t xml:space="preserve">Scenarios</w:t>
+            </w:r>
+          </w:p>
+        </w:tc>
+        <w:tc>
+          <w:tcPr>
+            <w:tcW w:w="4060" w:type="dxa"/>
+            <w:tcBorders>
+              <w:top w:val="single" w:sz="4" w:space="0" w:color="CCCCCC"/>
+              <w:left w:val="single" w:sz="4" w:space="0" w:color="CCCCCC"/>
+              <w:bottom w:val="single" w:sz="4" w:space="0" w:color="CCCCCC"/>
+              <w:right w:val="single" w:sz="4" w:space="0" w:color="CCCCCC"/>
+            </w:tcBorders>
+            <w:tcMar>
+              <w:top w:w="70" w:type="dxa"/>
+              <w:left w:w="110" w:type="dxa"/>
+              <w:bottom w:w="70" w:type="dxa"/>
+              <w:right w:w="110" w:type="dxa"/>
+            </w:tcMar>
+            <w:vAlign w:val="center"/>
+          </w:tcPr>
+          <w:p>
+            <w:pPr>
+              <w:spacing w:after="0"/>
+            </w:pPr>
+            <w:r>
+              <w:rPr>
+                <w:b w:val="0"/>
+                <w:color w:val="1E293B"/>
+                <w:sz w:val="19"/>
+              </w:rPr>
+              <w:t xml:space="preserve">Bear-case to Bull-case target price</w:t>
+            </w:r>
+          </w:p>
+        </w:tc>
+        <w:tc>
+          <w:tcPr>
+            <w:tcW w:w="2400" w:type="dxa"/>
+            <w:tcBorders>
+              <w:top w:val="single" w:sz="4" w:space="0" w:color="CCCCCC"/>
+              <w:left w:val="single" w:sz="4" w:space="0" w:color="CCCCCC"/>
+              <w:bottom w:val="single" w:sz="4" w:space="0" w:color="CCCCCC"/>
+              <w:right w:val="single" w:sz="4" w:space="0" w:color="CCCCCC"/>
+            </w:tcBorders>
+            <w:tcMar>
+              <w:top w:w="70" w:type="dxa"/>
+              <w:left w:w="110" w:type="dxa"/>
+              <w:bottom w:w="70" w:type="dxa"/>
+              <w:right w:w="110" w:type="dxa"/>
+            </w:tcMar>
+            <w:vAlign w:val="center"/>
+          </w:tcPr>
+          <w:p>
+            <w:pPr>
+              <w:spacing w:after="0"/>
+            </w:pPr>
+            <w:r>
+              <w:rPr>
+                <w:b w:val="0"/>
+                <w:color w:val="1E293B"/>
+                <w:sz w:val="19"/>
+              </w:rPr>
+              <w:t xml:space="preserve">Base case</w:t>
+            </w:r>
+          </w:p>
+        </w:tc>
+      </w:tr>
+      <w:tr>
+        <w:tc>
+          <w:tcPr>
+            <w:tcW w:w="2900" w:type="dxa"/>
+            <w:tcBorders>
+              <w:top w:val="single" w:sz="4" w:space="0" w:color="CCCCCC"/>
+              <w:left w:val="single" w:sz="4" w:space="0" w:color="CCCCCC"/>
+              <w:bottom w:val="single" w:sz="4" w:space="0" w:color="CCCCCC"/>
+              <w:right w:val="single" w:sz="4" w:space="0" w:color="CCCCCC"/>
+            </w:tcBorders>
+            <w:shd w:val="clear" w:color="auto" w:fill="F7F9FF"/>
+            <w:tcMar>
+              <w:top w:w="70" w:type="dxa"/>
+              <w:left w:w="110" w:type="dxa"/>
+              <w:bottom w:w="70" w:type="dxa"/>
+              <w:right w:w="110" w:type="dxa"/>
+            </w:tcMar>
+            <w:vAlign w:val="center"/>
+          </w:tcPr>
+          <w:p>
+            <w:pPr>
+              <w:spacing w:after="0"/>
+            </w:pPr>
+            <w:r>
+              <w:rPr>
+                <w:b w:val="0"/>
+                <w:color w:val="1E293B"/>
+                <w:sz w:val="19"/>
+              </w:rPr>
+              <w:t xml:space="preserve">Probability-weighted</w:t>
+            </w:r>
+          </w:p>
+        </w:tc>
+        <w:tc>
+          <w:tcPr>
+            <w:tcW w:w="4060" w:type="dxa"/>
+            <w:tcBorders>
+              <w:top w:val="single" w:sz="4" w:space="0" w:color="CCCCCC"/>
+              <w:left w:val="single" w:sz="4" w:space="0" w:color="CCCCCC"/>
+              <w:bottom w:val="single" w:sz="4" w:space="0" w:color="CCCCCC"/>
+              <w:right w:val="single" w:sz="4" w:space="0" w:color="CCCCCC"/>
+            </w:tcBorders>
+            <w:shd w:val="clear" w:color="auto" w:fill="F7F9FF"/>
+            <w:tcMar>
+              <w:top w:w="70" w:type="dxa"/>
+              <w:left w:w="110" w:type="dxa"/>
+              <w:bottom w:w="70" w:type="dxa"/>
+              <w:right w:w="110" w:type="dxa"/>
+            </w:tcMar>
+            <w:vAlign w:val="center"/>
+          </w:tcPr>
+          <w:p>
+            <w:pPr>
+              <w:spacing w:after="0"/>
+            </w:pPr>
+            <w:r>
+              <w:rPr>
+                <w:b w:val="0"/>
+                <w:color w:val="1E293B"/>
+                <w:sz w:val="19"/>
+              </w:rPr>
+              <w:t xml:space="preserve">± 5% around the weighted target</w:t>
+            </w:r>
+          </w:p>
+        </w:tc>
+        <w:tc>
+          <w:tcPr>
+            <w:tcW w:w="2400" w:type="dxa"/>
+            <w:tcBorders>
+              <w:top w:val="single" w:sz="4" w:space="0" w:color="CCCCCC"/>
+              <w:left w:val="single" w:sz="4" w:space="0" w:color="CCCCCC"/>
+              <w:bottom w:val="single" w:sz="4" w:space="0" w:color="CCCCCC"/>
+              <w:right w:val="single" w:sz="4" w:space="0" w:color="CCCCCC"/>
+            </w:tcBorders>
+            <w:shd w:val="clear" w:color="auto" w:fill="F7F9FF"/>
+            <w:tcMar>
+              <w:top w:w="70" w:type="dxa"/>
+              <w:left w:w="110" w:type="dxa"/>
+              <w:bottom w:w="70" w:type="dxa"/>
+              <w:right w:w="110" w:type="dxa"/>
+            </w:tcMar>
+            <w:vAlign w:val="center"/>
+          </w:tcPr>
+          <w:p>
+            <w:pPr>
+              <w:spacing w:after="0"/>
+            </w:pPr>
+            <w:r>
+              <w:rPr>
+                <w:b w:val="0"/>
+                <w:color w:val="1E293B"/>
+                <w:sz w:val="19"/>
+              </w:rPr>
+              <w:t xml:space="preserve">Weighted target</w:t>
+            </w:r>
+          </w:p>
+        </w:tc>
+      </w:tr>
+      <w:tr>
+        <w:tc>
+          <w:tcPr>
+            <w:tcW w:w="2900" w:type="dxa"/>
+            <w:tcBorders>
+              <w:top w:val="single" w:sz="4" w:space="0" w:color="CCCCCC"/>
+              <w:left w:val="single" w:sz="4" w:space="0" w:color="CCCCCC"/>
+              <w:bottom w:val="single" w:sz="4" w:space="0" w:color="CCCCCC"/>
+              <w:right w:val="single" w:sz="4" w:space="0" w:color="CCCCCC"/>
+            </w:tcBorders>
+            <w:tcMar>
+              <w:top w:w="70" w:type="dxa"/>
+              <w:left w:w="110" w:type="dxa"/>
+              <w:bottom w:w="70" w:type="dxa"/>
+              <w:right w:w="110" w:type="dxa"/>
+            </w:tcMar>
+            <w:vAlign w:val="center"/>
+          </w:tcPr>
+          <w:p>
+            <w:pPr>
+              <w:spacing w:after="0"/>
+            </w:pPr>
+            <w:r>
+              <w:rPr>
+                <w:b w:val="0"/>
+                <w:color w:val="1E293B"/>
+                <w:sz w:val="19"/>
+              </w:rPr>
+              <w:t xml:space="preserve">Peer multiples</w:t>
+            </w:r>
+          </w:p>
+        </w:tc>
+        <w:tc>
+          <w:tcPr>
+            <w:tcW w:w="4060" w:type="dxa"/>
+            <w:tcBorders>
+              <w:top w:val="single" w:sz="4" w:space="0" w:color="CCCCCC"/>
+              <w:left w:val="single" w:sz="4" w:space="0" w:color="CCCCCC"/>
+              <w:bottom w:val="single" w:sz="4" w:space="0" w:color="CCCCCC"/>
+              <w:right w:val="single" w:sz="4" w:space="0" w:color="CCCCCC"/>
+            </w:tcBorders>
+            <w:tcMar>
+              <w:top w:w="70" w:type="dxa"/>
+              <w:left w:w="110" w:type="dxa"/>
+              <w:bottom w:w="70" w:type="dxa"/>
+              <w:right w:w="110" w:type="dxa"/>
+            </w:tcMar>
+            <w:vAlign w:val="center"/>
+          </w:tcPr>
+          <w:p>
+            <w:pPr>
+              <w:spacing w:after="0"/>
+            </w:pPr>
+            <w:r>
+              <w:rPr>
+                <w:b w:val="0"/>
+                <w:color w:val="1E293B"/>
+                <w:sz w:val="19"/>
+              </w:rPr>
+              <w:t xml:space="preserve">Lowest to highest peer multiple (EV/EBITDA, P/E, P/BV) on latest-year financials</w:t>
+            </w:r>
+          </w:p>
+        </w:tc>
+        <w:tc>
+          <w:tcPr>
+            <w:tcW w:w="2400" w:type="dxa"/>
+            <w:tcBorders>
+              <w:top w:val="single" w:sz="4" w:space="0" w:color="CCCCCC"/>
+              <w:left w:val="single" w:sz="4" w:space="0" w:color="CCCCCC"/>
+              <w:bottom w:val="single" w:sz="4" w:space="0" w:color="CCCCCC"/>
+              <w:right w:val="single" w:sz="4" w:space="0" w:color="CCCCCC"/>
+            </w:tcBorders>
+            <w:tcMar>
+              <w:top w:w="70" w:type="dxa"/>
+              <w:left w:w="110" w:type="dxa"/>
+              <w:bottom w:w="70" w:type="dxa"/>
+              <w:right w:w="110" w:type="dxa"/>
+            </w:tcMar>
+            <w:vAlign w:val="center"/>
+          </w:tcPr>
+          <w:p>
+            <w:pPr>
+              <w:spacing w:after="0"/>
+            </w:pPr>
+            <w:r>
+              <w:rPr>
+                <w:b w:val="0"/>
+                <w:color w:val="1E293B"/>
+                <w:sz w:val="19"/>
+              </w:rPr>
+              <w:t xml:space="preserve">Peer median</w:t>
+            </w:r>
+          </w:p>
+        </w:tc>
+      </w:tr>
+      <w:tr>
+        <w:tc>
+          <w:tcPr>
+            <w:tcW w:w="2900" w:type="dxa"/>
+            <w:tcBorders>
+              <w:top w:val="single" w:sz="4" w:space="0" w:color="CCCCCC"/>
+              <w:left w:val="single" w:sz="4" w:space="0" w:color="CCCCCC"/>
+              <w:bottom w:val="single" w:sz="4" w:space="0" w:color="CCCCCC"/>
+              <w:right w:val="single" w:sz="4" w:space="0" w:color="CCCCCC"/>
+            </w:tcBorders>
+            <w:shd w:val="clear" w:color="auto" w:fill="EEF2FF"/>
+            <w:tcMar>
+              <w:top w:w="70" w:type="dxa"/>
+              <w:left w:w="110" w:type="dxa"/>
+              <w:bottom w:w="70" w:type="dxa"/>
+              <w:right w:w="110" w:type="dxa"/>
+            </w:tcMar>
+            <w:vAlign w:val="center"/>
+          </w:tcPr>
+          <w:p>
+            <w:pPr>
+              <w:spacing w:after="0"/>
+            </w:pPr>
+            <w:r>
+              <w:rPr>
+                <w:b/>
+                <w:color w:val="1E293B"/>
+                <w:sz w:val="19"/>
+              </w:rPr>
+              <w:t xml:space="preserve">VC Method</w:t>
+            </w:r>
+          </w:p>
+        </w:tc>
+        <w:tc>
+          <w:tcPr>
+            <w:tcW w:w="4060" w:type="dxa"/>
+            <w:tcBorders>
+              <w:top w:val="single" w:sz="4" w:space="0" w:color="CCCCCC"/>
+              <w:left w:val="single" w:sz="4" w:space="0" w:color="CCCCCC"/>
+              <w:bottom w:val="single" w:sz="4" w:space="0" w:color="CCCCCC"/>
+              <w:right w:val="single" w:sz="4" w:space="0" w:color="CCCCCC"/>
+            </w:tcBorders>
+            <w:shd w:val="clear" w:color="auto" w:fill="EEF2FF"/>
+            <w:tcMar>
+              <w:top w:w="70" w:type="dxa"/>
+              <w:left w:w="110" w:type="dxa"/>
+              <w:bottom w:w="70" w:type="dxa"/>
+              <w:right w:w="110" w:type="dxa"/>
+            </w:tcMar>
+            <w:vAlign w:val="center"/>
+          </w:tcPr>
+          <w:p>
+            <w:pPr>
+              <w:spacing w:after="0"/>
+            </w:pPr>
+            <w:r>
+              <w:rPr>
+                <w:b/>
+                <w:color w:val="1E293B"/>
+                <w:sz w:val="19"/>
+              </w:rPr>
+              <w:t xml:space="preserve">Target IRR ± 10pp × exit multiple ± 30% (the IRR × multiple grid)</w:t>
+            </w:r>
+          </w:p>
+        </w:tc>
+        <w:tc>
+          <w:tcPr>
+            <w:tcW w:w="2400" w:type="dxa"/>
+            <w:tcBorders>
+              <w:top w:val="single" w:sz="4" w:space="0" w:color="CCCCCC"/>
+              <w:left w:val="single" w:sz="4" w:space="0" w:color="CCCCCC"/>
+              <w:bottom w:val="single" w:sz="4" w:space="0" w:color="CCCCCC"/>
+              <w:right w:val="single" w:sz="4" w:space="0" w:color="CCCCCC"/>
+            </w:tcBorders>
+            <w:shd w:val="clear" w:color="auto" w:fill="EEF2FF"/>
+            <w:tcMar>
+              <w:top w:w="70" w:type="dxa"/>
+              <w:left w:w="110" w:type="dxa"/>
+              <w:bottom w:w="70" w:type="dxa"/>
+              <w:right w:w="110" w:type="dxa"/>
+            </w:tcMar>
+            <w:vAlign w:val="center"/>
+          </w:tcPr>
+          <w:p>
+            <w:pPr>
+              <w:spacing w:after="0"/>
+            </w:pPr>
+            <w:r>
+              <w:rPr>
+                <w:b/>
+                <w:color w:val="1E293B"/>
+                <w:sz w:val="19"/>
+              </w:rPr>
+              <w:t xml:space="preserve">Base IRR &amp; multiple</w:t>
+            </w:r>
+          </w:p>
+        </w:tc>
+      </w:tr>
+      <w:tr>
+        <w:tc>
+          <w:tcPr>
+            <w:tcW w:w="2900" w:type="dxa"/>
+            <w:tcBorders>
+              <w:top w:val="single" w:sz="4" w:space="0" w:color="CCCCCC"/>
+              <w:left w:val="single" w:sz="4" w:space="0" w:color="CCCCCC"/>
+              <w:bottom w:val="single" w:sz="4" w:space="0" w:color="CCCCCC"/>
+              <w:right w:val="single" w:sz="4" w:space="0" w:color="CCCCCC"/>
+            </w:tcBorders>
+            <w:tcMar>
+              <w:top w:w="70" w:type="dxa"/>
+              <w:left w:w="110" w:type="dxa"/>
+              <w:bottom w:w="70" w:type="dxa"/>
+              <w:right w:w="110" w:type="dxa"/>
+            </w:tcMar>
+            <w:vAlign w:val="center"/>
+          </w:tcPr>
+          <w:p>
+            <w:pPr>
+              <w:spacing w:after="0"/>
+            </w:pPr>
+            <w:r>
+              <w:rPr>
+                <w:b w:val="0"/>
+                <w:color w:val="1E293B"/>
+                <w:sz w:val="19"/>
+              </w:rPr>
+              <w:t xml:space="preserve">52-week range</w:t>
+            </w:r>
+          </w:p>
+        </w:tc>
+        <w:tc>
+          <w:tcPr>
+            <w:tcW w:w="4060" w:type="dxa"/>
+            <w:tcBorders>
+              <w:top w:val="single" w:sz="4" w:space="0" w:color="CCCCCC"/>
+              <w:left w:val="single" w:sz="4" w:space="0" w:color="CCCCCC"/>
+              <w:bottom w:val="single" w:sz="4" w:space="0" w:color="CCCCCC"/>
+              <w:right w:val="single" w:sz="4" w:space="0" w:color="CCCCCC"/>
+            </w:tcBorders>
+            <w:tcMar>
+              <w:top w:w="70" w:type="dxa"/>
+              <w:left w:w="110" w:type="dxa"/>
+              <w:bottom w:w="70" w:type="dxa"/>
+              <w:right w:w="110" w:type="dxa"/>
+            </w:tcMar>
+            <w:vAlign w:val="center"/>
+          </w:tcPr>
+          <w:p>
+            <w:pPr>
+              <w:spacing w:after="0"/>
+            </w:pPr>
+            <w:r>
+              <w:rPr>
+                <w:b w:val="0"/>
+                <w:color w:val="1E293B"/>
+                <w:sz w:val="19"/>
+              </w:rPr>
+              <w:t xml:space="preserve">Lowest to highest traded price</w:t>
+            </w:r>
+          </w:p>
+        </w:tc>
+        <w:tc>
+          <w:tcPr>
+            <w:tcW w:w="2400" w:type="dxa"/>
+            <w:tcBorders>
+              <w:top w:val="single" w:sz="4" w:space="0" w:color="CCCCCC"/>
+              <w:left w:val="single" w:sz="4" w:space="0" w:color="CCCCCC"/>
+              <w:bottom w:val="single" w:sz="4" w:space="0" w:color="CCCCCC"/>
+              <w:right w:val="single" w:sz="4" w:space="0" w:color="CCCCCC"/>
+            </w:tcBorders>
+            <w:tcMar>
+              <w:top w:w="70" w:type="dxa"/>
+              <w:left w:w="110" w:type="dxa"/>
+              <w:bottom w:w="70" w:type="dxa"/>
+              <w:right w:w="110" w:type="dxa"/>
+            </w:tcMar>
+            <w:vAlign w:val="center"/>
+          </w:tcPr>
+          <w:p>
+            <w:pPr>
+              <w:spacing w:after="0"/>
+            </w:pPr>
+            <w:r>
+              <w:rPr>
+                <w:b w:val="0"/>
+                <w:color w:val="1E293B"/>
+                <w:sz w:val="19"/>
+              </w:rPr>
+              <w:t xml:space="preserve">Mid-range</w:t>
+            </w:r>
+          </w:p>
+        </w:tc>
+      </w:tr>
+    </w:tbl>
+    <w:p>
+      <w:pPr>
+        <w:spacing w:after="60"/>
+      </w:pPr>
+    </w:p>
+    <w:p>
+      <w:pPr>
+        <w:spacing w:after="120" w:before="0" w:line="276" w:lineRule="auto"/>
+      </w:pPr>
+      <w:r>
+        <w:rPr>
+          <w:b/>
+          <w:i w:val="0"/>
+          <w:color w:val="1E293B"/>
+          <w:sz w:val="21"/>
+        </w:rPr>
+        <w:t xml:space="preserve">Reading the VC Method bar. </w:t>
+      </w:r>
+      <w:r>
+        <w:rPr>
+          <w:b w:val="0"/>
+          <w:i w:val="0"/>
+          <w:color w:val="1E293B"/>
+          <w:sz w:val="21"/>
+        </w:rPr>
+        <w:t xml:space="preserve">It answers a different question from the other bars: </w:t>
+      </w:r>
+      <w:r>
+        <w:rPr>
+          <w:b/>
+          <w:i w:val="0"/>
+          <w:color w:val="1E293B"/>
+          <w:sz w:val="21"/>
+        </w:rPr>
+        <w:t xml:space="preserve">what would an investor demanding a venture-style return pay today?</w:t>
+      </w:r>
+      <w:r>
+        <w:rPr>
+          <w:b w:val="0"/>
+          <w:i w:val="0"/>
+          <w:color w:val="1E293B"/>
+          <w:sz w:val="21"/>
+        </w:rPr>
+        <w:t xml:space="preserve"> For Vipin Corporation (exit at 18× P/E in FY29E, 25% target IRR) the bar runs from about ₹51 to ₹304 with a base of ₹140, so it sits almost entirely to the left of the ₹310 price. Only the most generous corner of the grid (15% IRR, 23× exit) gets close to the price.</w:t>
+      </w:r>
+    </w:p>
+    <w:tbl>
+      <w:tblPr>
+        <w:tblW w:w="9360" w:type="dxa"/>
+        <w:jc w:val="center"/>
+        <w:tblLayout w:type="fixed"/>
+        <w:tblLook w:firstColumn="1" w:firstRow="1" w:lastColumn="0" w:lastRow="0" w:noHBand="0" w:noVBand="1" w:val="04A0"/>
+      </w:tblPr>
+      <w:tblGrid>
+        <w:gridCol w:w="9360"/>
+      </w:tblGrid>
+      <w:tr>
+        <w:tc>
+          <w:tcPr>
+            <w:tcW w:w="9360" w:type="dxa"/>
+            <w:tcBorders>
+              <w:top w:val="single" w:sz="4" w:space="0" w:color="E2E8F8"/>
+              <w:left w:val="single" w:sz="24" w:space="0" w:color="7209B7"/>
+              <w:bottom w:val="single" w:sz="4" w:space="0" w:color="E2E8F8"/>
+              <w:right w:val="single" w:sz="4" w:space="0" w:color="E2E8F8"/>
+            </w:tcBorders>
+            <w:shd w:val="clear" w:color="auto" w:fill="FBFBFE"/>
+            <w:tcMar>
+              <w:top w:w="120" w:type="dxa"/>
+              <w:left w:w="160" w:type="dxa"/>
+              <w:bottom w:w="120" w:type="dxa"/>
+              <w:right w:w="160" w:type="dxa"/>
+            </w:tcMar>
+          </w:tcPr>
+          <w:p>
+            <w:pPr>
+              <w:spacing w:after="60"/>
+            </w:pPr>
+            <w:r>
+              <w:rPr>
+                <w:b/>
+                <w:color w:val="7209B7"/>
+                <w:sz w:val="21"/>
+              </w:rPr>
+              <w:t>❖  Interpreting the VC bar on the field</w:t>
+            </w:r>
+          </w:p>
+          <w:p>
+            <w:pPr>
+              <w:spacing w:after="40"/>
+            </w:pPr>
+            <w:r>
+              <w:rPr>
+                <w:b w:val="0"/>
+                <w:i w:val="0"/>
+                <w:color w:val="1E293B"/>
+                <w:sz w:val="20"/>
+              </w:rPr>
+              <w:t xml:space="preserve">For a mature listed company the VC bar normally sits below the DCF and comps bars — the high hurdle rate prices in start-up risk the company no longer carries. Treat it as a return check, not a fair-value bar.</w:t>
+            </w:r>
+          </w:p>
+          <w:p>
+            <w:pPr>
+              <w:spacing w:after="40"/>
+            </w:pPr>
+            <w:r>
+              <w:rPr>
+                <w:b w:val="0"/>
+                <w:i w:val="0"/>
+                <w:color w:val="1E293B"/>
+                <w:sz w:val="20"/>
+              </w:rPr>
+              <w:t xml:space="preserve">If the price falls inside or below the VC bar, even a demanding investor would earn the hurdle IRR — a strong value signal.</w:t>
+            </w:r>
+          </w:p>
+          <w:p>
+            <w:pPr>
+              <w:spacing w:after="40"/>
+            </w:pPr>
+            <w:r>
+              <w:rPr>
+                <w:b w:val="0"/>
+                <w:i w:val="0"/>
+                <w:color w:val="1E293B"/>
+                <w:sz w:val="20"/>
+              </w:rPr>
+              <w:t xml:space="preserve">For start-ups and pre-profit companies the VC bar is often the main anchor, with EV/Sales comps as the cross-check.</w:t>
+            </w:r>
+          </w:p>
+          <w:p>
+            <w:pPr>
+              <w:spacing w:after="40"/>
+            </w:pPr>
+            <w:r>
+              <w:rPr>
+                <w:b w:val="0"/>
+                <w:i w:val="0"/>
+                <w:color w:val="1E293B"/>
+                <w:sz w:val="20"/>
+              </w:rPr>
+              <w:t xml:space="preserve">In ValuMetrics, the VC bar appears automatically in the Analyst View football field and in the PDF report.</w:t>
+            </w:r>
+          </w:p>
+        </w:tc>
+      </w:tr>
+    </w:tbl>
     <w:p>
       <w:r>
         <w:br w:type="page"/>

</xml_diff>

<commit_message>
Guide: add VC Method to the football field section (8.4) (#3)
- Table of football-field bars and how each low-high range is built,
  with the VC Method bar (target IRR +/-10pp x exit multiple +/-30%).
- How to read the VC bar, using the sample company's range
  (Rs 51-304, base Rs 140 vs Rs 310 price), plus an interpretation box.


Claude-Session: https://claude.ai/code/session_018hY48TnvoyExCnuZKmZVFd

Co-authored-by: Claude <noreply@anthropic.com>
</commit_message>
<xml_diff>
--- a/Valuation_Deep_Dive_Guide.docx
+++ b/Valuation_Deep_Dive_Guide.docx
@@ -15910,6 +15910,874 @@
         <w:t>Plot the value range from every method on one chart, with the current price as a vertical line. Where the price sits relative to the methods is the punchline of the analysis.</w:t>
       </w:r>
     </w:p>
+    <w:p>
+      <w:pPr>
+        <w:spacing w:after="120" w:before="0" w:line="276" w:lineRule="auto"/>
+      </w:pPr>
+      <w:r>
+        <w:rPr>
+          <w:b w:val="0"/>
+          <w:i w:val="0"/>
+          <w:color w:val="1E293B"/>
+          <w:sz w:val="21"/>
+        </w:rPr>
+        <w:t xml:space="preserve">Each bar on the field is a </w:t>
+      </w:r>
+      <w:r>
+        <w:rPr>
+          <w:b/>
+          <w:i w:val="0"/>
+          <w:color w:val="1E293B"/>
+          <w:sz w:val="21"/>
+        </w:rPr>
+        <w:t xml:space="preserve">range</w:t>
+      </w:r>
+      <w:r>
+        <w:rPr>
+          <w:b w:val="0"/>
+          <w:i w:val="0"/>
+          <w:color w:val="1E293B"/>
+          <w:sz w:val="21"/>
+        </w:rPr>
+        <w:t xml:space="preserve">, not a point — built from the method’s own sensitivity so the width shows how much the answer depends on its key assumptions:</w:t>
+      </w:r>
+    </w:p>
+    <w:tbl>
+      <w:tblPr>
+        <w:tblW w:w="9360" w:type="dxa"/>
+        <w:jc w:val="center"/>
+        <w:tblLayout w:type="fixed"/>
+        <w:tblLook w:firstColumn="1" w:firstRow="1" w:lastColumn="0" w:lastRow="0" w:noHBand="0" w:noVBand="1" w:val="04A0"/>
+      </w:tblPr>
+      <w:tblGrid>
+        <w:gridCol w:w="2900"/>
+        <w:gridCol w:w="4060"/>
+        <w:gridCol w:w="2400"/>
+      </w:tblGrid>
+      <w:tr>
+        <w:tc>
+          <w:tcPr>
+            <w:tcW w:w="2900" w:type="dxa"/>
+            <w:tcBorders>
+              <w:top w:val="single" w:sz="4" w:space="0" w:color="CCCCCC"/>
+              <w:left w:val="single" w:sz="4" w:space="0" w:color="CCCCCC"/>
+              <w:bottom w:val="single" w:sz="4" w:space="0" w:color="CCCCCC"/>
+              <w:right w:val="single" w:sz="4" w:space="0" w:color="CCCCCC"/>
+            </w:tcBorders>
+            <w:shd w:val="clear" w:color="auto" w:fill="4361EE"/>
+            <w:tcMar>
+              <w:top w:w="70" w:type="dxa"/>
+              <w:left w:w="110" w:type="dxa"/>
+              <w:bottom w:w="70" w:type="dxa"/>
+              <w:right w:w="110" w:type="dxa"/>
+            </w:tcMar>
+            <w:vAlign w:val="center"/>
+          </w:tcPr>
+          <w:p>
+            <w:pPr>
+              <w:spacing w:after="0"/>
+            </w:pPr>
+            <w:r>
+              <w:rPr>
+                <w:b/>
+                <w:color w:val="FFFFFF"/>
+                <w:sz w:val="20"/>
+              </w:rPr>
+              <w:t xml:space="preserve">Bar</w:t>
+            </w:r>
+          </w:p>
+        </w:tc>
+        <w:tc>
+          <w:tcPr>
+            <w:tcW w:w="4060" w:type="dxa"/>
+            <w:tcBorders>
+              <w:top w:val="single" w:sz="4" w:space="0" w:color="CCCCCC"/>
+              <w:left w:val="single" w:sz="4" w:space="0" w:color="CCCCCC"/>
+              <w:bottom w:val="single" w:sz="4" w:space="0" w:color="CCCCCC"/>
+              <w:right w:val="single" w:sz="4" w:space="0" w:color="CCCCCC"/>
+            </w:tcBorders>
+            <w:shd w:val="clear" w:color="auto" w:fill="4361EE"/>
+            <w:tcMar>
+              <w:top w:w="70" w:type="dxa"/>
+              <w:left w:w="110" w:type="dxa"/>
+              <w:bottom w:w="70" w:type="dxa"/>
+              <w:right w:w="110" w:type="dxa"/>
+            </w:tcMar>
+            <w:vAlign w:val="center"/>
+          </w:tcPr>
+          <w:p>
+            <w:pPr>
+              <w:spacing w:after="0"/>
+            </w:pPr>
+            <w:r>
+              <w:rPr>
+                <w:b/>
+                <w:color w:val="FFFFFF"/>
+                <w:sz w:val="20"/>
+              </w:rPr>
+              <w:t xml:space="preserve">How the low–high range is built</w:t>
+            </w:r>
+          </w:p>
+        </w:tc>
+        <w:tc>
+          <w:tcPr>
+            <w:tcW w:w="2400" w:type="dxa"/>
+            <w:tcBorders>
+              <w:top w:val="single" w:sz="4" w:space="0" w:color="CCCCCC"/>
+              <w:left w:val="single" w:sz="4" w:space="0" w:color="CCCCCC"/>
+              <w:bottom w:val="single" w:sz="4" w:space="0" w:color="CCCCCC"/>
+              <w:right w:val="single" w:sz="4" w:space="0" w:color="CCCCCC"/>
+            </w:tcBorders>
+            <w:shd w:val="clear" w:color="auto" w:fill="4361EE"/>
+            <w:tcMar>
+              <w:top w:w="70" w:type="dxa"/>
+              <w:left w:w="110" w:type="dxa"/>
+              <w:bottom w:w="70" w:type="dxa"/>
+              <w:right w:w="110" w:type="dxa"/>
+            </w:tcMar>
+            <w:vAlign w:val="center"/>
+          </w:tcPr>
+          <w:p>
+            <w:pPr>
+              <w:spacing w:after="0"/>
+            </w:pPr>
+            <w:r>
+              <w:rPr>
+                <w:b/>
+                <w:color w:val="FFFFFF"/>
+                <w:sz w:val="20"/>
+              </w:rPr>
+              <w:t xml:space="preserve">Mid-point marker</w:t>
+            </w:r>
+          </w:p>
+        </w:tc>
+      </w:tr>
+      <w:tr>
+        <w:tc>
+          <w:tcPr>
+            <w:tcW w:w="2900" w:type="dxa"/>
+            <w:tcBorders>
+              <w:top w:val="single" w:sz="4" w:space="0" w:color="CCCCCC"/>
+              <w:left w:val="single" w:sz="4" w:space="0" w:color="CCCCCC"/>
+              <w:bottom w:val="single" w:sz="4" w:space="0" w:color="CCCCCC"/>
+              <w:right w:val="single" w:sz="4" w:space="0" w:color="CCCCCC"/>
+            </w:tcBorders>
+            <w:shd w:val="clear" w:color="auto" w:fill="F7F9FF"/>
+            <w:tcMar>
+              <w:top w:w="70" w:type="dxa"/>
+              <w:left w:w="110" w:type="dxa"/>
+              <w:bottom w:w="70" w:type="dxa"/>
+              <w:right w:w="110" w:type="dxa"/>
+            </w:tcMar>
+            <w:vAlign w:val="center"/>
+          </w:tcPr>
+          <w:p>
+            <w:pPr>
+              <w:spacing w:after="0"/>
+            </w:pPr>
+            <w:r>
+              <w:rPr>
+                <w:b w:val="0"/>
+                <w:color w:val="1E293B"/>
+                <w:sz w:val="19"/>
+              </w:rPr>
+              <w:t xml:space="preserve">DCF (FCFF)</w:t>
+            </w:r>
+          </w:p>
+        </w:tc>
+        <w:tc>
+          <w:tcPr>
+            <w:tcW w:w="4060" w:type="dxa"/>
+            <w:tcBorders>
+              <w:top w:val="single" w:sz="4" w:space="0" w:color="CCCCCC"/>
+              <w:left w:val="single" w:sz="4" w:space="0" w:color="CCCCCC"/>
+              <w:bottom w:val="single" w:sz="4" w:space="0" w:color="CCCCCC"/>
+              <w:right w:val="single" w:sz="4" w:space="0" w:color="CCCCCC"/>
+            </w:tcBorders>
+            <w:shd w:val="clear" w:color="auto" w:fill="F7F9FF"/>
+            <w:tcMar>
+              <w:top w:w="70" w:type="dxa"/>
+              <w:left w:w="110" w:type="dxa"/>
+              <w:bottom w:w="70" w:type="dxa"/>
+              <w:right w:w="110" w:type="dxa"/>
+            </w:tcMar>
+            <w:vAlign w:val="center"/>
+          </w:tcPr>
+          <w:p>
+            <w:pPr>
+              <w:spacing w:after="0"/>
+            </w:pPr>
+            <w:r>
+              <w:rPr>
+                <w:b w:val="0"/>
+                <w:color w:val="1E293B"/>
+                <w:sz w:val="19"/>
+              </w:rPr>
+              <w:t xml:space="preserve">Sensitivity grid: WACC ± 2pp × terminal g ± 1pp</w:t>
+            </w:r>
+          </w:p>
+        </w:tc>
+        <w:tc>
+          <w:tcPr>
+            <w:tcW w:w="2400" w:type="dxa"/>
+            <w:tcBorders>
+              <w:top w:val="single" w:sz="4" w:space="0" w:color="CCCCCC"/>
+              <w:left w:val="single" w:sz="4" w:space="0" w:color="CCCCCC"/>
+              <w:bottom w:val="single" w:sz="4" w:space="0" w:color="CCCCCC"/>
+              <w:right w:val="single" w:sz="4" w:space="0" w:color="CCCCCC"/>
+            </w:tcBorders>
+            <w:shd w:val="clear" w:color="auto" w:fill="F7F9FF"/>
+            <w:tcMar>
+              <w:top w:w="70" w:type="dxa"/>
+              <w:left w:w="110" w:type="dxa"/>
+              <w:bottom w:w="70" w:type="dxa"/>
+              <w:right w:w="110" w:type="dxa"/>
+            </w:tcMar>
+            <w:vAlign w:val="center"/>
+          </w:tcPr>
+          <w:p>
+            <w:pPr>
+              <w:spacing w:after="0"/>
+            </w:pPr>
+            <w:r>
+              <w:rPr>
+                <w:b w:val="0"/>
+                <w:color w:val="1E293B"/>
+                <w:sz w:val="19"/>
+              </w:rPr>
+              <w:t xml:space="preserve">Base-case target</w:t>
+            </w:r>
+          </w:p>
+        </w:tc>
+      </w:tr>
+      <w:tr>
+        <w:tc>
+          <w:tcPr>
+            <w:tcW w:w="2900" w:type="dxa"/>
+            <w:tcBorders>
+              <w:top w:val="single" w:sz="4" w:space="0" w:color="CCCCCC"/>
+              <w:left w:val="single" w:sz="4" w:space="0" w:color="CCCCCC"/>
+              <w:bottom w:val="single" w:sz="4" w:space="0" w:color="CCCCCC"/>
+              <w:right w:val="single" w:sz="4" w:space="0" w:color="CCCCCC"/>
+            </w:tcBorders>
+            <w:tcMar>
+              <w:top w:w="70" w:type="dxa"/>
+              <w:left w:w="110" w:type="dxa"/>
+              <w:bottom w:w="70" w:type="dxa"/>
+              <w:right w:w="110" w:type="dxa"/>
+            </w:tcMar>
+            <w:vAlign w:val="center"/>
+          </w:tcPr>
+          <w:p>
+            <w:pPr>
+              <w:spacing w:after="0"/>
+            </w:pPr>
+            <w:r>
+              <w:rPr>
+                <w:b w:val="0"/>
+                <w:color w:val="1E293B"/>
+                <w:sz w:val="19"/>
+              </w:rPr>
+              <w:t xml:space="preserve">Scenarios</w:t>
+            </w:r>
+          </w:p>
+        </w:tc>
+        <w:tc>
+          <w:tcPr>
+            <w:tcW w:w="4060" w:type="dxa"/>
+            <w:tcBorders>
+              <w:top w:val="single" w:sz="4" w:space="0" w:color="CCCCCC"/>
+              <w:left w:val="single" w:sz="4" w:space="0" w:color="CCCCCC"/>
+              <w:bottom w:val="single" w:sz="4" w:space="0" w:color="CCCCCC"/>
+              <w:right w:val="single" w:sz="4" w:space="0" w:color="CCCCCC"/>
+            </w:tcBorders>
+            <w:tcMar>
+              <w:top w:w="70" w:type="dxa"/>
+              <w:left w:w="110" w:type="dxa"/>
+              <w:bottom w:w="70" w:type="dxa"/>
+              <w:right w:w="110" w:type="dxa"/>
+            </w:tcMar>
+            <w:vAlign w:val="center"/>
+          </w:tcPr>
+          <w:p>
+            <w:pPr>
+              <w:spacing w:after="0"/>
+            </w:pPr>
+            <w:r>
+              <w:rPr>
+                <w:b w:val="0"/>
+                <w:color w:val="1E293B"/>
+                <w:sz w:val="19"/>
+              </w:rPr>
+              <w:t xml:space="preserve">Bear-case to Bull-case target price</w:t>
+            </w:r>
+          </w:p>
+        </w:tc>
+        <w:tc>
+          <w:tcPr>
+            <w:tcW w:w="2400" w:type="dxa"/>
+            <w:tcBorders>
+              <w:top w:val="single" w:sz="4" w:space="0" w:color="CCCCCC"/>
+              <w:left w:val="single" w:sz="4" w:space="0" w:color="CCCCCC"/>
+              <w:bottom w:val="single" w:sz="4" w:space="0" w:color="CCCCCC"/>
+              <w:right w:val="single" w:sz="4" w:space="0" w:color="CCCCCC"/>
+            </w:tcBorders>
+            <w:tcMar>
+              <w:top w:w="70" w:type="dxa"/>
+              <w:left w:w="110" w:type="dxa"/>
+              <w:bottom w:w="70" w:type="dxa"/>
+              <w:right w:w="110" w:type="dxa"/>
+            </w:tcMar>
+            <w:vAlign w:val="center"/>
+          </w:tcPr>
+          <w:p>
+            <w:pPr>
+              <w:spacing w:after="0"/>
+            </w:pPr>
+            <w:r>
+              <w:rPr>
+                <w:b w:val="0"/>
+                <w:color w:val="1E293B"/>
+                <w:sz w:val="19"/>
+              </w:rPr>
+              <w:t xml:space="preserve">Base case</w:t>
+            </w:r>
+          </w:p>
+        </w:tc>
+      </w:tr>
+      <w:tr>
+        <w:tc>
+          <w:tcPr>
+            <w:tcW w:w="2900" w:type="dxa"/>
+            <w:tcBorders>
+              <w:top w:val="single" w:sz="4" w:space="0" w:color="CCCCCC"/>
+              <w:left w:val="single" w:sz="4" w:space="0" w:color="CCCCCC"/>
+              <w:bottom w:val="single" w:sz="4" w:space="0" w:color="CCCCCC"/>
+              <w:right w:val="single" w:sz="4" w:space="0" w:color="CCCCCC"/>
+            </w:tcBorders>
+            <w:shd w:val="clear" w:color="auto" w:fill="F7F9FF"/>
+            <w:tcMar>
+              <w:top w:w="70" w:type="dxa"/>
+              <w:left w:w="110" w:type="dxa"/>
+              <w:bottom w:w="70" w:type="dxa"/>
+              <w:right w:w="110" w:type="dxa"/>
+            </w:tcMar>
+            <w:vAlign w:val="center"/>
+          </w:tcPr>
+          <w:p>
+            <w:pPr>
+              <w:spacing w:after="0"/>
+            </w:pPr>
+            <w:r>
+              <w:rPr>
+                <w:b w:val="0"/>
+                <w:color w:val="1E293B"/>
+                <w:sz w:val="19"/>
+              </w:rPr>
+              <w:t xml:space="preserve">Probability-weighted</w:t>
+            </w:r>
+          </w:p>
+        </w:tc>
+        <w:tc>
+          <w:tcPr>
+            <w:tcW w:w="4060" w:type="dxa"/>
+            <w:tcBorders>
+              <w:top w:val="single" w:sz="4" w:space="0" w:color="CCCCCC"/>
+              <w:left w:val="single" w:sz="4" w:space="0" w:color="CCCCCC"/>
+              <w:bottom w:val="single" w:sz="4" w:space="0" w:color="CCCCCC"/>
+              <w:right w:val="single" w:sz="4" w:space="0" w:color="CCCCCC"/>
+            </w:tcBorders>
+            <w:shd w:val="clear" w:color="auto" w:fill="F7F9FF"/>
+            <w:tcMar>
+              <w:top w:w="70" w:type="dxa"/>
+              <w:left w:w="110" w:type="dxa"/>
+              <w:bottom w:w="70" w:type="dxa"/>
+              <w:right w:w="110" w:type="dxa"/>
+            </w:tcMar>
+            <w:vAlign w:val="center"/>
+          </w:tcPr>
+          <w:p>
+            <w:pPr>
+              <w:spacing w:after="0"/>
+            </w:pPr>
+            <w:r>
+              <w:rPr>
+                <w:b w:val="0"/>
+                <w:color w:val="1E293B"/>
+                <w:sz w:val="19"/>
+              </w:rPr>
+              <w:t xml:space="preserve">± 5% around the weighted target</w:t>
+            </w:r>
+          </w:p>
+        </w:tc>
+        <w:tc>
+          <w:tcPr>
+            <w:tcW w:w="2400" w:type="dxa"/>
+            <w:tcBorders>
+              <w:top w:val="single" w:sz="4" w:space="0" w:color="CCCCCC"/>
+              <w:left w:val="single" w:sz="4" w:space="0" w:color="CCCCCC"/>
+              <w:bottom w:val="single" w:sz="4" w:space="0" w:color="CCCCCC"/>
+              <w:right w:val="single" w:sz="4" w:space="0" w:color="CCCCCC"/>
+            </w:tcBorders>
+            <w:shd w:val="clear" w:color="auto" w:fill="F7F9FF"/>
+            <w:tcMar>
+              <w:top w:w="70" w:type="dxa"/>
+              <w:left w:w="110" w:type="dxa"/>
+              <w:bottom w:w="70" w:type="dxa"/>
+              <w:right w:w="110" w:type="dxa"/>
+            </w:tcMar>
+            <w:vAlign w:val="center"/>
+          </w:tcPr>
+          <w:p>
+            <w:pPr>
+              <w:spacing w:after="0"/>
+            </w:pPr>
+            <w:r>
+              <w:rPr>
+                <w:b w:val="0"/>
+                <w:color w:val="1E293B"/>
+                <w:sz w:val="19"/>
+              </w:rPr>
+              <w:t xml:space="preserve">Weighted target</w:t>
+            </w:r>
+          </w:p>
+        </w:tc>
+      </w:tr>
+      <w:tr>
+        <w:tc>
+          <w:tcPr>
+            <w:tcW w:w="2900" w:type="dxa"/>
+            <w:tcBorders>
+              <w:top w:val="single" w:sz="4" w:space="0" w:color="CCCCCC"/>
+              <w:left w:val="single" w:sz="4" w:space="0" w:color="CCCCCC"/>
+              <w:bottom w:val="single" w:sz="4" w:space="0" w:color="CCCCCC"/>
+              <w:right w:val="single" w:sz="4" w:space="0" w:color="CCCCCC"/>
+            </w:tcBorders>
+            <w:tcMar>
+              <w:top w:w="70" w:type="dxa"/>
+              <w:left w:w="110" w:type="dxa"/>
+              <w:bottom w:w="70" w:type="dxa"/>
+              <w:right w:w="110" w:type="dxa"/>
+            </w:tcMar>
+            <w:vAlign w:val="center"/>
+          </w:tcPr>
+          <w:p>
+            <w:pPr>
+              <w:spacing w:after="0"/>
+            </w:pPr>
+            <w:r>
+              <w:rPr>
+                <w:b w:val="0"/>
+                <w:color w:val="1E293B"/>
+                <w:sz w:val="19"/>
+              </w:rPr>
+              <w:t xml:space="preserve">Peer multiples</w:t>
+            </w:r>
+          </w:p>
+        </w:tc>
+        <w:tc>
+          <w:tcPr>
+            <w:tcW w:w="4060" w:type="dxa"/>
+            <w:tcBorders>
+              <w:top w:val="single" w:sz="4" w:space="0" w:color="CCCCCC"/>
+              <w:left w:val="single" w:sz="4" w:space="0" w:color="CCCCCC"/>
+              <w:bottom w:val="single" w:sz="4" w:space="0" w:color="CCCCCC"/>
+              <w:right w:val="single" w:sz="4" w:space="0" w:color="CCCCCC"/>
+            </w:tcBorders>
+            <w:tcMar>
+              <w:top w:w="70" w:type="dxa"/>
+              <w:left w:w="110" w:type="dxa"/>
+              <w:bottom w:w="70" w:type="dxa"/>
+              <w:right w:w="110" w:type="dxa"/>
+            </w:tcMar>
+            <w:vAlign w:val="center"/>
+          </w:tcPr>
+          <w:p>
+            <w:pPr>
+              <w:spacing w:after="0"/>
+            </w:pPr>
+            <w:r>
+              <w:rPr>
+                <w:b w:val="0"/>
+                <w:color w:val="1E293B"/>
+                <w:sz w:val="19"/>
+              </w:rPr>
+              <w:t xml:space="preserve">Lowest to highest peer multiple (EV/EBITDA, P/E, P/BV) on latest-year financials</w:t>
+            </w:r>
+          </w:p>
+        </w:tc>
+        <w:tc>
+          <w:tcPr>
+            <w:tcW w:w="2400" w:type="dxa"/>
+            <w:tcBorders>
+              <w:top w:val="single" w:sz="4" w:space="0" w:color="CCCCCC"/>
+              <w:left w:val="single" w:sz="4" w:space="0" w:color="CCCCCC"/>
+              <w:bottom w:val="single" w:sz="4" w:space="0" w:color="CCCCCC"/>
+              <w:right w:val="single" w:sz="4" w:space="0" w:color="CCCCCC"/>
+            </w:tcBorders>
+            <w:tcMar>
+              <w:top w:w="70" w:type="dxa"/>
+              <w:left w:w="110" w:type="dxa"/>
+              <w:bottom w:w="70" w:type="dxa"/>
+              <w:right w:w="110" w:type="dxa"/>
+            </w:tcMar>
+            <w:vAlign w:val="center"/>
+          </w:tcPr>
+          <w:p>
+            <w:pPr>
+              <w:spacing w:after="0"/>
+            </w:pPr>
+            <w:r>
+              <w:rPr>
+                <w:b w:val="0"/>
+                <w:color w:val="1E293B"/>
+                <w:sz w:val="19"/>
+              </w:rPr>
+              <w:t xml:space="preserve">Peer median</w:t>
+            </w:r>
+          </w:p>
+        </w:tc>
+      </w:tr>
+      <w:tr>
+        <w:tc>
+          <w:tcPr>
+            <w:tcW w:w="2900" w:type="dxa"/>
+            <w:tcBorders>
+              <w:top w:val="single" w:sz="4" w:space="0" w:color="CCCCCC"/>
+              <w:left w:val="single" w:sz="4" w:space="0" w:color="CCCCCC"/>
+              <w:bottom w:val="single" w:sz="4" w:space="0" w:color="CCCCCC"/>
+              <w:right w:val="single" w:sz="4" w:space="0" w:color="CCCCCC"/>
+            </w:tcBorders>
+            <w:shd w:val="clear" w:color="auto" w:fill="EEF2FF"/>
+            <w:tcMar>
+              <w:top w:w="70" w:type="dxa"/>
+              <w:left w:w="110" w:type="dxa"/>
+              <w:bottom w:w="70" w:type="dxa"/>
+              <w:right w:w="110" w:type="dxa"/>
+            </w:tcMar>
+            <w:vAlign w:val="center"/>
+          </w:tcPr>
+          <w:p>
+            <w:pPr>
+              <w:spacing w:after="0"/>
+            </w:pPr>
+            <w:r>
+              <w:rPr>
+                <w:b/>
+                <w:color w:val="1E293B"/>
+                <w:sz w:val="19"/>
+              </w:rPr>
+              <w:t xml:space="preserve">VC Method</w:t>
+            </w:r>
+          </w:p>
+        </w:tc>
+        <w:tc>
+          <w:tcPr>
+            <w:tcW w:w="4060" w:type="dxa"/>
+            <w:tcBorders>
+              <w:top w:val="single" w:sz="4" w:space="0" w:color="CCCCCC"/>
+              <w:left w:val="single" w:sz="4" w:space="0" w:color="CCCCCC"/>
+              <w:bottom w:val="single" w:sz="4" w:space="0" w:color="CCCCCC"/>
+              <w:right w:val="single" w:sz="4" w:space="0" w:color="CCCCCC"/>
+            </w:tcBorders>
+            <w:shd w:val="clear" w:color="auto" w:fill="EEF2FF"/>
+            <w:tcMar>
+              <w:top w:w="70" w:type="dxa"/>
+              <w:left w:w="110" w:type="dxa"/>
+              <w:bottom w:w="70" w:type="dxa"/>
+              <w:right w:w="110" w:type="dxa"/>
+            </w:tcMar>
+            <w:vAlign w:val="center"/>
+          </w:tcPr>
+          <w:p>
+            <w:pPr>
+              <w:spacing w:after="0"/>
+            </w:pPr>
+            <w:r>
+              <w:rPr>
+                <w:b/>
+                <w:color w:val="1E293B"/>
+                <w:sz w:val="19"/>
+              </w:rPr>
+              <w:t xml:space="preserve">Target IRR ± 10pp × exit multiple ± 30% (the IRR × multiple grid)</w:t>
+            </w:r>
+          </w:p>
+        </w:tc>
+        <w:tc>
+          <w:tcPr>
+            <w:tcW w:w="2400" w:type="dxa"/>
+            <w:tcBorders>
+              <w:top w:val="single" w:sz="4" w:space="0" w:color="CCCCCC"/>
+              <w:left w:val="single" w:sz="4" w:space="0" w:color="CCCCCC"/>
+              <w:bottom w:val="single" w:sz="4" w:space="0" w:color="CCCCCC"/>
+              <w:right w:val="single" w:sz="4" w:space="0" w:color="CCCCCC"/>
+            </w:tcBorders>
+            <w:shd w:val="clear" w:color="auto" w:fill="EEF2FF"/>
+            <w:tcMar>
+              <w:top w:w="70" w:type="dxa"/>
+              <w:left w:w="110" w:type="dxa"/>
+              <w:bottom w:w="70" w:type="dxa"/>
+              <w:right w:w="110" w:type="dxa"/>
+            </w:tcMar>
+            <w:vAlign w:val="center"/>
+          </w:tcPr>
+          <w:p>
+            <w:pPr>
+              <w:spacing w:after="0"/>
+            </w:pPr>
+            <w:r>
+              <w:rPr>
+                <w:b/>
+                <w:color w:val="1E293B"/>
+                <w:sz w:val="19"/>
+              </w:rPr>
+              <w:t xml:space="preserve">Base IRR &amp; multiple</w:t>
+            </w:r>
+          </w:p>
+        </w:tc>
+      </w:tr>
+      <w:tr>
+        <w:tc>
+          <w:tcPr>
+            <w:tcW w:w="2900" w:type="dxa"/>
+            <w:tcBorders>
+              <w:top w:val="single" w:sz="4" w:space="0" w:color="CCCCCC"/>
+              <w:left w:val="single" w:sz="4" w:space="0" w:color="CCCCCC"/>
+              <w:bottom w:val="single" w:sz="4" w:space="0" w:color="CCCCCC"/>
+              <w:right w:val="single" w:sz="4" w:space="0" w:color="CCCCCC"/>
+            </w:tcBorders>
+            <w:tcMar>
+              <w:top w:w="70" w:type="dxa"/>
+              <w:left w:w="110" w:type="dxa"/>
+              <w:bottom w:w="70" w:type="dxa"/>
+              <w:right w:w="110" w:type="dxa"/>
+            </w:tcMar>
+            <w:vAlign w:val="center"/>
+          </w:tcPr>
+          <w:p>
+            <w:pPr>
+              <w:spacing w:after="0"/>
+            </w:pPr>
+            <w:r>
+              <w:rPr>
+                <w:b w:val="0"/>
+                <w:color w:val="1E293B"/>
+                <w:sz w:val="19"/>
+              </w:rPr>
+              <w:t xml:space="preserve">52-week range</w:t>
+            </w:r>
+          </w:p>
+        </w:tc>
+        <w:tc>
+          <w:tcPr>
+            <w:tcW w:w="4060" w:type="dxa"/>
+            <w:tcBorders>
+              <w:top w:val="single" w:sz="4" w:space="0" w:color="CCCCCC"/>
+              <w:left w:val="single" w:sz="4" w:space="0" w:color="CCCCCC"/>
+              <w:bottom w:val="single" w:sz="4" w:space="0" w:color="CCCCCC"/>
+              <w:right w:val="single" w:sz="4" w:space="0" w:color="CCCCCC"/>
+            </w:tcBorders>
+            <w:tcMar>
+              <w:top w:w="70" w:type="dxa"/>
+              <w:left w:w="110" w:type="dxa"/>
+              <w:bottom w:w="70" w:type="dxa"/>
+              <w:right w:w="110" w:type="dxa"/>
+            </w:tcMar>
+            <w:vAlign w:val="center"/>
+          </w:tcPr>
+          <w:p>
+            <w:pPr>
+              <w:spacing w:after="0"/>
+            </w:pPr>
+            <w:r>
+              <w:rPr>
+                <w:b w:val="0"/>
+                <w:color w:val="1E293B"/>
+                <w:sz w:val="19"/>
+              </w:rPr>
+              <w:t xml:space="preserve">Lowest to highest traded price</w:t>
+            </w:r>
+          </w:p>
+        </w:tc>
+        <w:tc>
+          <w:tcPr>
+            <w:tcW w:w="2400" w:type="dxa"/>
+            <w:tcBorders>
+              <w:top w:val="single" w:sz="4" w:space="0" w:color="CCCCCC"/>
+              <w:left w:val="single" w:sz="4" w:space="0" w:color="CCCCCC"/>
+              <w:bottom w:val="single" w:sz="4" w:space="0" w:color="CCCCCC"/>
+              <w:right w:val="single" w:sz="4" w:space="0" w:color="CCCCCC"/>
+            </w:tcBorders>
+            <w:tcMar>
+              <w:top w:w="70" w:type="dxa"/>
+              <w:left w:w="110" w:type="dxa"/>
+              <w:bottom w:w="70" w:type="dxa"/>
+              <w:right w:w="110" w:type="dxa"/>
+            </w:tcMar>
+            <w:vAlign w:val="center"/>
+          </w:tcPr>
+          <w:p>
+            <w:pPr>
+              <w:spacing w:after="0"/>
+            </w:pPr>
+            <w:r>
+              <w:rPr>
+                <w:b w:val="0"/>
+                <w:color w:val="1E293B"/>
+                <w:sz w:val="19"/>
+              </w:rPr>
+              <w:t xml:space="preserve">Mid-range</w:t>
+            </w:r>
+          </w:p>
+        </w:tc>
+      </w:tr>
+    </w:tbl>
+    <w:p>
+      <w:pPr>
+        <w:spacing w:after="60"/>
+      </w:pPr>
+    </w:p>
+    <w:p>
+      <w:pPr>
+        <w:spacing w:after="120" w:before="0" w:line="276" w:lineRule="auto"/>
+      </w:pPr>
+      <w:r>
+        <w:rPr>
+          <w:b/>
+          <w:i w:val="0"/>
+          <w:color w:val="1E293B"/>
+          <w:sz w:val="21"/>
+        </w:rPr>
+        <w:t xml:space="preserve">Reading the VC Method bar. </w:t>
+      </w:r>
+      <w:r>
+        <w:rPr>
+          <w:b w:val="0"/>
+          <w:i w:val="0"/>
+          <w:color w:val="1E293B"/>
+          <w:sz w:val="21"/>
+        </w:rPr>
+        <w:t xml:space="preserve">It answers a different question from the other bars: </w:t>
+      </w:r>
+      <w:r>
+        <w:rPr>
+          <w:b/>
+          <w:i w:val="0"/>
+          <w:color w:val="1E293B"/>
+          <w:sz w:val="21"/>
+        </w:rPr>
+        <w:t xml:space="preserve">what would an investor demanding a venture-style return pay today?</w:t>
+      </w:r>
+      <w:r>
+        <w:rPr>
+          <w:b w:val="0"/>
+          <w:i w:val="0"/>
+          <w:color w:val="1E293B"/>
+          <w:sz w:val="21"/>
+        </w:rPr>
+        <w:t xml:space="preserve"> For Vipin Corporation (exit at 18× P/E in FY29E, 25% target IRR) the bar runs from about ₹51 to ₹304 with a base of ₹140, so it sits almost entirely to the left of the ₹310 price. Only the most generous corner of the grid (15% IRR, 23× exit) gets close to the price.</w:t>
+      </w:r>
+    </w:p>
+    <w:tbl>
+      <w:tblPr>
+        <w:tblW w:w="9360" w:type="dxa"/>
+        <w:jc w:val="center"/>
+        <w:tblLayout w:type="fixed"/>
+        <w:tblLook w:firstColumn="1" w:firstRow="1" w:lastColumn="0" w:lastRow="0" w:noHBand="0" w:noVBand="1" w:val="04A0"/>
+      </w:tblPr>
+      <w:tblGrid>
+        <w:gridCol w:w="9360"/>
+      </w:tblGrid>
+      <w:tr>
+        <w:tc>
+          <w:tcPr>
+            <w:tcW w:w="9360" w:type="dxa"/>
+            <w:tcBorders>
+              <w:top w:val="single" w:sz="4" w:space="0" w:color="E2E8F8"/>
+              <w:left w:val="single" w:sz="24" w:space="0" w:color="7209B7"/>
+              <w:bottom w:val="single" w:sz="4" w:space="0" w:color="E2E8F8"/>
+              <w:right w:val="single" w:sz="4" w:space="0" w:color="E2E8F8"/>
+            </w:tcBorders>
+            <w:shd w:val="clear" w:color="auto" w:fill="FBFBFE"/>
+            <w:tcMar>
+              <w:top w:w="120" w:type="dxa"/>
+              <w:left w:w="160" w:type="dxa"/>
+              <w:bottom w:w="120" w:type="dxa"/>
+              <w:right w:w="160" w:type="dxa"/>
+            </w:tcMar>
+          </w:tcPr>
+          <w:p>
+            <w:pPr>
+              <w:spacing w:after="60"/>
+            </w:pPr>
+            <w:r>
+              <w:rPr>
+                <w:b/>
+                <w:color w:val="7209B7"/>
+                <w:sz w:val="21"/>
+              </w:rPr>
+              <w:t>❖  Interpreting the VC bar on the field</w:t>
+            </w:r>
+          </w:p>
+          <w:p>
+            <w:pPr>
+              <w:spacing w:after="40"/>
+            </w:pPr>
+            <w:r>
+              <w:rPr>
+                <w:b w:val="0"/>
+                <w:i w:val="0"/>
+                <w:color w:val="1E293B"/>
+                <w:sz w:val="20"/>
+              </w:rPr>
+              <w:t xml:space="preserve">For a mature listed company the VC bar normally sits below the DCF and comps bars — the high hurdle rate prices in start-up risk the company no longer carries. Treat it as a return check, not a fair-value bar.</w:t>
+            </w:r>
+          </w:p>
+          <w:p>
+            <w:pPr>
+              <w:spacing w:after="40"/>
+            </w:pPr>
+            <w:r>
+              <w:rPr>
+                <w:b w:val="0"/>
+                <w:i w:val="0"/>
+                <w:color w:val="1E293B"/>
+                <w:sz w:val="20"/>
+              </w:rPr>
+              <w:t xml:space="preserve">If the price falls inside or below the VC bar, even a demanding investor would earn the hurdle IRR — a strong value signal.</w:t>
+            </w:r>
+          </w:p>
+          <w:p>
+            <w:pPr>
+              <w:spacing w:after="40"/>
+            </w:pPr>
+            <w:r>
+              <w:rPr>
+                <w:b w:val="0"/>
+                <w:i w:val="0"/>
+                <w:color w:val="1E293B"/>
+                <w:sz w:val="20"/>
+              </w:rPr>
+              <w:t xml:space="preserve">For start-ups and pre-profit companies the VC bar is often the main anchor, with EV/Sales comps as the cross-check.</w:t>
+            </w:r>
+          </w:p>
+          <w:p>
+            <w:pPr>
+              <w:spacing w:after="40"/>
+            </w:pPr>
+            <w:r>
+              <w:rPr>
+                <w:b w:val="0"/>
+                <w:i w:val="0"/>
+                <w:color w:val="1E293B"/>
+                <w:sz w:val="20"/>
+              </w:rPr>
+              <w:t xml:space="preserve">In ValuMetrics, the VC bar appears automatically in the Analyst View football field and in the PDF report.</w:t>
+            </w:r>
+          </w:p>
+        </w:tc>
+      </w:tr>
+    </w:tbl>
     <w:p>
       <w:r>
         <w:br w:type="page"/>

</xml_diff>

<commit_message>
Guide: add 9.1 Choosing the valuation approach
Shows how the headline target and rating for Vipin Corporation change
under each Approach preset in the app (Rs 140 STRONG SELL to Rs 328 BUY),
why the Stable profile is the right lens here (Rs 312, HOLD), and a
discipline box on choosing and weighting methods.

Co-Authored-By: Claude Opus 5.5 <noreply@anthropic.com>
Claude-Session: https://claude.ai/code/session_018hY48TnvoyExCnuZKmZVFd
</commit_message>
<xml_diff>
--- a/Valuation_Deep_Dive_Guide.docx
+++ b/Valuation_Deep_Dive_Guide.docx
@@ -17726,6 +17726,1149 @@
         <w:t>The methods cluster around the current price — a defensible HOLD. The discipline is not to chase a single number but to understand why the methods agree or disagree, and what would change the call.</w:t>
       </w:r>
     </w:p>
+    <w:p>
+      <w:pPr>
+        <w:pStyle w:val="Heading2"/>
+      </w:pPr>
+      <w:r>
+        <w:t xml:space="preserve">9.1  Choosing the valuation approach</w:t>
+      </w:r>
+    </w:p>
+    <w:p>
+      <w:pPr>
+        <w:spacing w:after="120" w:before="0" w:line="276" w:lineRule="auto"/>
+      </w:pPr>
+      <w:r>
+        <w:rPr>
+          <w:b w:val="0"/>
+          <w:i w:val="0"/>
+          <w:color w:val="1E293B"/>
+          <w:sz w:val="21"/>
+        </w:rPr>
+        <w:t xml:space="preserve">The triangulation above uses every method. In practice the investor decides </w:t>
+      </w:r>
+      <w:r>
+        <w:rPr>
+          <w:b w:val="0"/>
+          <w:i w:val="0"/>
+          <w:color w:val="1E293B"/>
+          <w:sz w:val="21"/>
+        </w:rPr>
+        <w:t xml:space="preserve">which methods fit the company</w:t>
+      </w:r>
+      <w:r>
+        <w:rPr>
+          <w:b w:val="0"/>
+          <w:i w:val="0"/>
+          <w:color w:val="1E293B"/>
+          <w:sz w:val="21"/>
+        </w:rPr>
+        <w:t xml:space="preserve"> and </w:t>
+      </w:r>
+      <w:r>
+        <w:rPr>
+          <w:b w:val="0"/>
+          <w:i w:val="0"/>
+          <w:color w:val="1E293B"/>
+          <w:sz w:val="21"/>
+        </w:rPr>
+        <w:t xml:space="preserve">how to combine them</w:t>
+      </w:r>
+      <w:r>
+        <w:rPr>
+          <w:b w:val="0"/>
+          <w:i w:val="0"/>
+          <w:color w:val="1E293B"/>
+          <w:sz w:val="21"/>
+        </w:rPr>
+        <w:t xml:space="preserve"> into one headline target. ValuMetrics asks this up front in its Approach dialog: pick a company profile (or tick methods yourself), then set the headline as one primary method or a weighted blend. Applied to Vipin Corporation, each preset gives:</w:t>
+      </w:r>
+    </w:p>
+    <w:tbl>
+      <w:tblPr>
+        <w:tblW w:w="9360" w:type="dxa"/>
+        <w:jc w:val="center"/>
+        <w:tblLayout w:type="fixed"/>
+        <w:tblLook w:firstColumn="1" w:firstRow="1" w:lastColumn="0" w:lastRow="0" w:noHBand="0" w:noVBand="1" w:val="04A0"/>
+      </w:tblPr>
+      <w:tblGrid>
+        <w:gridCol w:w="2300"/>
+        <w:gridCol w:w="3700"/>
+        <w:gridCol w:w="1860"/>
+        <w:gridCol w:w="1500"/>
+      </w:tblGrid>
+      <w:tr>
+        <w:tc>
+          <w:tcPr>
+            <w:tcW w:w="2300" w:type="dxa"/>
+            <w:tcBorders>
+              <w:top w:val="single" w:sz="4" w:space="0" w:color="CCCCCC"/>
+              <w:left w:val="single" w:sz="4" w:space="0" w:color="CCCCCC"/>
+              <w:bottom w:val="single" w:sz="4" w:space="0" w:color="CCCCCC"/>
+              <w:right w:val="single" w:sz="4" w:space="0" w:color="CCCCCC"/>
+            </w:tcBorders>
+            <w:shd w:val="clear" w:color="auto" w:fill="4361EE"/>
+            <w:tcMar>
+              <w:top w:w="70" w:type="dxa"/>
+              <w:left w:w="110" w:type="dxa"/>
+              <w:bottom w:w="70" w:type="dxa"/>
+              <w:right w:w="110" w:type="dxa"/>
+            </w:tcMar>
+            <w:vAlign w:val="center"/>
+          </w:tcPr>
+          <w:p>
+            <w:pPr>
+              <w:spacing w:after="0"/>
+            </w:pPr>
+            <w:r>
+              <w:rPr>
+                <w:b/>
+                <w:color w:val="FFFFFF"/>
+                <w:sz w:val="20"/>
+              </w:rPr>
+              <w:t xml:space="preserve">Approach (preset)</w:t>
+            </w:r>
+          </w:p>
+        </w:tc>
+        <w:tc>
+          <w:tcPr>
+            <w:tcW w:w="3700" w:type="dxa"/>
+            <w:tcBorders>
+              <w:top w:val="single" w:sz="4" w:space="0" w:color="CCCCCC"/>
+              <w:left w:val="single" w:sz="4" w:space="0" w:color="CCCCCC"/>
+              <w:bottom w:val="single" w:sz="4" w:space="0" w:color="CCCCCC"/>
+              <w:right w:val="single" w:sz="4" w:space="0" w:color="CCCCCC"/>
+            </w:tcBorders>
+            <w:shd w:val="clear" w:color="auto" w:fill="4361EE"/>
+            <w:tcMar>
+              <w:top w:w="70" w:type="dxa"/>
+              <w:left w:w="110" w:type="dxa"/>
+              <w:bottom w:w="70" w:type="dxa"/>
+              <w:right w:w="110" w:type="dxa"/>
+            </w:tcMar>
+            <w:vAlign w:val="center"/>
+          </w:tcPr>
+          <w:p>
+            <w:pPr>
+              <w:spacing w:after="0"/>
+            </w:pPr>
+            <w:r>
+              <w:rPr>
+                <w:b/>
+                <w:color w:val="FFFFFF"/>
+                <w:sz w:val="20"/>
+              </w:rPr>
+              <w:t xml:space="preserve">Methods &amp; weights</w:t>
+            </w:r>
+          </w:p>
+        </w:tc>
+        <w:tc>
+          <w:tcPr>
+            <w:tcW w:w="1860" w:type="dxa"/>
+            <w:tcBorders>
+              <w:top w:val="single" w:sz="4" w:space="0" w:color="CCCCCC"/>
+              <w:left w:val="single" w:sz="4" w:space="0" w:color="CCCCCC"/>
+              <w:bottom w:val="single" w:sz="4" w:space="0" w:color="CCCCCC"/>
+              <w:right w:val="single" w:sz="4" w:space="0" w:color="CCCCCC"/>
+            </w:tcBorders>
+            <w:shd w:val="clear" w:color="auto" w:fill="4361EE"/>
+            <w:tcMar>
+              <w:top w:w="70" w:type="dxa"/>
+              <w:left w:w="110" w:type="dxa"/>
+              <w:bottom w:w="70" w:type="dxa"/>
+              <w:right w:w="110" w:type="dxa"/>
+            </w:tcMar>
+            <w:vAlign w:val="center"/>
+          </w:tcPr>
+          <w:p>
+            <w:pPr>
+              <w:spacing w:after="0"/>
+            </w:pPr>
+            <w:r>
+              <w:rPr>
+                <w:b/>
+                <w:color w:val="FFFFFF"/>
+                <w:sz w:val="20"/>
+              </w:rPr>
+              <w:t xml:space="preserve">Headline target</w:t>
+            </w:r>
+          </w:p>
+        </w:tc>
+        <w:tc>
+          <w:tcPr>
+            <w:tcW w:w="1500" w:type="dxa"/>
+            <w:tcBorders>
+              <w:top w:val="single" w:sz="4" w:space="0" w:color="CCCCCC"/>
+              <w:left w:val="single" w:sz="4" w:space="0" w:color="CCCCCC"/>
+              <w:bottom w:val="single" w:sz="4" w:space="0" w:color="CCCCCC"/>
+              <w:right w:val="single" w:sz="4" w:space="0" w:color="CCCCCC"/>
+            </w:tcBorders>
+            <w:shd w:val="clear" w:color="auto" w:fill="4361EE"/>
+            <w:tcMar>
+              <w:top w:w="70" w:type="dxa"/>
+              <w:left w:w="110" w:type="dxa"/>
+              <w:bottom w:w="70" w:type="dxa"/>
+              <w:right w:w="110" w:type="dxa"/>
+            </w:tcMar>
+            <w:vAlign w:val="center"/>
+          </w:tcPr>
+          <w:p>
+            <w:pPr>
+              <w:spacing w:after="0"/>
+            </w:pPr>
+            <w:r>
+              <w:rPr>
+                <w:b/>
+                <w:color w:val="FFFFFF"/>
+                <w:sz w:val="20"/>
+              </w:rPr>
+              <w:t xml:space="preserve">Rating</w:t>
+            </w:r>
+          </w:p>
+        </w:tc>
+      </w:tr>
+      <w:tr>
+        <w:tc>
+          <w:tcPr>
+            <w:tcW w:w="2300" w:type="dxa"/>
+            <w:tcBorders>
+              <w:top w:val="single" w:sz="4" w:space="0" w:color="CCCCCC"/>
+              <w:left w:val="single" w:sz="4" w:space="0" w:color="CCCCCC"/>
+              <w:bottom w:val="single" w:sz="4" w:space="0" w:color="CCCCCC"/>
+              <w:right w:val="single" w:sz="4" w:space="0" w:color="CCCCCC"/>
+            </w:tcBorders>
+            <w:shd w:val="clear" w:color="auto" w:fill="EEF2FF"/>
+            <w:tcMar>
+              <w:top w:w="70" w:type="dxa"/>
+              <w:left w:w="110" w:type="dxa"/>
+              <w:bottom w:w="70" w:type="dxa"/>
+              <w:right w:w="110" w:type="dxa"/>
+            </w:tcMar>
+            <w:vAlign w:val="center"/>
+          </w:tcPr>
+          <w:p>
+            <w:pPr>
+              <w:spacing w:after="0"/>
+            </w:pPr>
+            <w:r>
+              <w:rPr>
+                <w:b/>
+                <w:color w:val="1E293B"/>
+                <w:sz w:val="19"/>
+              </w:rPr>
+              <w:t xml:space="preserve">Stable, cash-generative</w:t>
+            </w:r>
+          </w:p>
+        </w:tc>
+        <w:tc>
+          <w:tcPr>
+            <w:tcW w:w="3700" w:type="dxa"/>
+            <w:tcBorders>
+              <w:top w:val="single" w:sz="4" w:space="0" w:color="CCCCCC"/>
+              <w:left w:val="single" w:sz="4" w:space="0" w:color="CCCCCC"/>
+              <w:bottom w:val="single" w:sz="4" w:space="0" w:color="CCCCCC"/>
+              <w:right w:val="single" w:sz="4" w:space="0" w:color="CCCCCC"/>
+            </w:tcBorders>
+            <w:shd w:val="clear" w:color="auto" w:fill="EEF2FF"/>
+            <w:tcMar>
+              <w:top w:w="70" w:type="dxa"/>
+              <w:left w:w="110" w:type="dxa"/>
+              <w:bottom w:w="70" w:type="dxa"/>
+              <w:right w:w="110" w:type="dxa"/>
+            </w:tcMar>
+            <w:vAlign w:val="center"/>
+          </w:tcPr>
+          <w:p>
+            <w:pPr>
+              <w:spacing w:after="0"/>
+            </w:pPr>
+            <w:r>
+              <w:rPr>
+                <w:b/>
+                <w:color w:val="1E293B"/>
+                <w:sz w:val="19"/>
+              </w:rPr>
+              <w:t xml:space="preserve">DCF (FCFF) primary; exit multiple &amp; EV/EBITDA comps as cross-checks</w:t>
+            </w:r>
+          </w:p>
+        </w:tc>
+        <w:tc>
+          <w:tcPr>
+            <w:tcW w:w="1860" w:type="dxa"/>
+            <w:tcBorders>
+              <w:top w:val="single" w:sz="4" w:space="0" w:color="CCCCCC"/>
+              <w:left w:val="single" w:sz="4" w:space="0" w:color="CCCCCC"/>
+              <w:bottom w:val="single" w:sz="4" w:space="0" w:color="CCCCCC"/>
+              <w:right w:val="single" w:sz="4" w:space="0" w:color="CCCCCC"/>
+            </w:tcBorders>
+            <w:shd w:val="clear" w:color="auto" w:fill="EEF2FF"/>
+            <w:tcMar>
+              <w:top w:w="70" w:type="dxa"/>
+              <w:left w:w="110" w:type="dxa"/>
+              <w:bottom w:w="70" w:type="dxa"/>
+              <w:right w:w="110" w:type="dxa"/>
+            </w:tcMar>
+            <w:vAlign w:val="center"/>
+          </w:tcPr>
+          <w:p>
+            <w:pPr>
+              <w:spacing w:after="0"/>
+            </w:pPr>
+            <w:r>
+              <w:rPr>
+                <w:b/>
+                <w:color w:val="1E293B"/>
+                <w:sz w:val="19"/>
+              </w:rPr>
+              <w:t xml:space="preserve">₹ 312 (+0.5%)</w:t>
+            </w:r>
+          </w:p>
+        </w:tc>
+        <w:tc>
+          <w:tcPr>
+            <w:tcW w:w="1500" w:type="dxa"/>
+            <w:tcBorders>
+              <w:top w:val="single" w:sz="4" w:space="0" w:color="CCCCCC"/>
+              <w:left w:val="single" w:sz="4" w:space="0" w:color="CCCCCC"/>
+              <w:bottom w:val="single" w:sz="4" w:space="0" w:color="CCCCCC"/>
+              <w:right w:val="single" w:sz="4" w:space="0" w:color="CCCCCC"/>
+            </w:tcBorders>
+            <w:shd w:val="clear" w:color="auto" w:fill="EEF2FF"/>
+            <w:tcMar>
+              <w:top w:w="70" w:type="dxa"/>
+              <w:left w:w="110" w:type="dxa"/>
+              <w:bottom w:w="70" w:type="dxa"/>
+              <w:right w:w="110" w:type="dxa"/>
+            </w:tcMar>
+            <w:vAlign w:val="center"/>
+          </w:tcPr>
+          <w:p>
+            <w:pPr>
+              <w:spacing w:after="0"/>
+            </w:pPr>
+            <w:r>
+              <w:rPr>
+                <w:b/>
+                <w:color w:val="1E293B"/>
+                <w:sz w:val="19"/>
+              </w:rPr>
+              <w:t xml:space="preserve">HOLD</w:t>
+            </w:r>
+          </w:p>
+        </w:tc>
+      </w:tr>
+      <w:tr>
+        <w:tc>
+          <w:tcPr>
+            <w:tcW w:w="2300" w:type="dxa"/>
+            <w:tcBorders>
+              <w:top w:val="single" w:sz="4" w:space="0" w:color="CCCCCC"/>
+              <w:left w:val="single" w:sz="4" w:space="0" w:color="CCCCCC"/>
+              <w:bottom w:val="single" w:sz="4" w:space="0" w:color="CCCCCC"/>
+              <w:right w:val="single" w:sz="4" w:space="0" w:color="CCCCCC"/>
+            </w:tcBorders>
+            <w:tcMar>
+              <w:top w:w="70" w:type="dxa"/>
+              <w:left w:w="110" w:type="dxa"/>
+              <w:bottom w:w="70" w:type="dxa"/>
+              <w:right w:w="110" w:type="dxa"/>
+            </w:tcMar>
+            <w:vAlign w:val="center"/>
+          </w:tcPr>
+          <w:p>
+            <w:pPr>
+              <w:spacing w:after="0"/>
+            </w:pPr>
+            <w:r>
+              <w:rPr>
+                <w:b w:val="0"/>
+                <w:color w:val="1E293B"/>
+                <w:sz w:val="19"/>
+              </w:rPr>
+              <w:t xml:space="preserve">High-growth / pre-profit</w:t>
+            </w:r>
+          </w:p>
+        </w:tc>
+        <w:tc>
+          <w:tcPr>
+            <w:tcW w:w="3700" w:type="dxa"/>
+            <w:tcBorders>
+              <w:top w:val="single" w:sz="4" w:space="0" w:color="CCCCCC"/>
+              <w:left w:val="single" w:sz="4" w:space="0" w:color="CCCCCC"/>
+              <w:bottom w:val="single" w:sz="4" w:space="0" w:color="CCCCCC"/>
+              <w:right w:val="single" w:sz="4" w:space="0" w:color="CCCCCC"/>
+            </w:tcBorders>
+            <w:tcMar>
+              <w:top w:w="70" w:type="dxa"/>
+              <w:left w:w="110" w:type="dxa"/>
+              <w:bottom w:w="70" w:type="dxa"/>
+              <w:right w:w="110" w:type="dxa"/>
+            </w:tcMar>
+            <w:vAlign w:val="center"/>
+          </w:tcPr>
+          <w:p>
+            <w:pPr>
+              <w:spacing w:after="0"/>
+            </w:pPr>
+            <w:r>
+              <w:rPr>
+                <w:b w:val="0"/>
+                <w:color w:val="1E293B"/>
+                <w:sz w:val="19"/>
+              </w:rPr>
+              <w:t xml:space="preserve">Scenario DCF 60% + EV/Sales comps 40%</w:t>
+            </w:r>
+          </w:p>
+        </w:tc>
+        <w:tc>
+          <w:tcPr>
+            <w:tcW w:w="1860" w:type="dxa"/>
+            <w:tcBorders>
+              <w:top w:val="single" w:sz="4" w:space="0" w:color="CCCCCC"/>
+              <w:left w:val="single" w:sz="4" w:space="0" w:color="CCCCCC"/>
+              <w:bottom w:val="single" w:sz="4" w:space="0" w:color="CCCCCC"/>
+              <w:right w:val="single" w:sz="4" w:space="0" w:color="CCCCCC"/>
+            </w:tcBorders>
+            <w:tcMar>
+              <w:top w:w="70" w:type="dxa"/>
+              <w:left w:w="110" w:type="dxa"/>
+              <w:bottom w:w="70" w:type="dxa"/>
+              <w:right w:w="110" w:type="dxa"/>
+            </w:tcMar>
+            <w:vAlign w:val="center"/>
+          </w:tcPr>
+          <w:p>
+            <w:pPr>
+              <w:spacing w:after="0"/>
+            </w:pPr>
+            <w:r>
+              <w:rPr>
+                <w:b w:val="0"/>
+                <w:color w:val="1E293B"/>
+                <w:sz w:val="19"/>
+              </w:rPr>
+              <w:t xml:space="preserve">₹ 273 (−11.8%)</w:t>
+            </w:r>
+          </w:p>
+        </w:tc>
+        <w:tc>
+          <w:tcPr>
+            <w:tcW w:w="1500" w:type="dxa"/>
+            <w:tcBorders>
+              <w:top w:val="single" w:sz="4" w:space="0" w:color="CCCCCC"/>
+              <w:left w:val="single" w:sz="4" w:space="0" w:color="CCCCCC"/>
+              <w:bottom w:val="single" w:sz="4" w:space="0" w:color="CCCCCC"/>
+              <w:right w:val="single" w:sz="4" w:space="0" w:color="CCCCCC"/>
+            </w:tcBorders>
+            <w:tcMar>
+              <w:top w:w="70" w:type="dxa"/>
+              <w:left w:w="110" w:type="dxa"/>
+              <w:bottom w:w="70" w:type="dxa"/>
+              <w:right w:w="110" w:type="dxa"/>
+            </w:tcMar>
+            <w:vAlign w:val="center"/>
+          </w:tcPr>
+          <w:p>
+            <w:pPr>
+              <w:spacing w:after="0"/>
+            </w:pPr>
+            <w:r>
+              <w:rPr>
+                <w:b w:val="0"/>
+                <w:color w:val="1E293B"/>
+                <w:sz w:val="19"/>
+              </w:rPr>
+              <w:t xml:space="preserve">SELL</w:t>
+            </w:r>
+          </w:p>
+        </w:tc>
+      </w:tr>
+      <w:tr>
+        <w:tc>
+          <w:tcPr>
+            <w:tcW w:w="2300" w:type="dxa"/>
+            <w:tcBorders>
+              <w:top w:val="single" w:sz="4" w:space="0" w:color="CCCCCC"/>
+              <w:left w:val="single" w:sz="4" w:space="0" w:color="CCCCCC"/>
+              <w:bottom w:val="single" w:sz="4" w:space="0" w:color="CCCCCC"/>
+              <w:right w:val="single" w:sz="4" w:space="0" w:color="CCCCCC"/>
+            </w:tcBorders>
+            <w:shd w:val="clear" w:color="auto" w:fill="F7F9FF"/>
+            <w:tcMar>
+              <w:top w:w="70" w:type="dxa"/>
+              <w:left w:w="110" w:type="dxa"/>
+              <w:bottom w:w="70" w:type="dxa"/>
+              <w:right w:w="110" w:type="dxa"/>
+            </w:tcMar>
+            <w:vAlign w:val="center"/>
+          </w:tcPr>
+          <w:p>
+            <w:pPr>
+              <w:spacing w:after="0"/>
+            </w:pPr>
+            <w:r>
+              <w:rPr>
+                <w:b w:val="0"/>
+                <w:color w:val="1E293B"/>
+                <w:sz w:val="19"/>
+              </w:rPr>
+              <w:t xml:space="preserve">Start-up / VC-backed</w:t>
+            </w:r>
+          </w:p>
+        </w:tc>
+        <w:tc>
+          <w:tcPr>
+            <w:tcW w:w="3700" w:type="dxa"/>
+            <w:tcBorders>
+              <w:top w:val="single" w:sz="4" w:space="0" w:color="CCCCCC"/>
+              <w:left w:val="single" w:sz="4" w:space="0" w:color="CCCCCC"/>
+              <w:bottom w:val="single" w:sz="4" w:space="0" w:color="CCCCCC"/>
+              <w:right w:val="single" w:sz="4" w:space="0" w:color="CCCCCC"/>
+            </w:tcBorders>
+            <w:shd w:val="clear" w:color="auto" w:fill="F7F9FF"/>
+            <w:tcMar>
+              <w:top w:w="70" w:type="dxa"/>
+              <w:left w:w="110" w:type="dxa"/>
+              <w:bottom w:w="70" w:type="dxa"/>
+              <w:right w:w="110" w:type="dxa"/>
+            </w:tcMar>
+            <w:vAlign w:val="center"/>
+          </w:tcPr>
+          <w:p>
+            <w:pPr>
+              <w:spacing w:after="0"/>
+            </w:pPr>
+            <w:r>
+              <w:rPr>
+                <w:b w:val="0"/>
+                <w:color w:val="1E293B"/>
+                <w:sz w:val="19"/>
+              </w:rPr>
+              <w:t xml:space="preserve">VC Method primary; EV/Sales comps as cross-check</w:t>
+            </w:r>
+          </w:p>
+        </w:tc>
+        <w:tc>
+          <w:tcPr>
+            <w:tcW w:w="1860" w:type="dxa"/>
+            <w:tcBorders>
+              <w:top w:val="single" w:sz="4" w:space="0" w:color="CCCCCC"/>
+              <w:left w:val="single" w:sz="4" w:space="0" w:color="CCCCCC"/>
+              <w:bottom w:val="single" w:sz="4" w:space="0" w:color="CCCCCC"/>
+              <w:right w:val="single" w:sz="4" w:space="0" w:color="CCCCCC"/>
+            </w:tcBorders>
+            <w:shd w:val="clear" w:color="auto" w:fill="F7F9FF"/>
+            <w:tcMar>
+              <w:top w:w="70" w:type="dxa"/>
+              <w:left w:w="110" w:type="dxa"/>
+              <w:bottom w:w="70" w:type="dxa"/>
+              <w:right w:w="110" w:type="dxa"/>
+            </w:tcMar>
+            <w:vAlign w:val="center"/>
+          </w:tcPr>
+          <w:p>
+            <w:pPr>
+              <w:spacing w:after="0"/>
+            </w:pPr>
+            <w:r>
+              <w:rPr>
+                <w:b w:val="0"/>
+                <w:color w:val="1E293B"/>
+                <w:sz w:val="19"/>
+              </w:rPr>
+              <w:t xml:space="preserve">₹ 140 (−55.0%)</w:t>
+            </w:r>
+          </w:p>
+        </w:tc>
+        <w:tc>
+          <w:tcPr>
+            <w:tcW w:w="1500" w:type="dxa"/>
+            <w:tcBorders>
+              <w:top w:val="single" w:sz="4" w:space="0" w:color="CCCCCC"/>
+              <w:left w:val="single" w:sz="4" w:space="0" w:color="CCCCCC"/>
+              <w:bottom w:val="single" w:sz="4" w:space="0" w:color="CCCCCC"/>
+              <w:right w:val="single" w:sz="4" w:space="0" w:color="CCCCCC"/>
+            </w:tcBorders>
+            <w:shd w:val="clear" w:color="auto" w:fill="F7F9FF"/>
+            <w:tcMar>
+              <w:top w:w="70" w:type="dxa"/>
+              <w:left w:w="110" w:type="dxa"/>
+              <w:bottom w:w="70" w:type="dxa"/>
+              <w:right w:w="110" w:type="dxa"/>
+            </w:tcMar>
+            <w:vAlign w:val="center"/>
+          </w:tcPr>
+          <w:p>
+            <w:pPr>
+              <w:spacing w:after="0"/>
+            </w:pPr>
+            <w:r>
+              <w:rPr>
+                <w:b w:val="0"/>
+                <w:color w:val="1E293B"/>
+                <w:sz w:val="19"/>
+              </w:rPr>
+              <w:t xml:space="preserve">STRONG SELL</w:t>
+            </w:r>
+          </w:p>
+        </w:tc>
+      </w:tr>
+      <w:tr>
+        <w:tc>
+          <w:tcPr>
+            <w:tcW w:w="2300" w:type="dxa"/>
+            <w:tcBorders>
+              <w:top w:val="single" w:sz="4" w:space="0" w:color="CCCCCC"/>
+              <w:left w:val="single" w:sz="4" w:space="0" w:color="CCCCCC"/>
+              <w:bottom w:val="single" w:sz="4" w:space="0" w:color="CCCCCC"/>
+              <w:right w:val="single" w:sz="4" w:space="0" w:color="CCCCCC"/>
+            </w:tcBorders>
+            <w:tcMar>
+              <w:top w:w="70" w:type="dxa"/>
+              <w:left w:w="110" w:type="dxa"/>
+              <w:bottom w:w="70" w:type="dxa"/>
+              <w:right w:w="110" w:type="dxa"/>
+            </w:tcMar>
+            <w:vAlign w:val="center"/>
+          </w:tcPr>
+          <w:p>
+            <w:pPr>
+              <w:spacing w:after="0"/>
+            </w:pPr>
+            <w:r>
+              <w:rPr>
+                <w:b w:val="0"/>
+                <w:color w:val="1E293B"/>
+                <w:sz w:val="19"/>
+              </w:rPr>
+              <w:t xml:space="preserve">Bank / insurer</w:t>
+            </w:r>
+          </w:p>
+        </w:tc>
+        <w:tc>
+          <w:tcPr>
+            <w:tcW w:w="3700" w:type="dxa"/>
+            <w:tcBorders>
+              <w:top w:val="single" w:sz="4" w:space="0" w:color="CCCCCC"/>
+              <w:left w:val="single" w:sz="4" w:space="0" w:color="CCCCCC"/>
+              <w:bottom w:val="single" w:sz="4" w:space="0" w:color="CCCCCC"/>
+              <w:right w:val="single" w:sz="4" w:space="0" w:color="CCCCCC"/>
+            </w:tcBorders>
+            <w:tcMar>
+              <w:top w:w="70" w:type="dxa"/>
+              <w:left w:w="110" w:type="dxa"/>
+              <w:bottom w:w="70" w:type="dxa"/>
+              <w:right w:w="110" w:type="dxa"/>
+            </w:tcMar>
+            <w:vAlign w:val="center"/>
+          </w:tcPr>
+          <w:p>
+            <w:pPr>
+              <w:spacing w:after="0"/>
+            </w:pPr>
+            <w:r>
+              <w:rPr>
+                <w:b w:val="0"/>
+                <w:color w:val="1E293B"/>
+                <w:sz w:val="19"/>
+              </w:rPr>
+              <w:t xml:space="preserve">FCFE 60% + P/BV comps 40%</w:t>
+            </w:r>
+          </w:p>
+        </w:tc>
+        <w:tc>
+          <w:tcPr>
+            <w:tcW w:w="1860" w:type="dxa"/>
+            <w:tcBorders>
+              <w:top w:val="single" w:sz="4" w:space="0" w:color="CCCCCC"/>
+              <w:left w:val="single" w:sz="4" w:space="0" w:color="CCCCCC"/>
+              <w:bottom w:val="single" w:sz="4" w:space="0" w:color="CCCCCC"/>
+              <w:right w:val="single" w:sz="4" w:space="0" w:color="CCCCCC"/>
+            </w:tcBorders>
+            <w:tcMar>
+              <w:top w:w="70" w:type="dxa"/>
+              <w:left w:w="110" w:type="dxa"/>
+              <w:bottom w:w="70" w:type="dxa"/>
+              <w:right w:w="110" w:type="dxa"/>
+            </w:tcMar>
+            <w:vAlign w:val="center"/>
+          </w:tcPr>
+          <w:p>
+            <w:pPr>
+              <w:spacing w:after="0"/>
+            </w:pPr>
+            <w:r>
+              <w:rPr>
+                <w:b w:val="0"/>
+                <w:color w:val="1E293B"/>
+                <w:sz w:val="19"/>
+              </w:rPr>
+              <w:t xml:space="preserve">₹ 233 (−24.8%)</w:t>
+            </w:r>
+          </w:p>
+        </w:tc>
+        <w:tc>
+          <w:tcPr>
+            <w:tcW w:w="1500" w:type="dxa"/>
+            <w:tcBorders>
+              <w:top w:val="single" w:sz="4" w:space="0" w:color="CCCCCC"/>
+              <w:left w:val="single" w:sz="4" w:space="0" w:color="CCCCCC"/>
+              <w:bottom w:val="single" w:sz="4" w:space="0" w:color="CCCCCC"/>
+              <w:right w:val="single" w:sz="4" w:space="0" w:color="CCCCCC"/>
+            </w:tcBorders>
+            <w:tcMar>
+              <w:top w:w="70" w:type="dxa"/>
+              <w:left w:w="110" w:type="dxa"/>
+              <w:bottom w:w="70" w:type="dxa"/>
+              <w:right w:w="110" w:type="dxa"/>
+            </w:tcMar>
+            <w:vAlign w:val="center"/>
+          </w:tcPr>
+          <w:p>
+            <w:pPr>
+              <w:spacing w:after="0"/>
+            </w:pPr>
+            <w:r>
+              <w:rPr>
+                <w:b w:val="0"/>
+                <w:color w:val="1E293B"/>
+                <w:sz w:val="19"/>
+              </w:rPr>
+              <w:t xml:space="preserve">STRONG SELL</w:t>
+            </w:r>
+          </w:p>
+        </w:tc>
+      </w:tr>
+      <w:tr>
+        <w:tc>
+          <w:tcPr>
+            <w:tcW w:w="2300" w:type="dxa"/>
+            <w:tcBorders>
+              <w:top w:val="single" w:sz="4" w:space="0" w:color="CCCCCC"/>
+              <w:left w:val="single" w:sz="4" w:space="0" w:color="CCCCCC"/>
+              <w:bottom w:val="single" w:sz="4" w:space="0" w:color="CCCCCC"/>
+              <w:right w:val="single" w:sz="4" w:space="0" w:color="CCCCCC"/>
+            </w:tcBorders>
+            <w:shd w:val="clear" w:color="auto" w:fill="F7F9FF"/>
+            <w:tcMar>
+              <w:top w:w="70" w:type="dxa"/>
+              <w:left w:w="110" w:type="dxa"/>
+              <w:bottom w:w="70" w:type="dxa"/>
+              <w:right w:w="110" w:type="dxa"/>
+            </w:tcMar>
+            <w:vAlign w:val="center"/>
+          </w:tcPr>
+          <w:p>
+            <w:pPr>
+              <w:spacing w:after="0"/>
+            </w:pPr>
+            <w:r>
+              <w:rPr>
+                <w:b w:val="0"/>
+                <w:color w:val="1E293B"/>
+                <w:sz w:val="19"/>
+              </w:rPr>
+              <w:t xml:space="preserve">M&amp;A / acquisition</w:t>
+            </w:r>
+          </w:p>
+        </w:tc>
+        <w:tc>
+          <w:tcPr>
+            <w:tcW w:w="3700" w:type="dxa"/>
+            <w:tcBorders>
+              <w:top w:val="single" w:sz="4" w:space="0" w:color="CCCCCC"/>
+              <w:left w:val="single" w:sz="4" w:space="0" w:color="CCCCCC"/>
+              <w:bottom w:val="single" w:sz="4" w:space="0" w:color="CCCCCC"/>
+              <w:right w:val="single" w:sz="4" w:space="0" w:color="CCCCCC"/>
+            </w:tcBorders>
+            <w:shd w:val="clear" w:color="auto" w:fill="F7F9FF"/>
+            <w:tcMar>
+              <w:top w:w="70" w:type="dxa"/>
+              <w:left w:w="110" w:type="dxa"/>
+              <w:bottom w:w="70" w:type="dxa"/>
+              <w:right w:w="110" w:type="dxa"/>
+            </w:tcMar>
+            <w:vAlign w:val="center"/>
+          </w:tcPr>
+          <w:p>
+            <w:pPr>
+              <w:spacing w:after="0"/>
+            </w:pPr>
+            <w:r>
+              <w:rPr>
+                <w:b w:val="0"/>
+                <w:color w:val="1E293B"/>
+                <w:sz w:val="19"/>
+              </w:rPr>
+              <w:t xml:space="preserve">FCFF 40% + exit multiple 30% + EV/EBITDA comps 30%</w:t>
+            </w:r>
+          </w:p>
+        </w:tc>
+        <w:tc>
+          <w:tcPr>
+            <w:tcW w:w="1860" w:type="dxa"/>
+            <w:tcBorders>
+              <w:top w:val="single" w:sz="4" w:space="0" w:color="CCCCCC"/>
+              <w:left w:val="single" w:sz="4" w:space="0" w:color="CCCCCC"/>
+              <w:bottom w:val="single" w:sz="4" w:space="0" w:color="CCCCCC"/>
+              <w:right w:val="single" w:sz="4" w:space="0" w:color="CCCCCC"/>
+            </w:tcBorders>
+            <w:shd w:val="clear" w:color="auto" w:fill="F7F9FF"/>
+            <w:tcMar>
+              <w:top w:w="70" w:type="dxa"/>
+              <w:left w:w="110" w:type="dxa"/>
+              <w:bottom w:w="70" w:type="dxa"/>
+              <w:right w:w="110" w:type="dxa"/>
+            </w:tcMar>
+            <w:vAlign w:val="center"/>
+          </w:tcPr>
+          <w:p>
+            <w:pPr>
+              <w:spacing w:after="0"/>
+            </w:pPr>
+            <w:r>
+              <w:rPr>
+                <w:b w:val="0"/>
+                <w:color w:val="1E293B"/>
+                <w:sz w:val="19"/>
+              </w:rPr>
+              <w:t xml:space="preserve">₹ 328 (+5.7%)</w:t>
+            </w:r>
+          </w:p>
+        </w:tc>
+        <w:tc>
+          <w:tcPr>
+            <w:tcW w:w="1500" w:type="dxa"/>
+            <w:tcBorders>
+              <w:top w:val="single" w:sz="4" w:space="0" w:color="CCCCCC"/>
+              <w:left w:val="single" w:sz="4" w:space="0" w:color="CCCCCC"/>
+              <w:bottom w:val="single" w:sz="4" w:space="0" w:color="CCCCCC"/>
+              <w:right w:val="single" w:sz="4" w:space="0" w:color="CCCCCC"/>
+            </w:tcBorders>
+            <w:shd w:val="clear" w:color="auto" w:fill="F7F9FF"/>
+            <w:tcMar>
+              <w:top w:w="70" w:type="dxa"/>
+              <w:left w:w="110" w:type="dxa"/>
+              <w:bottom w:w="70" w:type="dxa"/>
+              <w:right w:w="110" w:type="dxa"/>
+            </w:tcMar>
+            <w:vAlign w:val="center"/>
+          </w:tcPr>
+          <w:p>
+            <w:pPr>
+              <w:spacing w:after="0"/>
+            </w:pPr>
+            <w:r>
+              <w:rPr>
+                <w:b w:val="0"/>
+                <w:color w:val="1E293B"/>
+                <w:sz w:val="19"/>
+              </w:rPr>
+              <w:t xml:space="preserve">BUY</w:t>
+            </w:r>
+          </w:p>
+        </w:tc>
+      </w:tr>
+      <w:tr>
+        <w:tc>
+          <w:tcPr>
+            <w:tcW w:w="2300" w:type="dxa"/>
+            <w:tcBorders>
+              <w:top w:val="single" w:sz="4" w:space="0" w:color="CCCCCC"/>
+              <w:left w:val="single" w:sz="4" w:space="0" w:color="CCCCCC"/>
+              <w:bottom w:val="single" w:sz="4" w:space="0" w:color="CCCCCC"/>
+              <w:right w:val="single" w:sz="4" w:space="0" w:color="CCCCCC"/>
+            </w:tcBorders>
+            <w:tcMar>
+              <w:top w:w="70" w:type="dxa"/>
+              <w:left w:w="110" w:type="dxa"/>
+              <w:bottom w:w="70" w:type="dxa"/>
+              <w:right w:w="110" w:type="dxa"/>
+            </w:tcMar>
+            <w:vAlign w:val="center"/>
+          </w:tcPr>
+          <w:p>
+            <w:pPr>
+              <w:spacing w:after="0"/>
+            </w:pPr>
+            <w:r>
+              <w:rPr>
+                <w:b w:val="0"/>
+                <w:color w:val="1E293B"/>
+                <w:sz w:val="19"/>
+              </w:rPr>
+              <w:t xml:space="preserve">Full institutional</w:t>
+            </w:r>
+          </w:p>
+        </w:tc>
+        <w:tc>
+          <w:tcPr>
+            <w:tcW w:w="3700" w:type="dxa"/>
+            <w:tcBorders>
+              <w:top w:val="single" w:sz="4" w:space="0" w:color="CCCCCC"/>
+              <w:left w:val="single" w:sz="4" w:space="0" w:color="CCCCCC"/>
+              <w:bottom w:val="single" w:sz="4" w:space="0" w:color="CCCCCC"/>
+              <w:right w:val="single" w:sz="4" w:space="0" w:color="CCCCCC"/>
+            </w:tcBorders>
+            <w:tcMar>
+              <w:top w:w="70" w:type="dxa"/>
+              <w:left w:w="110" w:type="dxa"/>
+              <w:bottom w:w="70" w:type="dxa"/>
+              <w:right w:w="110" w:type="dxa"/>
+            </w:tcMar>
+            <w:vAlign w:val="center"/>
+          </w:tcPr>
+          <w:p>
+            <w:pPr>
+              <w:spacing w:after="0"/>
+            </w:pPr>
+            <w:r>
+              <w:rPr>
+                <w:b w:val="0"/>
+                <w:color w:val="1E293B"/>
+                <w:sz w:val="19"/>
+              </w:rPr>
+              <w:t xml:space="preserve">All six methods: FCFF 30, exit 10, FCFE 10, scenarios 20, comps 20, VC 10</w:t>
+            </w:r>
+          </w:p>
+        </w:tc>
+        <w:tc>
+          <w:tcPr>
+            <w:tcW w:w="1860" w:type="dxa"/>
+            <w:tcBorders>
+              <w:top w:val="single" w:sz="4" w:space="0" w:color="CCCCCC"/>
+              <w:left w:val="single" w:sz="4" w:space="0" w:color="CCCCCC"/>
+              <w:bottom w:val="single" w:sz="4" w:space="0" w:color="CCCCCC"/>
+              <w:right w:val="single" w:sz="4" w:space="0" w:color="CCCCCC"/>
+            </w:tcBorders>
+            <w:tcMar>
+              <w:top w:w="70" w:type="dxa"/>
+              <w:left w:w="110" w:type="dxa"/>
+              <w:bottom w:w="70" w:type="dxa"/>
+              <w:right w:w="110" w:type="dxa"/>
+            </w:tcMar>
+            <w:vAlign w:val="center"/>
+          </w:tcPr>
+          <w:p>
+            <w:pPr>
+              <w:spacing w:after="0"/>
+            </w:pPr>
+            <w:r>
+              <w:rPr>
+                <w:b w:val="0"/>
+                <w:color w:val="1E293B"/>
+                <w:sz w:val="19"/>
+              </w:rPr>
+              <w:t xml:space="preserve">₹ 299 (−3.6%)</w:t>
+            </w:r>
+          </w:p>
+        </w:tc>
+        <w:tc>
+          <w:tcPr>
+            <w:tcW w:w="1500" w:type="dxa"/>
+            <w:tcBorders>
+              <w:top w:val="single" w:sz="4" w:space="0" w:color="CCCCCC"/>
+              <w:left w:val="single" w:sz="4" w:space="0" w:color="CCCCCC"/>
+              <w:bottom w:val="single" w:sz="4" w:space="0" w:color="CCCCCC"/>
+              <w:right w:val="single" w:sz="4" w:space="0" w:color="CCCCCC"/>
+            </w:tcBorders>
+            <w:tcMar>
+              <w:top w:w="70" w:type="dxa"/>
+              <w:left w:w="110" w:type="dxa"/>
+              <w:bottom w:w="70" w:type="dxa"/>
+              <w:right w:w="110" w:type="dxa"/>
+            </w:tcMar>
+            <w:vAlign w:val="center"/>
+          </w:tcPr>
+          <w:p>
+            <w:pPr>
+              <w:spacing w:after="0"/>
+            </w:pPr>
+            <w:r>
+              <w:rPr>
+                <w:b w:val="0"/>
+                <w:color w:val="1E293B"/>
+                <w:sz w:val="19"/>
+              </w:rPr>
+              <w:t xml:space="preserve">HOLD</w:t>
+            </w:r>
+          </w:p>
+        </w:tc>
+      </w:tr>
+    </w:tbl>
+    <w:p>
+      <w:pPr>
+        <w:spacing w:after="60"/>
+      </w:pPr>
+    </w:p>
+    <w:p>
+      <w:pPr>
+        <w:spacing w:after="120" w:before="0" w:line="276" w:lineRule="auto"/>
+      </w:pPr>
+      <w:r>
+        <w:rPr>
+          <w:b w:val="0"/>
+          <w:i w:val="0"/>
+          <w:color w:val="1E293B"/>
+          <w:sz w:val="21"/>
+        </w:rPr>
+        <w:t xml:space="preserve">The same company ranges from </w:t>
+      </w:r>
+      <w:r>
+        <w:rPr>
+          <w:b/>
+          <w:i w:val="0"/>
+          <w:color w:val="1E293B"/>
+          <w:sz w:val="21"/>
+        </w:rPr>
+        <w:t xml:space="preserve">STRONG SELL</w:t>
+      </w:r>
+      <w:r>
+        <w:rPr>
+          <w:b w:val="0"/>
+          <w:i w:val="0"/>
+          <w:color w:val="1E293B"/>
+          <w:sz w:val="21"/>
+        </w:rPr>
+        <w:t xml:space="preserve"> to </w:t>
+      </w:r>
+      <w:r>
+        <w:rPr>
+          <w:b/>
+          <w:i w:val="0"/>
+          <w:color w:val="1E293B"/>
+          <w:sz w:val="21"/>
+        </w:rPr>
+        <w:t xml:space="preserve">BUY</w:t>
+      </w:r>
+      <w:r>
+        <w:rPr>
+          <w:b w:val="0"/>
+          <w:i w:val="0"/>
+          <w:color w:val="1E293B"/>
+          <w:sz w:val="21"/>
+        </w:rPr>
+        <w:t xml:space="preserve"> purely because of the approach — so the choice must fit the business, not the answer you want. Vipin Corporation is a profitable, cash-generative mid-cap, so the </w:t>
+      </w:r>
+      <w:r>
+        <w:rPr>
+          <w:b/>
+          <w:i w:val="0"/>
+          <w:color w:val="1E293B"/>
+          <w:sz w:val="21"/>
+        </w:rPr>
+        <w:t xml:space="preserve">Stable</w:t>
+      </w:r>
+      <w:r>
+        <w:rPr>
+          <w:b w:val="0"/>
+          <w:i w:val="0"/>
+          <w:color w:val="1E293B"/>
+          <w:sz w:val="21"/>
+        </w:rPr>
+        <w:t xml:space="preserve"> profile (DCF-led, cross-checked by comps) is the right lens: ₹312, HOLD, consistent with the triangulation above. The start-up and bank presets appear only for contrast; their low values come from methods built for very different businesses (a 25% venture hurdle, and book-value multiples meant for lenders).</w:t>
+      </w:r>
+    </w:p>
+    <w:tbl>
+      <w:tblPr>
+        <w:tblW w:w="9360" w:type="dxa"/>
+        <w:jc w:val="center"/>
+        <w:tblLayout w:type="fixed"/>
+        <w:tblLook w:firstColumn="1" w:firstRow="1" w:lastColumn="0" w:lastRow="0" w:noHBand="0" w:noVBand="1" w:val="04A0"/>
+      </w:tblPr>
+      <w:tblGrid>
+        <w:gridCol w:w="9360"/>
+      </w:tblGrid>
+      <w:tr>
+        <w:tc>
+          <w:tcPr>
+            <w:tcW w:w="9360" w:type="dxa"/>
+            <w:tcBorders>
+              <w:top w:val="single" w:sz="4" w:space="0" w:color="E2E8F8"/>
+              <w:left w:val="single" w:sz="24" w:space="0" w:color="7209B7"/>
+              <w:bottom w:val="single" w:sz="4" w:space="0" w:color="E2E8F8"/>
+              <w:right w:val="single" w:sz="4" w:space="0" w:color="E2E8F8"/>
+            </w:tcBorders>
+            <w:shd w:val="clear" w:color="auto" w:fill="FBFBFE"/>
+            <w:tcMar>
+              <w:top w:w="120" w:type="dxa"/>
+              <w:left w:w="160" w:type="dxa"/>
+              <w:bottom w:w="120" w:type="dxa"/>
+              <w:right w:w="160" w:type="dxa"/>
+            </w:tcMar>
+          </w:tcPr>
+          <w:p>
+            <w:pPr>
+              <w:spacing w:after="60"/>
+            </w:pPr>
+            <w:r>
+              <w:rPr>
+                <w:b/>
+                <w:color w:val="7209B7"/>
+                <w:sz w:val="21"/>
+              </w:rPr>
+              <w:t>❖  Choosing an approach — discipline</w:t>
+            </w:r>
+          </w:p>
+          <w:p>
+            <w:pPr>
+              <w:spacing w:after="40"/>
+            </w:pPr>
+            <w:r>
+              <w:rPr>
+                <w:b w:val="0"/>
+                <w:i w:val="0"/>
+                <w:color w:val="1E293B"/>
+                <w:sz w:val="20"/>
+              </w:rPr>
+              <w:t xml:space="preserve">Decide the approach before you look at the answer, and write down why.</w:t>
+            </w:r>
+          </w:p>
+          <w:p>
+            <w:pPr>
+              <w:spacing w:after="40"/>
+            </w:pPr>
+            <w:r>
+              <w:rPr>
+                <w:b w:val="0"/>
+                <w:i w:val="0"/>
+                <w:color w:val="1E293B"/>
+                <w:sz w:val="20"/>
+              </w:rPr>
+              <w:t xml:space="preserve">Match the method to the business model (see 6.7), not to the target you want.</w:t>
+            </w:r>
+          </w:p>
+          <w:p>
+            <w:pPr>
+              <w:spacing w:after="40"/>
+            </w:pPr>
+            <w:r>
+              <w:rPr>
+                <w:b w:val="0"/>
+                <w:i w:val="0"/>
+                <w:color w:val="1E293B"/>
+                <w:sz w:val="20"/>
+              </w:rPr>
+              <w:t xml:space="preserve">In a blend, give most weight to the method with the most reliable inputs, and keep weights stable between updates.</w:t>
+            </w:r>
+          </w:p>
+          <w:p>
+            <w:pPr>
+              <w:spacing w:after="40"/>
+            </w:pPr>
+            <w:r>
+              <w:rPr>
+                <w:b w:val="0"/>
+                <w:i w:val="0"/>
+                <w:color w:val="1E293B"/>
+                <w:sz w:val="20"/>
+              </w:rPr>
+              <w:t xml:space="preserve">Always show the cross-checks: if the headline sits far from the other methods, explain the gap.</w:t>
+            </w:r>
+          </w:p>
+        </w:tc>
+      </w:tr>
+    </w:tbl>
     <w:p>
       <w:pPr>
         <w:pStyle w:val="Heading1"/>

</xml_diff>

<commit_message>
Guide: add 9.1 Choosing the valuation approach (#5)
Shows how the headline target and rating for Vipin Corporation change
under each Approach preset in the app (Rs 140 STRONG SELL to Rs 328 BUY),
why the Stable profile is the right lens here (Rs 312, HOLD), and a
discipline box on choosing and weighting methods.


Claude-Session: https://claude.ai/code/session_018hY48TnvoyExCnuZKmZVFd

Co-authored-by: Claude <noreply@anthropic.com>
</commit_message>
<xml_diff>
--- a/Valuation_Deep_Dive_Guide.docx
+++ b/Valuation_Deep_Dive_Guide.docx
@@ -17726,6 +17726,1149 @@
         <w:t>The methods cluster around the current price — a defensible HOLD. The discipline is not to chase a single number but to understand why the methods agree or disagree, and what would change the call.</w:t>
       </w:r>
     </w:p>
+    <w:p>
+      <w:pPr>
+        <w:pStyle w:val="Heading2"/>
+      </w:pPr>
+      <w:r>
+        <w:t xml:space="preserve">9.1  Choosing the valuation approach</w:t>
+      </w:r>
+    </w:p>
+    <w:p>
+      <w:pPr>
+        <w:spacing w:after="120" w:before="0" w:line="276" w:lineRule="auto"/>
+      </w:pPr>
+      <w:r>
+        <w:rPr>
+          <w:b w:val="0"/>
+          <w:i w:val="0"/>
+          <w:color w:val="1E293B"/>
+          <w:sz w:val="21"/>
+        </w:rPr>
+        <w:t xml:space="preserve">The triangulation above uses every method. In practice the investor decides </w:t>
+      </w:r>
+      <w:r>
+        <w:rPr>
+          <w:b w:val="0"/>
+          <w:i w:val="0"/>
+          <w:color w:val="1E293B"/>
+          <w:sz w:val="21"/>
+        </w:rPr>
+        <w:t xml:space="preserve">which methods fit the company</w:t>
+      </w:r>
+      <w:r>
+        <w:rPr>
+          <w:b w:val="0"/>
+          <w:i w:val="0"/>
+          <w:color w:val="1E293B"/>
+          <w:sz w:val="21"/>
+        </w:rPr>
+        <w:t xml:space="preserve"> and </w:t>
+      </w:r>
+      <w:r>
+        <w:rPr>
+          <w:b w:val="0"/>
+          <w:i w:val="0"/>
+          <w:color w:val="1E293B"/>
+          <w:sz w:val="21"/>
+        </w:rPr>
+        <w:t xml:space="preserve">how to combine them</w:t>
+      </w:r>
+      <w:r>
+        <w:rPr>
+          <w:b w:val="0"/>
+          <w:i w:val="0"/>
+          <w:color w:val="1E293B"/>
+          <w:sz w:val="21"/>
+        </w:rPr>
+        <w:t xml:space="preserve"> into one headline target. ValuMetrics asks this up front in its Approach dialog: pick a company profile (or tick methods yourself), then set the headline as one primary method or a weighted blend. Applied to Vipin Corporation, each preset gives:</w:t>
+      </w:r>
+    </w:p>
+    <w:tbl>
+      <w:tblPr>
+        <w:tblW w:w="9360" w:type="dxa"/>
+        <w:jc w:val="center"/>
+        <w:tblLayout w:type="fixed"/>
+        <w:tblLook w:firstColumn="1" w:firstRow="1" w:lastColumn="0" w:lastRow="0" w:noHBand="0" w:noVBand="1" w:val="04A0"/>
+      </w:tblPr>
+      <w:tblGrid>
+        <w:gridCol w:w="2300"/>
+        <w:gridCol w:w="3700"/>
+        <w:gridCol w:w="1860"/>
+        <w:gridCol w:w="1500"/>
+      </w:tblGrid>
+      <w:tr>
+        <w:tc>
+          <w:tcPr>
+            <w:tcW w:w="2300" w:type="dxa"/>
+            <w:tcBorders>
+              <w:top w:val="single" w:sz="4" w:space="0" w:color="CCCCCC"/>
+              <w:left w:val="single" w:sz="4" w:space="0" w:color="CCCCCC"/>
+              <w:bottom w:val="single" w:sz="4" w:space="0" w:color="CCCCCC"/>
+              <w:right w:val="single" w:sz="4" w:space="0" w:color="CCCCCC"/>
+            </w:tcBorders>
+            <w:shd w:val="clear" w:color="auto" w:fill="4361EE"/>
+            <w:tcMar>
+              <w:top w:w="70" w:type="dxa"/>
+              <w:left w:w="110" w:type="dxa"/>
+              <w:bottom w:w="70" w:type="dxa"/>
+              <w:right w:w="110" w:type="dxa"/>
+            </w:tcMar>
+            <w:vAlign w:val="center"/>
+          </w:tcPr>
+          <w:p>
+            <w:pPr>
+              <w:spacing w:after="0"/>
+            </w:pPr>
+            <w:r>
+              <w:rPr>
+                <w:b/>
+                <w:color w:val="FFFFFF"/>
+                <w:sz w:val="20"/>
+              </w:rPr>
+              <w:t xml:space="preserve">Approach (preset)</w:t>
+            </w:r>
+          </w:p>
+        </w:tc>
+        <w:tc>
+          <w:tcPr>
+            <w:tcW w:w="3700" w:type="dxa"/>
+            <w:tcBorders>
+              <w:top w:val="single" w:sz="4" w:space="0" w:color="CCCCCC"/>
+              <w:left w:val="single" w:sz="4" w:space="0" w:color="CCCCCC"/>
+              <w:bottom w:val="single" w:sz="4" w:space="0" w:color="CCCCCC"/>
+              <w:right w:val="single" w:sz="4" w:space="0" w:color="CCCCCC"/>
+            </w:tcBorders>
+            <w:shd w:val="clear" w:color="auto" w:fill="4361EE"/>
+            <w:tcMar>
+              <w:top w:w="70" w:type="dxa"/>
+              <w:left w:w="110" w:type="dxa"/>
+              <w:bottom w:w="70" w:type="dxa"/>
+              <w:right w:w="110" w:type="dxa"/>
+            </w:tcMar>
+            <w:vAlign w:val="center"/>
+          </w:tcPr>
+          <w:p>
+            <w:pPr>
+              <w:spacing w:after="0"/>
+            </w:pPr>
+            <w:r>
+              <w:rPr>
+                <w:b/>
+                <w:color w:val="FFFFFF"/>
+                <w:sz w:val="20"/>
+              </w:rPr>
+              <w:t xml:space="preserve">Methods &amp; weights</w:t>
+            </w:r>
+          </w:p>
+        </w:tc>
+        <w:tc>
+          <w:tcPr>
+            <w:tcW w:w="1860" w:type="dxa"/>
+            <w:tcBorders>
+              <w:top w:val="single" w:sz="4" w:space="0" w:color="CCCCCC"/>
+              <w:left w:val="single" w:sz="4" w:space="0" w:color="CCCCCC"/>
+              <w:bottom w:val="single" w:sz="4" w:space="0" w:color="CCCCCC"/>
+              <w:right w:val="single" w:sz="4" w:space="0" w:color="CCCCCC"/>
+            </w:tcBorders>
+            <w:shd w:val="clear" w:color="auto" w:fill="4361EE"/>
+            <w:tcMar>
+              <w:top w:w="70" w:type="dxa"/>
+              <w:left w:w="110" w:type="dxa"/>
+              <w:bottom w:w="70" w:type="dxa"/>
+              <w:right w:w="110" w:type="dxa"/>
+            </w:tcMar>
+            <w:vAlign w:val="center"/>
+          </w:tcPr>
+          <w:p>
+            <w:pPr>
+              <w:spacing w:after="0"/>
+            </w:pPr>
+            <w:r>
+              <w:rPr>
+                <w:b/>
+                <w:color w:val="FFFFFF"/>
+                <w:sz w:val="20"/>
+              </w:rPr>
+              <w:t xml:space="preserve">Headline target</w:t>
+            </w:r>
+          </w:p>
+        </w:tc>
+        <w:tc>
+          <w:tcPr>
+            <w:tcW w:w="1500" w:type="dxa"/>
+            <w:tcBorders>
+              <w:top w:val="single" w:sz="4" w:space="0" w:color="CCCCCC"/>
+              <w:left w:val="single" w:sz="4" w:space="0" w:color="CCCCCC"/>
+              <w:bottom w:val="single" w:sz="4" w:space="0" w:color="CCCCCC"/>
+              <w:right w:val="single" w:sz="4" w:space="0" w:color="CCCCCC"/>
+            </w:tcBorders>
+            <w:shd w:val="clear" w:color="auto" w:fill="4361EE"/>
+            <w:tcMar>
+              <w:top w:w="70" w:type="dxa"/>
+              <w:left w:w="110" w:type="dxa"/>
+              <w:bottom w:w="70" w:type="dxa"/>
+              <w:right w:w="110" w:type="dxa"/>
+            </w:tcMar>
+            <w:vAlign w:val="center"/>
+          </w:tcPr>
+          <w:p>
+            <w:pPr>
+              <w:spacing w:after="0"/>
+            </w:pPr>
+            <w:r>
+              <w:rPr>
+                <w:b/>
+                <w:color w:val="FFFFFF"/>
+                <w:sz w:val="20"/>
+              </w:rPr>
+              <w:t xml:space="preserve">Rating</w:t>
+            </w:r>
+          </w:p>
+        </w:tc>
+      </w:tr>
+      <w:tr>
+        <w:tc>
+          <w:tcPr>
+            <w:tcW w:w="2300" w:type="dxa"/>
+            <w:tcBorders>
+              <w:top w:val="single" w:sz="4" w:space="0" w:color="CCCCCC"/>
+              <w:left w:val="single" w:sz="4" w:space="0" w:color="CCCCCC"/>
+              <w:bottom w:val="single" w:sz="4" w:space="0" w:color="CCCCCC"/>
+              <w:right w:val="single" w:sz="4" w:space="0" w:color="CCCCCC"/>
+            </w:tcBorders>
+            <w:shd w:val="clear" w:color="auto" w:fill="EEF2FF"/>
+            <w:tcMar>
+              <w:top w:w="70" w:type="dxa"/>
+              <w:left w:w="110" w:type="dxa"/>
+              <w:bottom w:w="70" w:type="dxa"/>
+              <w:right w:w="110" w:type="dxa"/>
+            </w:tcMar>
+            <w:vAlign w:val="center"/>
+          </w:tcPr>
+          <w:p>
+            <w:pPr>
+              <w:spacing w:after="0"/>
+            </w:pPr>
+            <w:r>
+              <w:rPr>
+                <w:b/>
+                <w:color w:val="1E293B"/>
+                <w:sz w:val="19"/>
+              </w:rPr>
+              <w:t xml:space="preserve">Stable, cash-generative</w:t>
+            </w:r>
+          </w:p>
+        </w:tc>
+        <w:tc>
+          <w:tcPr>
+            <w:tcW w:w="3700" w:type="dxa"/>
+            <w:tcBorders>
+              <w:top w:val="single" w:sz="4" w:space="0" w:color="CCCCCC"/>
+              <w:left w:val="single" w:sz="4" w:space="0" w:color="CCCCCC"/>
+              <w:bottom w:val="single" w:sz="4" w:space="0" w:color="CCCCCC"/>
+              <w:right w:val="single" w:sz="4" w:space="0" w:color="CCCCCC"/>
+            </w:tcBorders>
+            <w:shd w:val="clear" w:color="auto" w:fill="EEF2FF"/>
+            <w:tcMar>
+              <w:top w:w="70" w:type="dxa"/>
+              <w:left w:w="110" w:type="dxa"/>
+              <w:bottom w:w="70" w:type="dxa"/>
+              <w:right w:w="110" w:type="dxa"/>
+            </w:tcMar>
+            <w:vAlign w:val="center"/>
+          </w:tcPr>
+          <w:p>
+            <w:pPr>
+              <w:spacing w:after="0"/>
+            </w:pPr>
+            <w:r>
+              <w:rPr>
+                <w:b/>
+                <w:color w:val="1E293B"/>
+                <w:sz w:val="19"/>
+              </w:rPr>
+              <w:t xml:space="preserve">DCF (FCFF) primary; exit multiple &amp; EV/EBITDA comps as cross-checks</w:t>
+            </w:r>
+          </w:p>
+        </w:tc>
+        <w:tc>
+          <w:tcPr>
+            <w:tcW w:w="1860" w:type="dxa"/>
+            <w:tcBorders>
+              <w:top w:val="single" w:sz="4" w:space="0" w:color="CCCCCC"/>
+              <w:left w:val="single" w:sz="4" w:space="0" w:color="CCCCCC"/>
+              <w:bottom w:val="single" w:sz="4" w:space="0" w:color="CCCCCC"/>
+              <w:right w:val="single" w:sz="4" w:space="0" w:color="CCCCCC"/>
+            </w:tcBorders>
+            <w:shd w:val="clear" w:color="auto" w:fill="EEF2FF"/>
+            <w:tcMar>
+              <w:top w:w="70" w:type="dxa"/>
+              <w:left w:w="110" w:type="dxa"/>
+              <w:bottom w:w="70" w:type="dxa"/>
+              <w:right w:w="110" w:type="dxa"/>
+            </w:tcMar>
+            <w:vAlign w:val="center"/>
+          </w:tcPr>
+          <w:p>
+            <w:pPr>
+              <w:spacing w:after="0"/>
+            </w:pPr>
+            <w:r>
+              <w:rPr>
+                <w:b/>
+                <w:color w:val="1E293B"/>
+                <w:sz w:val="19"/>
+              </w:rPr>
+              <w:t xml:space="preserve">₹ 312 (+0.5%)</w:t>
+            </w:r>
+          </w:p>
+        </w:tc>
+        <w:tc>
+          <w:tcPr>
+            <w:tcW w:w="1500" w:type="dxa"/>
+            <w:tcBorders>
+              <w:top w:val="single" w:sz="4" w:space="0" w:color="CCCCCC"/>
+              <w:left w:val="single" w:sz="4" w:space="0" w:color="CCCCCC"/>
+              <w:bottom w:val="single" w:sz="4" w:space="0" w:color="CCCCCC"/>
+              <w:right w:val="single" w:sz="4" w:space="0" w:color="CCCCCC"/>
+            </w:tcBorders>
+            <w:shd w:val="clear" w:color="auto" w:fill="EEF2FF"/>
+            <w:tcMar>
+              <w:top w:w="70" w:type="dxa"/>
+              <w:left w:w="110" w:type="dxa"/>
+              <w:bottom w:w="70" w:type="dxa"/>
+              <w:right w:w="110" w:type="dxa"/>
+            </w:tcMar>
+            <w:vAlign w:val="center"/>
+          </w:tcPr>
+          <w:p>
+            <w:pPr>
+              <w:spacing w:after="0"/>
+            </w:pPr>
+            <w:r>
+              <w:rPr>
+                <w:b/>
+                <w:color w:val="1E293B"/>
+                <w:sz w:val="19"/>
+              </w:rPr>
+              <w:t xml:space="preserve">HOLD</w:t>
+            </w:r>
+          </w:p>
+        </w:tc>
+      </w:tr>
+      <w:tr>
+        <w:tc>
+          <w:tcPr>
+            <w:tcW w:w="2300" w:type="dxa"/>
+            <w:tcBorders>
+              <w:top w:val="single" w:sz="4" w:space="0" w:color="CCCCCC"/>
+              <w:left w:val="single" w:sz="4" w:space="0" w:color="CCCCCC"/>
+              <w:bottom w:val="single" w:sz="4" w:space="0" w:color="CCCCCC"/>
+              <w:right w:val="single" w:sz="4" w:space="0" w:color="CCCCCC"/>
+            </w:tcBorders>
+            <w:tcMar>
+              <w:top w:w="70" w:type="dxa"/>
+              <w:left w:w="110" w:type="dxa"/>
+              <w:bottom w:w="70" w:type="dxa"/>
+              <w:right w:w="110" w:type="dxa"/>
+            </w:tcMar>
+            <w:vAlign w:val="center"/>
+          </w:tcPr>
+          <w:p>
+            <w:pPr>
+              <w:spacing w:after="0"/>
+            </w:pPr>
+            <w:r>
+              <w:rPr>
+                <w:b w:val="0"/>
+                <w:color w:val="1E293B"/>
+                <w:sz w:val="19"/>
+              </w:rPr>
+              <w:t xml:space="preserve">High-growth / pre-profit</w:t>
+            </w:r>
+          </w:p>
+        </w:tc>
+        <w:tc>
+          <w:tcPr>
+            <w:tcW w:w="3700" w:type="dxa"/>
+            <w:tcBorders>
+              <w:top w:val="single" w:sz="4" w:space="0" w:color="CCCCCC"/>
+              <w:left w:val="single" w:sz="4" w:space="0" w:color="CCCCCC"/>
+              <w:bottom w:val="single" w:sz="4" w:space="0" w:color="CCCCCC"/>
+              <w:right w:val="single" w:sz="4" w:space="0" w:color="CCCCCC"/>
+            </w:tcBorders>
+            <w:tcMar>
+              <w:top w:w="70" w:type="dxa"/>
+              <w:left w:w="110" w:type="dxa"/>
+              <w:bottom w:w="70" w:type="dxa"/>
+              <w:right w:w="110" w:type="dxa"/>
+            </w:tcMar>
+            <w:vAlign w:val="center"/>
+          </w:tcPr>
+          <w:p>
+            <w:pPr>
+              <w:spacing w:after="0"/>
+            </w:pPr>
+            <w:r>
+              <w:rPr>
+                <w:b w:val="0"/>
+                <w:color w:val="1E293B"/>
+                <w:sz w:val="19"/>
+              </w:rPr>
+              <w:t xml:space="preserve">Scenario DCF 60% + EV/Sales comps 40%</w:t>
+            </w:r>
+          </w:p>
+        </w:tc>
+        <w:tc>
+          <w:tcPr>
+            <w:tcW w:w="1860" w:type="dxa"/>
+            <w:tcBorders>
+              <w:top w:val="single" w:sz="4" w:space="0" w:color="CCCCCC"/>
+              <w:left w:val="single" w:sz="4" w:space="0" w:color="CCCCCC"/>
+              <w:bottom w:val="single" w:sz="4" w:space="0" w:color="CCCCCC"/>
+              <w:right w:val="single" w:sz="4" w:space="0" w:color="CCCCCC"/>
+            </w:tcBorders>
+            <w:tcMar>
+              <w:top w:w="70" w:type="dxa"/>
+              <w:left w:w="110" w:type="dxa"/>
+              <w:bottom w:w="70" w:type="dxa"/>
+              <w:right w:w="110" w:type="dxa"/>
+            </w:tcMar>
+            <w:vAlign w:val="center"/>
+          </w:tcPr>
+          <w:p>
+            <w:pPr>
+              <w:spacing w:after="0"/>
+            </w:pPr>
+            <w:r>
+              <w:rPr>
+                <w:b w:val="0"/>
+                <w:color w:val="1E293B"/>
+                <w:sz w:val="19"/>
+              </w:rPr>
+              <w:t xml:space="preserve">₹ 273 (−11.8%)</w:t>
+            </w:r>
+          </w:p>
+        </w:tc>
+        <w:tc>
+          <w:tcPr>
+            <w:tcW w:w="1500" w:type="dxa"/>
+            <w:tcBorders>
+              <w:top w:val="single" w:sz="4" w:space="0" w:color="CCCCCC"/>
+              <w:left w:val="single" w:sz="4" w:space="0" w:color="CCCCCC"/>
+              <w:bottom w:val="single" w:sz="4" w:space="0" w:color="CCCCCC"/>
+              <w:right w:val="single" w:sz="4" w:space="0" w:color="CCCCCC"/>
+            </w:tcBorders>
+            <w:tcMar>
+              <w:top w:w="70" w:type="dxa"/>
+              <w:left w:w="110" w:type="dxa"/>
+              <w:bottom w:w="70" w:type="dxa"/>
+              <w:right w:w="110" w:type="dxa"/>
+            </w:tcMar>
+            <w:vAlign w:val="center"/>
+          </w:tcPr>
+          <w:p>
+            <w:pPr>
+              <w:spacing w:after="0"/>
+            </w:pPr>
+            <w:r>
+              <w:rPr>
+                <w:b w:val="0"/>
+                <w:color w:val="1E293B"/>
+                <w:sz w:val="19"/>
+              </w:rPr>
+              <w:t xml:space="preserve">SELL</w:t>
+            </w:r>
+          </w:p>
+        </w:tc>
+      </w:tr>
+      <w:tr>
+        <w:tc>
+          <w:tcPr>
+            <w:tcW w:w="2300" w:type="dxa"/>
+            <w:tcBorders>
+              <w:top w:val="single" w:sz="4" w:space="0" w:color="CCCCCC"/>
+              <w:left w:val="single" w:sz="4" w:space="0" w:color="CCCCCC"/>
+              <w:bottom w:val="single" w:sz="4" w:space="0" w:color="CCCCCC"/>
+              <w:right w:val="single" w:sz="4" w:space="0" w:color="CCCCCC"/>
+            </w:tcBorders>
+            <w:shd w:val="clear" w:color="auto" w:fill="F7F9FF"/>
+            <w:tcMar>
+              <w:top w:w="70" w:type="dxa"/>
+              <w:left w:w="110" w:type="dxa"/>
+              <w:bottom w:w="70" w:type="dxa"/>
+              <w:right w:w="110" w:type="dxa"/>
+            </w:tcMar>
+            <w:vAlign w:val="center"/>
+          </w:tcPr>
+          <w:p>
+            <w:pPr>
+              <w:spacing w:after="0"/>
+            </w:pPr>
+            <w:r>
+              <w:rPr>
+                <w:b w:val="0"/>
+                <w:color w:val="1E293B"/>
+                <w:sz w:val="19"/>
+              </w:rPr>
+              <w:t xml:space="preserve">Start-up / VC-backed</w:t>
+            </w:r>
+          </w:p>
+        </w:tc>
+        <w:tc>
+          <w:tcPr>
+            <w:tcW w:w="3700" w:type="dxa"/>
+            <w:tcBorders>
+              <w:top w:val="single" w:sz="4" w:space="0" w:color="CCCCCC"/>
+              <w:left w:val="single" w:sz="4" w:space="0" w:color="CCCCCC"/>
+              <w:bottom w:val="single" w:sz="4" w:space="0" w:color="CCCCCC"/>
+              <w:right w:val="single" w:sz="4" w:space="0" w:color="CCCCCC"/>
+            </w:tcBorders>
+            <w:shd w:val="clear" w:color="auto" w:fill="F7F9FF"/>
+            <w:tcMar>
+              <w:top w:w="70" w:type="dxa"/>
+              <w:left w:w="110" w:type="dxa"/>
+              <w:bottom w:w="70" w:type="dxa"/>
+              <w:right w:w="110" w:type="dxa"/>
+            </w:tcMar>
+            <w:vAlign w:val="center"/>
+          </w:tcPr>
+          <w:p>
+            <w:pPr>
+              <w:spacing w:after="0"/>
+            </w:pPr>
+            <w:r>
+              <w:rPr>
+                <w:b w:val="0"/>
+                <w:color w:val="1E293B"/>
+                <w:sz w:val="19"/>
+              </w:rPr>
+              <w:t xml:space="preserve">VC Method primary; EV/Sales comps as cross-check</w:t>
+            </w:r>
+          </w:p>
+        </w:tc>
+        <w:tc>
+          <w:tcPr>
+            <w:tcW w:w="1860" w:type="dxa"/>
+            <w:tcBorders>
+              <w:top w:val="single" w:sz="4" w:space="0" w:color="CCCCCC"/>
+              <w:left w:val="single" w:sz="4" w:space="0" w:color="CCCCCC"/>
+              <w:bottom w:val="single" w:sz="4" w:space="0" w:color="CCCCCC"/>
+              <w:right w:val="single" w:sz="4" w:space="0" w:color="CCCCCC"/>
+            </w:tcBorders>
+            <w:shd w:val="clear" w:color="auto" w:fill="F7F9FF"/>
+            <w:tcMar>
+              <w:top w:w="70" w:type="dxa"/>
+              <w:left w:w="110" w:type="dxa"/>
+              <w:bottom w:w="70" w:type="dxa"/>
+              <w:right w:w="110" w:type="dxa"/>
+            </w:tcMar>
+            <w:vAlign w:val="center"/>
+          </w:tcPr>
+          <w:p>
+            <w:pPr>
+              <w:spacing w:after="0"/>
+            </w:pPr>
+            <w:r>
+              <w:rPr>
+                <w:b w:val="0"/>
+                <w:color w:val="1E293B"/>
+                <w:sz w:val="19"/>
+              </w:rPr>
+              <w:t xml:space="preserve">₹ 140 (−55.0%)</w:t>
+            </w:r>
+          </w:p>
+        </w:tc>
+        <w:tc>
+          <w:tcPr>
+            <w:tcW w:w="1500" w:type="dxa"/>
+            <w:tcBorders>
+              <w:top w:val="single" w:sz="4" w:space="0" w:color="CCCCCC"/>
+              <w:left w:val="single" w:sz="4" w:space="0" w:color="CCCCCC"/>
+              <w:bottom w:val="single" w:sz="4" w:space="0" w:color="CCCCCC"/>
+              <w:right w:val="single" w:sz="4" w:space="0" w:color="CCCCCC"/>
+            </w:tcBorders>
+            <w:shd w:val="clear" w:color="auto" w:fill="F7F9FF"/>
+            <w:tcMar>
+              <w:top w:w="70" w:type="dxa"/>
+              <w:left w:w="110" w:type="dxa"/>
+              <w:bottom w:w="70" w:type="dxa"/>
+              <w:right w:w="110" w:type="dxa"/>
+            </w:tcMar>
+            <w:vAlign w:val="center"/>
+          </w:tcPr>
+          <w:p>
+            <w:pPr>
+              <w:spacing w:after="0"/>
+            </w:pPr>
+            <w:r>
+              <w:rPr>
+                <w:b w:val="0"/>
+                <w:color w:val="1E293B"/>
+                <w:sz w:val="19"/>
+              </w:rPr>
+              <w:t xml:space="preserve">STRONG SELL</w:t>
+            </w:r>
+          </w:p>
+        </w:tc>
+      </w:tr>
+      <w:tr>
+        <w:tc>
+          <w:tcPr>
+            <w:tcW w:w="2300" w:type="dxa"/>
+            <w:tcBorders>
+              <w:top w:val="single" w:sz="4" w:space="0" w:color="CCCCCC"/>
+              <w:left w:val="single" w:sz="4" w:space="0" w:color="CCCCCC"/>
+              <w:bottom w:val="single" w:sz="4" w:space="0" w:color="CCCCCC"/>
+              <w:right w:val="single" w:sz="4" w:space="0" w:color="CCCCCC"/>
+            </w:tcBorders>
+            <w:tcMar>
+              <w:top w:w="70" w:type="dxa"/>
+              <w:left w:w="110" w:type="dxa"/>
+              <w:bottom w:w="70" w:type="dxa"/>
+              <w:right w:w="110" w:type="dxa"/>
+            </w:tcMar>
+            <w:vAlign w:val="center"/>
+          </w:tcPr>
+          <w:p>
+            <w:pPr>
+              <w:spacing w:after="0"/>
+            </w:pPr>
+            <w:r>
+              <w:rPr>
+                <w:b w:val="0"/>
+                <w:color w:val="1E293B"/>
+                <w:sz w:val="19"/>
+              </w:rPr>
+              <w:t xml:space="preserve">Bank / insurer</w:t>
+            </w:r>
+          </w:p>
+        </w:tc>
+        <w:tc>
+          <w:tcPr>
+            <w:tcW w:w="3700" w:type="dxa"/>
+            <w:tcBorders>
+              <w:top w:val="single" w:sz="4" w:space="0" w:color="CCCCCC"/>
+              <w:left w:val="single" w:sz="4" w:space="0" w:color="CCCCCC"/>
+              <w:bottom w:val="single" w:sz="4" w:space="0" w:color="CCCCCC"/>
+              <w:right w:val="single" w:sz="4" w:space="0" w:color="CCCCCC"/>
+            </w:tcBorders>
+            <w:tcMar>
+              <w:top w:w="70" w:type="dxa"/>
+              <w:left w:w="110" w:type="dxa"/>
+              <w:bottom w:w="70" w:type="dxa"/>
+              <w:right w:w="110" w:type="dxa"/>
+            </w:tcMar>
+            <w:vAlign w:val="center"/>
+          </w:tcPr>
+          <w:p>
+            <w:pPr>
+              <w:spacing w:after="0"/>
+            </w:pPr>
+            <w:r>
+              <w:rPr>
+                <w:b w:val="0"/>
+                <w:color w:val="1E293B"/>
+                <w:sz w:val="19"/>
+              </w:rPr>
+              <w:t xml:space="preserve">FCFE 60% + P/BV comps 40%</w:t>
+            </w:r>
+          </w:p>
+        </w:tc>
+        <w:tc>
+          <w:tcPr>
+            <w:tcW w:w="1860" w:type="dxa"/>
+            <w:tcBorders>
+              <w:top w:val="single" w:sz="4" w:space="0" w:color="CCCCCC"/>
+              <w:left w:val="single" w:sz="4" w:space="0" w:color="CCCCCC"/>
+              <w:bottom w:val="single" w:sz="4" w:space="0" w:color="CCCCCC"/>
+              <w:right w:val="single" w:sz="4" w:space="0" w:color="CCCCCC"/>
+            </w:tcBorders>
+            <w:tcMar>
+              <w:top w:w="70" w:type="dxa"/>
+              <w:left w:w="110" w:type="dxa"/>
+              <w:bottom w:w="70" w:type="dxa"/>
+              <w:right w:w="110" w:type="dxa"/>
+            </w:tcMar>
+            <w:vAlign w:val="center"/>
+          </w:tcPr>
+          <w:p>
+            <w:pPr>
+              <w:spacing w:after="0"/>
+            </w:pPr>
+            <w:r>
+              <w:rPr>
+                <w:b w:val="0"/>
+                <w:color w:val="1E293B"/>
+                <w:sz w:val="19"/>
+              </w:rPr>
+              <w:t xml:space="preserve">₹ 233 (−24.8%)</w:t>
+            </w:r>
+          </w:p>
+        </w:tc>
+        <w:tc>
+          <w:tcPr>
+            <w:tcW w:w="1500" w:type="dxa"/>
+            <w:tcBorders>
+              <w:top w:val="single" w:sz="4" w:space="0" w:color="CCCCCC"/>
+              <w:left w:val="single" w:sz="4" w:space="0" w:color="CCCCCC"/>
+              <w:bottom w:val="single" w:sz="4" w:space="0" w:color="CCCCCC"/>
+              <w:right w:val="single" w:sz="4" w:space="0" w:color="CCCCCC"/>
+            </w:tcBorders>
+            <w:tcMar>
+              <w:top w:w="70" w:type="dxa"/>
+              <w:left w:w="110" w:type="dxa"/>
+              <w:bottom w:w="70" w:type="dxa"/>
+              <w:right w:w="110" w:type="dxa"/>
+            </w:tcMar>
+            <w:vAlign w:val="center"/>
+          </w:tcPr>
+          <w:p>
+            <w:pPr>
+              <w:spacing w:after="0"/>
+            </w:pPr>
+            <w:r>
+              <w:rPr>
+                <w:b w:val="0"/>
+                <w:color w:val="1E293B"/>
+                <w:sz w:val="19"/>
+              </w:rPr>
+              <w:t xml:space="preserve">STRONG SELL</w:t>
+            </w:r>
+          </w:p>
+        </w:tc>
+      </w:tr>
+      <w:tr>
+        <w:tc>
+          <w:tcPr>
+            <w:tcW w:w="2300" w:type="dxa"/>
+            <w:tcBorders>
+              <w:top w:val="single" w:sz="4" w:space="0" w:color="CCCCCC"/>
+              <w:left w:val="single" w:sz="4" w:space="0" w:color="CCCCCC"/>
+              <w:bottom w:val="single" w:sz="4" w:space="0" w:color="CCCCCC"/>
+              <w:right w:val="single" w:sz="4" w:space="0" w:color="CCCCCC"/>
+            </w:tcBorders>
+            <w:shd w:val="clear" w:color="auto" w:fill="F7F9FF"/>
+            <w:tcMar>
+              <w:top w:w="70" w:type="dxa"/>
+              <w:left w:w="110" w:type="dxa"/>
+              <w:bottom w:w="70" w:type="dxa"/>
+              <w:right w:w="110" w:type="dxa"/>
+            </w:tcMar>
+            <w:vAlign w:val="center"/>
+          </w:tcPr>
+          <w:p>
+            <w:pPr>
+              <w:spacing w:after="0"/>
+            </w:pPr>
+            <w:r>
+              <w:rPr>
+                <w:b w:val="0"/>
+                <w:color w:val="1E293B"/>
+                <w:sz w:val="19"/>
+              </w:rPr>
+              <w:t xml:space="preserve">M&amp;A / acquisition</w:t>
+            </w:r>
+          </w:p>
+        </w:tc>
+        <w:tc>
+          <w:tcPr>
+            <w:tcW w:w="3700" w:type="dxa"/>
+            <w:tcBorders>
+              <w:top w:val="single" w:sz="4" w:space="0" w:color="CCCCCC"/>
+              <w:left w:val="single" w:sz="4" w:space="0" w:color="CCCCCC"/>
+              <w:bottom w:val="single" w:sz="4" w:space="0" w:color="CCCCCC"/>
+              <w:right w:val="single" w:sz="4" w:space="0" w:color="CCCCCC"/>
+            </w:tcBorders>
+            <w:shd w:val="clear" w:color="auto" w:fill="F7F9FF"/>
+            <w:tcMar>
+              <w:top w:w="70" w:type="dxa"/>
+              <w:left w:w="110" w:type="dxa"/>
+              <w:bottom w:w="70" w:type="dxa"/>
+              <w:right w:w="110" w:type="dxa"/>
+            </w:tcMar>
+            <w:vAlign w:val="center"/>
+          </w:tcPr>
+          <w:p>
+            <w:pPr>
+              <w:spacing w:after="0"/>
+            </w:pPr>
+            <w:r>
+              <w:rPr>
+                <w:b w:val="0"/>
+                <w:color w:val="1E293B"/>
+                <w:sz w:val="19"/>
+              </w:rPr>
+              <w:t xml:space="preserve">FCFF 40% + exit multiple 30% + EV/EBITDA comps 30%</w:t>
+            </w:r>
+          </w:p>
+        </w:tc>
+        <w:tc>
+          <w:tcPr>
+            <w:tcW w:w="1860" w:type="dxa"/>
+            <w:tcBorders>
+              <w:top w:val="single" w:sz="4" w:space="0" w:color="CCCCCC"/>
+              <w:left w:val="single" w:sz="4" w:space="0" w:color="CCCCCC"/>
+              <w:bottom w:val="single" w:sz="4" w:space="0" w:color="CCCCCC"/>
+              <w:right w:val="single" w:sz="4" w:space="0" w:color="CCCCCC"/>
+            </w:tcBorders>
+            <w:shd w:val="clear" w:color="auto" w:fill="F7F9FF"/>
+            <w:tcMar>
+              <w:top w:w="70" w:type="dxa"/>
+              <w:left w:w="110" w:type="dxa"/>
+              <w:bottom w:w="70" w:type="dxa"/>
+              <w:right w:w="110" w:type="dxa"/>
+            </w:tcMar>
+            <w:vAlign w:val="center"/>
+          </w:tcPr>
+          <w:p>
+            <w:pPr>
+              <w:spacing w:after="0"/>
+            </w:pPr>
+            <w:r>
+              <w:rPr>
+                <w:b w:val="0"/>
+                <w:color w:val="1E293B"/>
+                <w:sz w:val="19"/>
+              </w:rPr>
+              <w:t xml:space="preserve">₹ 328 (+5.7%)</w:t>
+            </w:r>
+          </w:p>
+        </w:tc>
+        <w:tc>
+          <w:tcPr>
+            <w:tcW w:w="1500" w:type="dxa"/>
+            <w:tcBorders>
+              <w:top w:val="single" w:sz="4" w:space="0" w:color="CCCCCC"/>
+              <w:left w:val="single" w:sz="4" w:space="0" w:color="CCCCCC"/>
+              <w:bottom w:val="single" w:sz="4" w:space="0" w:color="CCCCCC"/>
+              <w:right w:val="single" w:sz="4" w:space="0" w:color="CCCCCC"/>
+            </w:tcBorders>
+            <w:shd w:val="clear" w:color="auto" w:fill="F7F9FF"/>
+            <w:tcMar>
+              <w:top w:w="70" w:type="dxa"/>
+              <w:left w:w="110" w:type="dxa"/>
+              <w:bottom w:w="70" w:type="dxa"/>
+              <w:right w:w="110" w:type="dxa"/>
+            </w:tcMar>
+            <w:vAlign w:val="center"/>
+          </w:tcPr>
+          <w:p>
+            <w:pPr>
+              <w:spacing w:after="0"/>
+            </w:pPr>
+            <w:r>
+              <w:rPr>
+                <w:b w:val="0"/>
+                <w:color w:val="1E293B"/>
+                <w:sz w:val="19"/>
+              </w:rPr>
+              <w:t xml:space="preserve">BUY</w:t>
+            </w:r>
+          </w:p>
+        </w:tc>
+      </w:tr>
+      <w:tr>
+        <w:tc>
+          <w:tcPr>
+            <w:tcW w:w="2300" w:type="dxa"/>
+            <w:tcBorders>
+              <w:top w:val="single" w:sz="4" w:space="0" w:color="CCCCCC"/>
+              <w:left w:val="single" w:sz="4" w:space="0" w:color="CCCCCC"/>
+              <w:bottom w:val="single" w:sz="4" w:space="0" w:color="CCCCCC"/>
+              <w:right w:val="single" w:sz="4" w:space="0" w:color="CCCCCC"/>
+            </w:tcBorders>
+            <w:tcMar>
+              <w:top w:w="70" w:type="dxa"/>
+              <w:left w:w="110" w:type="dxa"/>
+              <w:bottom w:w="70" w:type="dxa"/>
+              <w:right w:w="110" w:type="dxa"/>
+            </w:tcMar>
+            <w:vAlign w:val="center"/>
+          </w:tcPr>
+          <w:p>
+            <w:pPr>
+              <w:spacing w:after="0"/>
+            </w:pPr>
+            <w:r>
+              <w:rPr>
+                <w:b w:val="0"/>
+                <w:color w:val="1E293B"/>
+                <w:sz w:val="19"/>
+              </w:rPr>
+              <w:t xml:space="preserve">Full institutional</w:t>
+            </w:r>
+          </w:p>
+        </w:tc>
+        <w:tc>
+          <w:tcPr>
+            <w:tcW w:w="3700" w:type="dxa"/>
+            <w:tcBorders>
+              <w:top w:val="single" w:sz="4" w:space="0" w:color="CCCCCC"/>
+              <w:left w:val="single" w:sz="4" w:space="0" w:color="CCCCCC"/>
+              <w:bottom w:val="single" w:sz="4" w:space="0" w:color="CCCCCC"/>
+              <w:right w:val="single" w:sz="4" w:space="0" w:color="CCCCCC"/>
+            </w:tcBorders>
+            <w:tcMar>
+              <w:top w:w="70" w:type="dxa"/>
+              <w:left w:w="110" w:type="dxa"/>
+              <w:bottom w:w="70" w:type="dxa"/>
+              <w:right w:w="110" w:type="dxa"/>
+            </w:tcMar>
+            <w:vAlign w:val="center"/>
+          </w:tcPr>
+          <w:p>
+            <w:pPr>
+              <w:spacing w:after="0"/>
+            </w:pPr>
+            <w:r>
+              <w:rPr>
+                <w:b w:val="0"/>
+                <w:color w:val="1E293B"/>
+                <w:sz w:val="19"/>
+              </w:rPr>
+              <w:t xml:space="preserve">All six methods: FCFF 30, exit 10, FCFE 10, scenarios 20, comps 20, VC 10</w:t>
+            </w:r>
+          </w:p>
+        </w:tc>
+        <w:tc>
+          <w:tcPr>
+            <w:tcW w:w="1860" w:type="dxa"/>
+            <w:tcBorders>
+              <w:top w:val="single" w:sz="4" w:space="0" w:color="CCCCCC"/>
+              <w:left w:val="single" w:sz="4" w:space="0" w:color="CCCCCC"/>
+              <w:bottom w:val="single" w:sz="4" w:space="0" w:color="CCCCCC"/>
+              <w:right w:val="single" w:sz="4" w:space="0" w:color="CCCCCC"/>
+            </w:tcBorders>
+            <w:tcMar>
+              <w:top w:w="70" w:type="dxa"/>
+              <w:left w:w="110" w:type="dxa"/>
+              <w:bottom w:w="70" w:type="dxa"/>
+              <w:right w:w="110" w:type="dxa"/>
+            </w:tcMar>
+            <w:vAlign w:val="center"/>
+          </w:tcPr>
+          <w:p>
+            <w:pPr>
+              <w:spacing w:after="0"/>
+            </w:pPr>
+            <w:r>
+              <w:rPr>
+                <w:b w:val="0"/>
+                <w:color w:val="1E293B"/>
+                <w:sz w:val="19"/>
+              </w:rPr>
+              <w:t xml:space="preserve">₹ 299 (−3.6%)</w:t>
+            </w:r>
+          </w:p>
+        </w:tc>
+        <w:tc>
+          <w:tcPr>
+            <w:tcW w:w="1500" w:type="dxa"/>
+            <w:tcBorders>
+              <w:top w:val="single" w:sz="4" w:space="0" w:color="CCCCCC"/>
+              <w:left w:val="single" w:sz="4" w:space="0" w:color="CCCCCC"/>
+              <w:bottom w:val="single" w:sz="4" w:space="0" w:color="CCCCCC"/>
+              <w:right w:val="single" w:sz="4" w:space="0" w:color="CCCCCC"/>
+            </w:tcBorders>
+            <w:tcMar>
+              <w:top w:w="70" w:type="dxa"/>
+              <w:left w:w="110" w:type="dxa"/>
+              <w:bottom w:w="70" w:type="dxa"/>
+              <w:right w:w="110" w:type="dxa"/>
+            </w:tcMar>
+            <w:vAlign w:val="center"/>
+          </w:tcPr>
+          <w:p>
+            <w:pPr>
+              <w:spacing w:after="0"/>
+            </w:pPr>
+            <w:r>
+              <w:rPr>
+                <w:b w:val="0"/>
+                <w:color w:val="1E293B"/>
+                <w:sz w:val="19"/>
+              </w:rPr>
+              <w:t xml:space="preserve">HOLD</w:t>
+            </w:r>
+          </w:p>
+        </w:tc>
+      </w:tr>
+    </w:tbl>
+    <w:p>
+      <w:pPr>
+        <w:spacing w:after="60"/>
+      </w:pPr>
+    </w:p>
+    <w:p>
+      <w:pPr>
+        <w:spacing w:after="120" w:before="0" w:line="276" w:lineRule="auto"/>
+      </w:pPr>
+      <w:r>
+        <w:rPr>
+          <w:b w:val="0"/>
+          <w:i w:val="0"/>
+          <w:color w:val="1E293B"/>
+          <w:sz w:val="21"/>
+        </w:rPr>
+        <w:t xml:space="preserve">The same company ranges from </w:t>
+      </w:r>
+      <w:r>
+        <w:rPr>
+          <w:b/>
+          <w:i w:val="0"/>
+          <w:color w:val="1E293B"/>
+          <w:sz w:val="21"/>
+        </w:rPr>
+        <w:t xml:space="preserve">STRONG SELL</w:t>
+      </w:r>
+      <w:r>
+        <w:rPr>
+          <w:b w:val="0"/>
+          <w:i w:val="0"/>
+          <w:color w:val="1E293B"/>
+          <w:sz w:val="21"/>
+        </w:rPr>
+        <w:t xml:space="preserve"> to </w:t>
+      </w:r>
+      <w:r>
+        <w:rPr>
+          <w:b/>
+          <w:i w:val="0"/>
+          <w:color w:val="1E293B"/>
+          <w:sz w:val="21"/>
+        </w:rPr>
+        <w:t xml:space="preserve">BUY</w:t>
+      </w:r>
+      <w:r>
+        <w:rPr>
+          <w:b w:val="0"/>
+          <w:i w:val="0"/>
+          <w:color w:val="1E293B"/>
+          <w:sz w:val="21"/>
+        </w:rPr>
+        <w:t xml:space="preserve"> purely because of the approach — so the choice must fit the business, not the answer you want. Vipin Corporation is a profitable, cash-generative mid-cap, so the </w:t>
+      </w:r>
+      <w:r>
+        <w:rPr>
+          <w:b/>
+          <w:i w:val="0"/>
+          <w:color w:val="1E293B"/>
+          <w:sz w:val="21"/>
+        </w:rPr>
+        <w:t xml:space="preserve">Stable</w:t>
+      </w:r>
+      <w:r>
+        <w:rPr>
+          <w:b w:val="0"/>
+          <w:i w:val="0"/>
+          <w:color w:val="1E293B"/>
+          <w:sz w:val="21"/>
+        </w:rPr>
+        <w:t xml:space="preserve"> profile (DCF-led, cross-checked by comps) is the right lens: ₹312, HOLD, consistent with the triangulation above. The start-up and bank presets appear only for contrast; their low values come from methods built for very different businesses (a 25% venture hurdle, and book-value multiples meant for lenders).</w:t>
+      </w:r>
+    </w:p>
+    <w:tbl>
+      <w:tblPr>
+        <w:tblW w:w="9360" w:type="dxa"/>
+        <w:jc w:val="center"/>
+        <w:tblLayout w:type="fixed"/>
+        <w:tblLook w:firstColumn="1" w:firstRow="1" w:lastColumn="0" w:lastRow="0" w:noHBand="0" w:noVBand="1" w:val="04A0"/>
+      </w:tblPr>
+      <w:tblGrid>
+        <w:gridCol w:w="9360"/>
+      </w:tblGrid>
+      <w:tr>
+        <w:tc>
+          <w:tcPr>
+            <w:tcW w:w="9360" w:type="dxa"/>
+            <w:tcBorders>
+              <w:top w:val="single" w:sz="4" w:space="0" w:color="E2E8F8"/>
+              <w:left w:val="single" w:sz="24" w:space="0" w:color="7209B7"/>
+              <w:bottom w:val="single" w:sz="4" w:space="0" w:color="E2E8F8"/>
+              <w:right w:val="single" w:sz="4" w:space="0" w:color="E2E8F8"/>
+            </w:tcBorders>
+            <w:shd w:val="clear" w:color="auto" w:fill="FBFBFE"/>
+            <w:tcMar>
+              <w:top w:w="120" w:type="dxa"/>
+              <w:left w:w="160" w:type="dxa"/>
+              <w:bottom w:w="120" w:type="dxa"/>
+              <w:right w:w="160" w:type="dxa"/>
+            </w:tcMar>
+          </w:tcPr>
+          <w:p>
+            <w:pPr>
+              <w:spacing w:after="60"/>
+            </w:pPr>
+            <w:r>
+              <w:rPr>
+                <w:b/>
+                <w:color w:val="7209B7"/>
+                <w:sz w:val="21"/>
+              </w:rPr>
+              <w:t>❖  Choosing an approach — discipline</w:t>
+            </w:r>
+          </w:p>
+          <w:p>
+            <w:pPr>
+              <w:spacing w:after="40"/>
+            </w:pPr>
+            <w:r>
+              <w:rPr>
+                <w:b w:val="0"/>
+                <w:i w:val="0"/>
+                <w:color w:val="1E293B"/>
+                <w:sz w:val="20"/>
+              </w:rPr>
+              <w:t xml:space="preserve">Decide the approach before you look at the answer, and write down why.</w:t>
+            </w:r>
+          </w:p>
+          <w:p>
+            <w:pPr>
+              <w:spacing w:after="40"/>
+            </w:pPr>
+            <w:r>
+              <w:rPr>
+                <w:b w:val="0"/>
+                <w:i w:val="0"/>
+                <w:color w:val="1E293B"/>
+                <w:sz w:val="20"/>
+              </w:rPr>
+              <w:t xml:space="preserve">Match the method to the business model (see 6.7), not to the target you want.</w:t>
+            </w:r>
+          </w:p>
+          <w:p>
+            <w:pPr>
+              <w:spacing w:after="40"/>
+            </w:pPr>
+            <w:r>
+              <w:rPr>
+                <w:b w:val="0"/>
+                <w:i w:val="0"/>
+                <w:color w:val="1E293B"/>
+                <w:sz w:val="20"/>
+              </w:rPr>
+              <w:t xml:space="preserve">In a blend, give most weight to the method with the most reliable inputs, and keep weights stable between updates.</w:t>
+            </w:r>
+          </w:p>
+          <w:p>
+            <w:pPr>
+              <w:spacing w:after="40"/>
+            </w:pPr>
+            <w:r>
+              <w:rPr>
+                <w:b w:val="0"/>
+                <w:i w:val="0"/>
+                <w:color w:val="1E293B"/>
+                <w:sz w:val="20"/>
+              </w:rPr>
+              <w:t xml:space="preserve">Always show the cross-checks: if the headline sits far from the other methods, explain the gap.</w:t>
+            </w:r>
+          </w:p>
+        </w:tc>
+      </w:tr>
+    </w:tbl>
     <w:p>
       <w:pPr>
         <w:pStyle w:val="Heading1"/>

</xml_diff>